<commit_message>
Add introduction and project details for CareerHub application in training module
</commit_message>
<xml_diff>
--- a/dokumen/Modul Pelatihan React v2.0.docx
+++ b/dokumen/Modul Pelatihan React v2.0.docx
@@ -4425,6 +4425,9 @@
         <w:spacing w:after="0"/>
       </w:pPr>
       <w:r>
+        <w:rPr>
+          <w:noProof/>
+        </w:rPr>
         <w:drawing>
           <wp:inline distT="0" distB="0" distL="0" distR="0" wp14:anchorId="4DFB6A48" wp14:editId="41292E8A">
             <wp:extent cx="4505954" cy="1057423"/>
@@ -4475,6 +4478,9 @@
         <w:spacing w:after="0"/>
       </w:pPr>
       <w:r>
+        <w:rPr>
+          <w:noProof/>
+        </w:rPr>
         <w:drawing>
           <wp:inline distT="0" distB="0" distL="0" distR="0" wp14:anchorId="618EF6A9" wp14:editId="4499A0D0">
             <wp:extent cx="4477375" cy="971686"/>
@@ -4525,6 +4531,9 @@
         <w:spacing w:after="0"/>
       </w:pPr>
       <w:r>
+        <w:rPr>
+          <w:noProof/>
+        </w:rPr>
         <w:drawing>
           <wp:inline distT="0" distB="0" distL="0" distR="0" wp14:anchorId="23915D7A" wp14:editId="1ABBC5FF">
             <wp:extent cx="4496427" cy="1038370"/>
@@ -4581,6 +4590,9 @@
         <w:spacing w:after="0"/>
       </w:pPr>
       <w:r>
+        <w:rPr>
+          <w:noProof/>
+        </w:rPr>
         <w:drawing>
           <wp:inline distT="0" distB="0" distL="0" distR="0" wp14:anchorId="0736125E" wp14:editId="406B483C">
             <wp:extent cx="4525006" cy="1009791"/>
@@ -4771,6 +4783,9 @@
         <w:ind w:firstLine="360"/>
       </w:pPr>
       <w:r>
+        <w:rPr>
+          <w:noProof/>
+        </w:rPr>
         <w:drawing>
           <wp:inline distT="0" distB="0" distL="0" distR="0" wp14:anchorId="57C58C26" wp14:editId="509E74E8">
             <wp:extent cx="4553585" cy="1028844"/>
@@ -4836,6 +4851,9 @@
         <w:ind w:firstLine="360"/>
       </w:pPr>
       <w:r>
+        <w:rPr>
+          <w:noProof/>
+        </w:rPr>
         <w:drawing>
           <wp:inline distT="0" distB="0" distL="0" distR="0" wp14:anchorId="06AD25D7" wp14:editId="3B916F04">
             <wp:extent cx="4525006" cy="1028844"/>
@@ -4886,6 +4904,9 @@
         <w:ind w:firstLine="360"/>
       </w:pPr>
       <w:r>
+        <w:rPr>
+          <w:noProof/>
+        </w:rPr>
         <w:drawing>
           <wp:inline distT="0" distB="0" distL="0" distR="0" wp14:anchorId="08298A67" wp14:editId="3CAF3BAE">
             <wp:extent cx="4505954" cy="1000265"/>
@@ -4936,6 +4957,9 @@
         <w:ind w:firstLine="360"/>
       </w:pPr>
       <w:r>
+        <w:rPr>
+          <w:noProof/>
+        </w:rPr>
         <w:drawing>
           <wp:inline distT="0" distB="0" distL="0" distR="0" wp14:anchorId="2CAAEC67" wp14:editId="343BECAE">
             <wp:extent cx="4505954" cy="1009791"/>
@@ -5046,6 +5070,9 @@
         <w:ind w:firstLine="360"/>
       </w:pPr>
       <w:r>
+        <w:rPr>
+          <w:noProof/>
+        </w:rPr>
         <w:drawing>
           <wp:inline distT="0" distB="0" distL="0" distR="0" wp14:anchorId="272B09F8" wp14:editId="055ED8DF">
             <wp:extent cx="3749040" cy="2416980"/>
@@ -5157,14 +5184,14 @@
     </w:p>
     <w:p>
       <w:r>
-        <w:t xml:space="preserve">Sebagai contoh kita akan menginstal package </w:t>
-      </w:r>
-      <w:r>
-        <w:t>react-router-dom.</w:t>
-      </w:r>
-    </w:p>
-    <w:p>
-      <w:r>
+        <w:t>Sebagai contoh kita akan menginstal package react-router-dom.</w:t>
+      </w:r>
+    </w:p>
+    <w:p>
+      <w:r>
+        <w:rPr>
+          <w:noProof/>
+        </w:rPr>
         <w:drawing>
           <wp:inline distT="0" distB="0" distL="0" distR="0" wp14:anchorId="1A187181" wp14:editId="36C73449">
             <wp:extent cx="3324689" cy="990738"/>
@@ -5209,6 +5236,9 @@
     </w:p>
     <w:p>
       <w:r>
+        <w:rPr>
+          <w:noProof/>
+        </w:rPr>
         <w:drawing>
           <wp:inline distT="0" distB="0" distL="0" distR="0" wp14:anchorId="68249582" wp14:editId="5E888640">
             <wp:extent cx="2791215" cy="1028844"/>
@@ -5253,6 +5283,9 @@
     </w:p>
     <w:p>
       <w:r>
+        <w:rPr>
+          <w:noProof/>
+        </w:rPr>
         <w:drawing>
           <wp:inline distT="0" distB="0" distL="0" distR="0" wp14:anchorId="1E9E23F1" wp14:editId="33D58DCC">
             <wp:extent cx="1962424" cy="1028844"/>
@@ -5297,6 +5330,9 @@
     </w:p>
     <w:p>
       <w:r>
+        <w:rPr>
+          <w:noProof/>
+        </w:rPr>
         <w:drawing>
           <wp:inline distT="0" distB="0" distL="0" distR="0" wp14:anchorId="57D7C560" wp14:editId="0BBBD19D">
             <wp:extent cx="2324424" cy="990738"/>
@@ -5358,6 +5394,9 @@
     </w:p>
     <w:p>
       <w:r>
+        <w:rPr>
+          <w:noProof/>
+        </w:rPr>
         <w:drawing>
           <wp:inline distT="0" distB="0" distL="0" distR="0" wp14:anchorId="7B4090E1" wp14:editId="7702FBA6">
             <wp:extent cx="3181794" cy="1400370"/>
@@ -5402,6 +5441,9 @@
     </w:p>
     <w:p>
       <w:r>
+        <w:rPr>
+          <w:noProof/>
+        </w:rPr>
         <w:drawing>
           <wp:inline distT="0" distB="0" distL="0" distR="0" wp14:anchorId="5E7C35B0" wp14:editId="5E247E4C">
             <wp:extent cx="1971950" cy="981212"/>
@@ -5575,6 +5617,9 @@
         <w:ind w:firstLine="360"/>
       </w:pPr>
       <w:r>
+        <w:rPr>
+          <w:noProof/>
+        </w:rPr>
         <w:drawing>
           <wp:inline distT="0" distB="0" distL="0" distR="0" wp14:anchorId="59040A8D" wp14:editId="0B159B44">
             <wp:extent cx="2505425" cy="1000265"/>
@@ -5625,6 +5670,9 @@
         <w:ind w:firstLine="360"/>
       </w:pPr>
       <w:r>
+        <w:rPr>
+          <w:noProof/>
+        </w:rPr>
         <w:drawing>
           <wp:inline distT="0" distB="0" distL="0" distR="0" wp14:anchorId="04EA83B6" wp14:editId="33CB8D5F">
             <wp:extent cx="1600423" cy="1038370"/>
@@ -5675,6 +5723,9 @@
         <w:ind w:firstLine="360"/>
       </w:pPr>
       <w:r>
+        <w:rPr>
+          <w:noProof/>
+        </w:rPr>
         <w:drawing>
           <wp:inline distT="0" distB="0" distL="0" distR="0" wp14:anchorId="036CC636" wp14:editId="7EFCC23B">
             <wp:extent cx="1600423" cy="1009791"/>
@@ -5890,6 +5941,9 @@
     </w:p>
     <w:p>
       <w:r>
+        <w:rPr>
+          <w:noProof/>
+        </w:rPr>
         <w:drawing>
           <wp:inline distT="0" distB="0" distL="0" distR="0" wp14:anchorId="20A5B7BA" wp14:editId="10861AF0">
             <wp:extent cx="2867425" cy="1000265"/>
@@ -5934,6 +5988,9 @@
     </w:p>
     <w:p>
       <w:r>
+        <w:rPr>
+          <w:noProof/>
+        </w:rPr>
         <w:drawing>
           <wp:inline distT="0" distB="0" distL="0" distR="0" wp14:anchorId="5BE0ECE9" wp14:editId="5EED8700">
             <wp:extent cx="2600688" cy="971686"/>
@@ -5978,6 +6035,9 @@
     </w:p>
     <w:p>
       <w:r>
+        <w:rPr>
+          <w:noProof/>
+        </w:rPr>
         <w:drawing>
           <wp:inline distT="0" distB="0" distL="0" distR="0" wp14:anchorId="4F88EFEF" wp14:editId="536979B1">
             <wp:extent cx="1571844" cy="981212"/>
@@ -6062,6 +6122,9 @@
     </w:p>
     <w:p>
       <w:r>
+        <w:rPr>
+          <w:noProof/>
+        </w:rPr>
         <w:drawing>
           <wp:inline distT="0" distB="0" distL="0" distR="0" wp14:anchorId="33FAD7B8" wp14:editId="39326D3C">
             <wp:extent cx="2076740" cy="1019317"/>
@@ -6151,6 +6214,7 @@
         <w:rPr>
           <w:b/>
           <w:bCs/>
+          <w:noProof/>
         </w:rPr>
         <w:drawing>
           <wp:inline distT="0" distB="0" distL="0" distR="0" wp14:anchorId="634C4999" wp14:editId="00B04E86">
@@ -6215,6 +6279,7 @@
         <w:rPr>
           <w:b/>
           <w:bCs/>
+          <w:noProof/>
         </w:rPr>
         <w:drawing>
           <wp:inline distT="0" distB="0" distL="0" distR="0" wp14:anchorId="08D40142" wp14:editId="4841089C">
@@ -6279,6 +6344,7 @@
         <w:rPr>
           <w:b/>
           <w:bCs/>
+          <w:noProof/>
         </w:rPr>
         <w:drawing>
           <wp:inline distT="0" distB="0" distL="0" distR="0" wp14:anchorId="50D039E6" wp14:editId="5F4A13E1">
@@ -6415,6 +6481,286 @@
       <w:bookmarkEnd w:id="17"/>
     </w:p>
     <w:p/>
+    <w:p>
+      <w:pPr>
+        <w:pStyle w:val="Heading2"/>
+        <w:numPr>
+          <w:ilvl w:val="1"/>
+          <w:numId w:val="15"/>
+        </w:numPr>
+        <w:ind w:left="426"/>
+      </w:pPr>
+      <w:r>
+        <w:t>Pendahuluan</w:t>
+      </w:r>
+    </w:p>
+    <w:p>
+      <w:pPr>
+        <w:ind w:firstLine="426"/>
+      </w:pPr>
+      <w:r>
+        <w:t>Pada bab sebelumnya, peserta telah mempelajari cara menginstal Node.js, mengenal npm dan pnpm, serta memahami fungsi package manager dalam pengembangan aplikasi JavaScript. Setelah lingkungan pengembangan siap digunakan, langkah berikutnya adalah membuat proyek React yang akan digunakan selama proses pelatihan.</w:t>
+      </w:r>
+    </w:p>
+    <w:p>
+      <w:pPr>
+        <w:ind w:firstLine="426"/>
+      </w:pPr>
+      <w:r>
+        <w:t>Dalam pelatihan ini, peserta akan mengembangkan sebuah aplikasi sederhana bernama CareerHub, yaitu sebuah aplikasi Mini Job Portal yang digunakan untuk menampilkan daftar lowongan pekerjaan. Aplikasi ini akan terus dikembangkan secara bertahap hingga pertemuan terakhir, sehingga setiap materi yang dipelajari akan langsung diterapkan pada proyek yang sama.</w:t>
+      </w:r>
+    </w:p>
+    <w:p>
+      <w:pPr>
+        <w:ind w:firstLine="426"/>
+      </w:pPr>
+      <w:r>
+        <w:t>Pada bab ini peserta akan mempelajari cara membuat proyek React menggunakan Vite, menjalankan aplikasi pertama, memahami struktur folder proyek, serta mengenal beberapa perintah dasar pnpm yang digunakan dalam proses pengembangan.</w:t>
+      </w:r>
+    </w:p>
+    <w:p>
+      <w:pPr>
+        <w:ind w:firstLine="426"/>
+      </w:pPr>
+      <w:r>
+        <w:rPr>
+          <w:b/>
+          <w:bCs/>
+        </w:rPr>
+        <w:t>Studi Kasus</w:t>
+      </w:r>
+    </w:p>
+    <w:p>
+      <w:pPr>
+        <w:ind w:firstLine="426"/>
+      </w:pPr>
+      <w:r>
+        <w:t>Project Pelatihan : CareerHub</w:t>
+      </w:r>
+    </w:p>
+    <w:p>
+      <w:pPr>
+        <w:ind w:firstLine="426"/>
+      </w:pPr>
+      <w:r>
+        <w:t>Selama pelatihan React Fundamental, seluruh materi akan diterapkan pada satu proyek yang sama, yaitu CareerHub.</w:t>
+      </w:r>
+    </w:p>
+    <w:p>
+      <w:pPr>
+        <w:ind w:firstLine="426"/>
+      </w:pPr>
+      <w:r>
+        <w:t>CareerHub merupakan aplikasi sederhana yang berfungsi untuk menampilkan informasi lowongan pekerjaan. Seiring bertambahnya materi, aplikasi ini akan dikembangkan menjadi lebih lengkap dengan berbagai fitur seperti pencarian, pengurutan data, pagination, editing data, routing, hingga deployment ke internet.</w:t>
+      </w:r>
+    </w:p>
+    <w:p>
+      <w:pPr>
+        <w:ind w:firstLine="426"/>
+      </w:pPr>
+      <w:r>
+        <w:lastRenderedPageBreak/>
+        <w:t>Pada bab ini peserta belum akan membuat fitur-fitur tersebut. Fokus utama adalah membuat proyek React dan memastikan aplikasi dapat dijalankan dengan baik.</w:t>
+      </w:r>
+    </w:p>
+    <w:p>
+      <w:pPr>
+        <w:ind w:firstLine="426"/>
+      </w:pPr>
+    </w:p>
+    <w:p>
+      <w:pPr>
+        <w:pStyle w:val="Heading2"/>
+        <w:numPr>
+          <w:ilvl w:val="1"/>
+          <w:numId w:val="15"/>
+        </w:numPr>
+        <w:ind w:left="426"/>
+      </w:pPr>
+      <w:r>
+        <w:t>Mengenal Vite</w:t>
+      </w:r>
+    </w:p>
+    <w:p>
+      <w:pPr>
+        <w:ind w:firstLine="426"/>
+      </w:pPr>
+      <w:r>
+        <w:t>Vite merupakan sebuah build tool modern yang digunakan untuk membuat dan menjalankan aplikasi JavaScript seperti React, Vue, maupun framework lainnya.</w:t>
+      </w:r>
+    </w:p>
+    <w:p>
+      <w:pPr>
+        <w:ind w:firstLine="426"/>
+      </w:pPr>
+      <w:r>
+        <w:t>Vite dirancang agar proses pengembangan aplikasi menjadi lebih cepat dibandingkan build tool sebelumnya, seperti Create React App (CRA). Dengan Vite, proses menjalankan aplikasi dan memperbarui perubahan kode (Hot Module Replacement) berlangsung hampir secara instan sehingga sangat membantu selama proses pengembangan.</w:t>
+      </w:r>
+    </w:p>
+    <w:p>
+      <w:pPr>
+        <w:ind w:firstLine="426"/>
+      </w:pPr>
+      <w:r>
+        <w:t>Pada pelatihan ini seluruh proyek React akan dibuat menggunakan Vite.</w:t>
+      </w:r>
+    </w:p>
+    <w:p>
+      <w:pPr>
+        <w:ind w:firstLine="426"/>
+        <w:rPr>
+          <w:b/>
+          <w:bCs/>
+        </w:rPr>
+      </w:pPr>
+      <w:r>
+        <w:rPr>
+          <w:b/>
+          <w:bCs/>
+        </w:rPr>
+        <w:t>Keunggulan Vite</w:t>
+      </w:r>
+    </w:p>
+    <w:p>
+      <w:pPr>
+        <w:ind w:firstLine="426"/>
+      </w:pPr>
+      <w:r>
+        <w:t>Beberapa kelebihan Vite antara lain:</w:t>
+      </w:r>
+    </w:p>
+    <w:p>
+      <w:pPr>
+        <w:pStyle w:val="ListParagraph"/>
+        <w:numPr>
+          <w:ilvl w:val="0"/>
+          <w:numId w:val="16"/>
+        </w:numPr>
+      </w:pPr>
+      <w:r>
+        <w:t>Proses pembuatan proyek lebih cepat.</w:t>
+      </w:r>
+    </w:p>
+    <w:p>
+      <w:pPr>
+        <w:pStyle w:val="ListParagraph"/>
+        <w:numPr>
+          <w:ilvl w:val="0"/>
+          <w:numId w:val="16"/>
+        </w:numPr>
+      </w:pPr>
+      <w:r>
+        <w:t>Startup development server sangat ringan.</w:t>
+      </w:r>
+    </w:p>
+    <w:p>
+      <w:pPr>
+        <w:pStyle w:val="ListParagraph"/>
+        <w:numPr>
+          <w:ilvl w:val="0"/>
+          <w:numId w:val="16"/>
+        </w:numPr>
+      </w:pPr>
+      <w:r>
+        <w:t>Mendukung Hot Module Replacement (HMR).</w:t>
+      </w:r>
+    </w:p>
+    <w:p>
+      <w:pPr>
+        <w:pStyle w:val="ListParagraph"/>
+        <w:numPr>
+          <w:ilvl w:val="0"/>
+          <w:numId w:val="16"/>
+        </w:numPr>
+      </w:pPr>
+      <w:r>
+        <w:t>Konfigurasi sederhana.</w:t>
+      </w:r>
+    </w:p>
+    <w:p>
+      <w:pPr>
+        <w:pStyle w:val="ListParagraph"/>
+        <w:numPr>
+          <w:ilvl w:val="0"/>
+          <w:numId w:val="16"/>
+        </w:numPr>
+      </w:pPr>
+      <w:r>
+        <w:t>Cocok digunakan untuk pengembangan React modern.</w:t>
+      </w:r>
+    </w:p>
+    <w:p>
+      <w:pPr>
+        <w:ind w:firstLine="426"/>
+      </w:pPr>
+    </w:p>
+    <w:p>
+      <w:pPr>
+        <w:pStyle w:val="Heading2"/>
+        <w:numPr>
+          <w:ilvl w:val="1"/>
+          <w:numId w:val="15"/>
+        </w:numPr>
+        <w:ind w:left="426"/>
+      </w:pPr>
+      <w:r>
+        <w:t>Membuat Project</w:t>
+      </w:r>
+    </w:p>
+    <w:p/>
+    <w:p>
+      <w:pPr>
+        <w:pStyle w:val="Heading2"/>
+        <w:numPr>
+          <w:ilvl w:val="1"/>
+          <w:numId w:val="15"/>
+        </w:numPr>
+        <w:ind w:left="426"/>
+      </w:pPr>
+      <w:r>
+        <w:lastRenderedPageBreak/>
+        <w:t>Struktur Folder Project</w:t>
+      </w:r>
+    </w:p>
+    <w:p>
+      <w:pPr>
+        <w:pStyle w:val="Heading2"/>
+        <w:numPr>
+          <w:ilvl w:val="1"/>
+          <w:numId w:val="15"/>
+        </w:numPr>
+        <w:ind w:left="426"/>
+      </w:pPr>
+      <w:r>
+        <w:t>Mengenal File package.json</w:t>
+      </w:r>
+    </w:p>
+    <w:p>
+      <w:pPr>
+        <w:pStyle w:val="Heading2"/>
+        <w:numPr>
+          <w:ilvl w:val="1"/>
+          <w:numId w:val="15"/>
+        </w:numPr>
+        <w:ind w:left="426"/>
+      </w:pPr>
+      <w:r>
+        <w:t>Perintah Dasar pnpm</w:t>
+      </w:r>
+    </w:p>
+    <w:p>
+      <w:pPr>
+        <w:pStyle w:val="Heading2"/>
+        <w:numPr>
+          <w:ilvl w:val="1"/>
+          <w:numId w:val="15"/>
+        </w:numPr>
+        <w:ind w:left="426"/>
+      </w:pPr>
+      <w:r>
+        <w:t>Ringkasan Bab</w:t>
+      </w:r>
+    </w:p>
     <w:p/>
     <w:sectPr>
       <w:headerReference w:type="default" r:id="rId60"/>
@@ -6678,6 +7024,119 @@
 <file path=word/numbering.xml><?xml version="1.0" encoding="utf-8"?>
 <w:numbering xmlns:wpc="http://schemas.microsoft.com/office/word/2010/wordprocessingCanvas" xmlns:cx="http://schemas.microsoft.com/office/drawing/2014/chartex" xmlns:cx1="http://schemas.microsoft.com/office/drawing/2015/9/8/chartex" xmlns:cx2="http://schemas.microsoft.com/office/drawing/2015/10/21/chartex" xmlns:cx3="http://schemas.microsoft.com/office/drawing/2016/5/9/chartex" xmlns:cx4="http://schemas.microsoft.com/office/drawing/2016/5/10/chartex" xmlns:cx5="http://schemas.microsoft.com/office/drawing/2016/5/11/chartex" xmlns:cx6="http://schemas.microsoft.com/office/drawing/2016/5/12/chartex" xmlns:cx7="http://schemas.microsoft.com/office/drawing/2016/5/13/chartex" xmlns:cx8="http://schemas.microsoft.com/office/drawing/2016/5/14/chartex" xmlns:mc="http://schemas.openxmlformats.org/markup-compatibility/2006" xmlns:aink="http://schemas.microsoft.com/office/drawing/2016/ink" xmlns:am3d="http://schemas.microsoft.com/office/drawing/2017/model3d" xmlns:o="urn:schemas-microsoft-com:office:office" xmlns:oel="http://schemas.microsoft.com/office/2019/extlst" xmlns:r="http://schemas.openxmlformats.org/officeDocument/2006/relationships" xmlns:m="http://schemas.openxmlformats.org/officeDocument/2006/math" xmlns:v="urn:schemas-microsoft-com:vml" xmlns:wp14="http://schemas.microsoft.com/office/word/2010/wordprocessingDrawing" xmlns:wp="http://schemas.openxmlformats.org/drawingml/2006/wordprocessingDrawing" xmlns:w10="urn:schemas-microsoft-com:office:word" xmlns:w="http://schemas.openxmlformats.org/wordprocessingml/2006/main" xmlns:w14="http://schemas.microsoft.com/office/word/2010/wordml" xmlns:w15="http://schemas.microsoft.com/office/word/2012/wordml" xmlns:w16cex="http://schemas.microsoft.com/office/word/2018/wordml/cex" xmlns:w16cid="http://schemas.microsoft.com/office/word/2016/wordml/cid" xmlns:w16="http://schemas.microsoft.com/office/word/2018/wordml" xmlns:w16du="http://schemas.microsoft.com/office/word/2023/wordml/word16du" xmlns:w16sdtdh="http://schemas.microsoft.com/office/word/2020/wordml/sdtdatahash" xmlns:w16sdtfl="http://schemas.microsoft.com/office/word/2024/wordml/sdtformatlock" xmlns:w16se="http://schemas.microsoft.com/office/word/2015/wordml/symex" xmlns:wpg="http://schemas.microsoft.com/office/word/2010/wordprocessingGroup" xmlns:wpi="http://schemas.microsoft.com/office/word/2010/wordprocessingInk" xmlns:wne="http://schemas.microsoft.com/office/word/2006/wordml" xmlns:wps="http://schemas.microsoft.com/office/word/2010/wordprocessingShape" mc:Ignorable="w14 w15 w16se w16cid w16 w16cex w16sdtdh w16sdtfl w16du wp14">
   <w:abstractNum w:abstractNumId="0" w15:restartNumberingAfterBreak="0">
+    <w:nsid w:val="09123A7C"/>
+    <w:multiLevelType w:val="multilevel"/>
+    <w:tmpl w:val="7D6AE8C2"/>
+    <w:lvl w:ilvl="0">
+      <w:start w:val="1"/>
+      <w:numFmt w:val="decimal"/>
+      <w:lvlText w:val="%1."/>
+      <w:lvlJc w:val="left"/>
+      <w:pPr>
+        <w:ind w:left="360" w:hanging="360"/>
+      </w:pPr>
+      <w:rPr>
+        <w:rFonts w:hint="default"/>
+      </w:rPr>
+    </w:lvl>
+    <w:lvl w:ilvl="1">
+      <w:start w:val="1"/>
+      <w:numFmt w:val="decimal"/>
+      <w:lvlText w:val="3.%2."/>
+      <w:lvlJc w:val="left"/>
+      <w:pPr>
+        <w:ind w:left="792" w:hanging="432"/>
+      </w:pPr>
+      <w:rPr>
+        <w:rFonts w:hint="default"/>
+      </w:rPr>
+    </w:lvl>
+    <w:lvl w:ilvl="2">
+      <w:start w:val="1"/>
+      <w:numFmt w:val="decimal"/>
+      <w:lvlText w:val="%1.%2.%3."/>
+      <w:lvlJc w:val="left"/>
+      <w:pPr>
+        <w:ind w:left="1224" w:hanging="504"/>
+      </w:pPr>
+      <w:rPr>
+        <w:rFonts w:hint="default"/>
+      </w:rPr>
+    </w:lvl>
+    <w:lvl w:ilvl="3">
+      <w:start w:val="1"/>
+      <w:numFmt w:val="decimal"/>
+      <w:lvlText w:val="%1.%2.%3.%4."/>
+      <w:lvlJc w:val="left"/>
+      <w:pPr>
+        <w:ind w:left="1728" w:hanging="648"/>
+      </w:pPr>
+      <w:rPr>
+        <w:rFonts w:hint="default"/>
+      </w:rPr>
+    </w:lvl>
+    <w:lvl w:ilvl="4">
+      <w:start w:val="1"/>
+      <w:numFmt w:val="decimal"/>
+      <w:lvlText w:val="%1.%2.%3.%4.%5."/>
+      <w:lvlJc w:val="left"/>
+      <w:pPr>
+        <w:ind w:left="2232" w:hanging="792"/>
+      </w:pPr>
+      <w:rPr>
+        <w:rFonts w:hint="default"/>
+      </w:rPr>
+    </w:lvl>
+    <w:lvl w:ilvl="5">
+      <w:start w:val="1"/>
+      <w:numFmt w:val="decimal"/>
+      <w:lvlText w:val="%1.%2.%3.%4.%5.%6."/>
+      <w:lvlJc w:val="left"/>
+      <w:pPr>
+        <w:ind w:left="2736" w:hanging="936"/>
+      </w:pPr>
+      <w:rPr>
+        <w:rFonts w:hint="default"/>
+      </w:rPr>
+    </w:lvl>
+    <w:lvl w:ilvl="6">
+      <w:start w:val="1"/>
+      <w:numFmt w:val="decimal"/>
+      <w:lvlText w:val="%1.%2.%3.%4.%5.%6.%7."/>
+      <w:lvlJc w:val="left"/>
+      <w:pPr>
+        <w:ind w:left="3240" w:hanging="1080"/>
+      </w:pPr>
+      <w:rPr>
+        <w:rFonts w:hint="default"/>
+      </w:rPr>
+    </w:lvl>
+    <w:lvl w:ilvl="7">
+      <w:start w:val="1"/>
+      <w:numFmt w:val="decimal"/>
+      <w:lvlText w:val="%1.%2.%3.%4.%5.%6.%7.%8."/>
+      <w:lvlJc w:val="left"/>
+      <w:pPr>
+        <w:ind w:left="3744" w:hanging="1224"/>
+      </w:pPr>
+      <w:rPr>
+        <w:rFonts w:hint="default"/>
+      </w:rPr>
+    </w:lvl>
+    <w:lvl w:ilvl="8">
+      <w:start w:val="1"/>
+      <w:numFmt w:val="decimal"/>
+      <w:lvlText w:val="%1.%2.%3.%4.%5.%6.%7.%8.%9."/>
+      <w:lvlJc w:val="left"/>
+      <w:pPr>
+        <w:ind w:left="4320" w:hanging="1440"/>
+      </w:pPr>
+      <w:rPr>
+        <w:rFonts w:hint="default"/>
+      </w:rPr>
+    </w:lvl>
+  </w:abstractNum>
+  <w:abstractNum w:abstractNumId="1" w15:restartNumberingAfterBreak="0">
     <w:nsid w:val="1B2053C4"/>
     <w:multiLevelType w:val="multilevel"/>
     <w:tmpl w:val="33887266"/>
@@ -6766,7 +7225,7 @@
       </w:pPr>
     </w:lvl>
   </w:abstractNum>
-  <w:abstractNum w:abstractNumId="1" w15:restartNumberingAfterBreak="0">
+  <w:abstractNum w:abstractNumId="2" w15:restartNumberingAfterBreak="0">
     <w:nsid w:val="1F6E7A5A"/>
     <w:multiLevelType w:val="hybridMultilevel"/>
     <w:tmpl w:val="4E9AF2C0"/>
@@ -6879,7 +7338,7 @@
       </w:rPr>
     </w:lvl>
   </w:abstractNum>
-  <w:abstractNum w:abstractNumId="2" w15:restartNumberingAfterBreak="0">
+  <w:abstractNum w:abstractNumId="3" w15:restartNumberingAfterBreak="0">
     <w:nsid w:val="20272AB3"/>
     <w:multiLevelType w:val="multilevel"/>
     <w:tmpl w:val="3809001F"/>
@@ -6965,7 +7424,7 @@
       </w:pPr>
     </w:lvl>
   </w:abstractNum>
-  <w:abstractNum w:abstractNumId="3" w15:restartNumberingAfterBreak="0">
+  <w:abstractNum w:abstractNumId="4" w15:restartNumberingAfterBreak="0">
     <w:nsid w:val="21CF4586"/>
     <w:multiLevelType w:val="hybridMultilevel"/>
     <w:tmpl w:val="C00AE474"/>
@@ -7078,7 +7537,7 @@
       </w:rPr>
     </w:lvl>
   </w:abstractNum>
-  <w:abstractNum w:abstractNumId="4" w15:restartNumberingAfterBreak="0">
+  <w:abstractNum w:abstractNumId="5" w15:restartNumberingAfterBreak="0">
     <w:nsid w:val="226F47CF"/>
     <w:multiLevelType w:val="multilevel"/>
     <w:tmpl w:val="9934D454"/>
@@ -7191,7 +7650,120 @@
       </w:rPr>
     </w:lvl>
   </w:abstractNum>
-  <w:abstractNum w:abstractNumId="5" w15:restartNumberingAfterBreak="0">
+  <w:abstractNum w:abstractNumId="6" w15:restartNumberingAfterBreak="0">
+    <w:nsid w:val="25240D8C"/>
+    <w:multiLevelType w:val="multilevel"/>
+    <w:tmpl w:val="7D6AE8C2"/>
+    <w:lvl w:ilvl="0">
+      <w:start w:val="1"/>
+      <w:numFmt w:val="decimal"/>
+      <w:lvlText w:val="%1."/>
+      <w:lvlJc w:val="left"/>
+      <w:pPr>
+        <w:ind w:left="360" w:hanging="360"/>
+      </w:pPr>
+      <w:rPr>
+        <w:rFonts w:hint="default"/>
+      </w:rPr>
+    </w:lvl>
+    <w:lvl w:ilvl="1">
+      <w:start w:val="1"/>
+      <w:numFmt w:val="decimal"/>
+      <w:lvlText w:val="3.%2."/>
+      <w:lvlJc w:val="left"/>
+      <w:pPr>
+        <w:ind w:left="792" w:hanging="432"/>
+      </w:pPr>
+      <w:rPr>
+        <w:rFonts w:hint="default"/>
+      </w:rPr>
+    </w:lvl>
+    <w:lvl w:ilvl="2">
+      <w:start w:val="1"/>
+      <w:numFmt w:val="decimal"/>
+      <w:lvlText w:val="%1.%2.%3."/>
+      <w:lvlJc w:val="left"/>
+      <w:pPr>
+        <w:ind w:left="1224" w:hanging="504"/>
+      </w:pPr>
+      <w:rPr>
+        <w:rFonts w:hint="default"/>
+      </w:rPr>
+    </w:lvl>
+    <w:lvl w:ilvl="3">
+      <w:start w:val="1"/>
+      <w:numFmt w:val="decimal"/>
+      <w:lvlText w:val="%1.%2.%3.%4."/>
+      <w:lvlJc w:val="left"/>
+      <w:pPr>
+        <w:ind w:left="1728" w:hanging="648"/>
+      </w:pPr>
+      <w:rPr>
+        <w:rFonts w:hint="default"/>
+      </w:rPr>
+    </w:lvl>
+    <w:lvl w:ilvl="4">
+      <w:start w:val="1"/>
+      <w:numFmt w:val="decimal"/>
+      <w:lvlText w:val="%1.%2.%3.%4.%5."/>
+      <w:lvlJc w:val="left"/>
+      <w:pPr>
+        <w:ind w:left="2232" w:hanging="792"/>
+      </w:pPr>
+      <w:rPr>
+        <w:rFonts w:hint="default"/>
+      </w:rPr>
+    </w:lvl>
+    <w:lvl w:ilvl="5">
+      <w:start w:val="1"/>
+      <w:numFmt w:val="decimal"/>
+      <w:lvlText w:val="%1.%2.%3.%4.%5.%6."/>
+      <w:lvlJc w:val="left"/>
+      <w:pPr>
+        <w:ind w:left="2736" w:hanging="936"/>
+      </w:pPr>
+      <w:rPr>
+        <w:rFonts w:hint="default"/>
+      </w:rPr>
+    </w:lvl>
+    <w:lvl w:ilvl="6">
+      <w:start w:val="1"/>
+      <w:numFmt w:val="decimal"/>
+      <w:lvlText w:val="%1.%2.%3.%4.%5.%6.%7."/>
+      <w:lvlJc w:val="left"/>
+      <w:pPr>
+        <w:ind w:left="3240" w:hanging="1080"/>
+      </w:pPr>
+      <w:rPr>
+        <w:rFonts w:hint="default"/>
+      </w:rPr>
+    </w:lvl>
+    <w:lvl w:ilvl="7">
+      <w:start w:val="1"/>
+      <w:numFmt w:val="decimal"/>
+      <w:lvlText w:val="%1.%2.%3.%4.%5.%6.%7.%8."/>
+      <w:lvlJc w:val="left"/>
+      <w:pPr>
+        <w:ind w:left="3744" w:hanging="1224"/>
+      </w:pPr>
+      <w:rPr>
+        <w:rFonts w:hint="default"/>
+      </w:rPr>
+    </w:lvl>
+    <w:lvl w:ilvl="8">
+      <w:start w:val="1"/>
+      <w:numFmt w:val="decimal"/>
+      <w:lvlText w:val="%1.%2.%3.%4.%5.%6.%7.%8.%9."/>
+      <w:lvlJc w:val="left"/>
+      <w:pPr>
+        <w:ind w:left="4320" w:hanging="1440"/>
+      </w:pPr>
+      <w:rPr>
+        <w:rFonts w:hint="default"/>
+      </w:rPr>
+    </w:lvl>
+  </w:abstractNum>
+  <w:abstractNum w:abstractNumId="7" w15:restartNumberingAfterBreak="0">
     <w:nsid w:val="2D0C5139"/>
     <w:multiLevelType w:val="hybridMultilevel"/>
     <w:tmpl w:val="D32A7A6E"/>
@@ -7277,7 +7849,7 @@
       </w:pPr>
     </w:lvl>
   </w:abstractNum>
-  <w:abstractNum w:abstractNumId="6" w15:restartNumberingAfterBreak="0">
+  <w:abstractNum w:abstractNumId="8" w15:restartNumberingAfterBreak="0">
     <w:nsid w:val="348B03D3"/>
     <w:multiLevelType w:val="hybridMultilevel"/>
     <w:tmpl w:val="BAFA88AE"/>
@@ -7390,7 +7962,7 @@
       </w:rPr>
     </w:lvl>
   </w:abstractNum>
-  <w:abstractNum w:abstractNumId="7" w15:restartNumberingAfterBreak="0">
+  <w:abstractNum w:abstractNumId="9" w15:restartNumberingAfterBreak="0">
     <w:nsid w:val="3E8D75DB"/>
     <w:multiLevelType w:val="multilevel"/>
     <w:tmpl w:val="9934D454"/>
@@ -7503,7 +8075,7 @@
       </w:rPr>
     </w:lvl>
   </w:abstractNum>
-  <w:abstractNum w:abstractNumId="8" w15:restartNumberingAfterBreak="0">
+  <w:abstractNum w:abstractNumId="10" w15:restartNumberingAfterBreak="0">
     <w:nsid w:val="3F210C07"/>
     <w:multiLevelType w:val="multilevel"/>
     <w:tmpl w:val="4F4227DE"/>
@@ -7595,7 +8167,7 @@
       </w:pPr>
     </w:lvl>
   </w:abstractNum>
-  <w:abstractNum w:abstractNumId="9" w15:restartNumberingAfterBreak="0">
+  <w:abstractNum w:abstractNumId="11" w15:restartNumberingAfterBreak="0">
     <w:nsid w:val="4646393A"/>
     <w:multiLevelType w:val="multilevel"/>
     <w:tmpl w:val="BD224AE8"/>
@@ -7705,7 +8277,120 @@
       </w:rPr>
     </w:lvl>
   </w:abstractNum>
-  <w:abstractNum w:abstractNumId="10" w15:restartNumberingAfterBreak="0">
+  <w:abstractNum w:abstractNumId="12" w15:restartNumberingAfterBreak="0">
+    <w:nsid w:val="58212346"/>
+    <w:multiLevelType w:val="hybridMultilevel"/>
+    <w:tmpl w:val="CC4ADD28"/>
+    <w:lvl w:ilvl="0" w:tplc="38090001">
+      <w:start w:val="1"/>
+      <w:numFmt w:val="bullet"/>
+      <w:lvlText w:val=""/>
+      <w:lvlJc w:val="left"/>
+      <w:pPr>
+        <w:ind w:left="1146" w:hanging="360"/>
+      </w:pPr>
+      <w:rPr>
+        <w:rFonts w:ascii="Symbol" w:hAnsi="Symbol" w:hint="default"/>
+      </w:rPr>
+    </w:lvl>
+    <w:lvl w:ilvl="1" w:tplc="38090003" w:tentative="1">
+      <w:start w:val="1"/>
+      <w:numFmt w:val="bullet"/>
+      <w:lvlText w:val="o"/>
+      <w:lvlJc w:val="left"/>
+      <w:pPr>
+        <w:ind w:left="1866" w:hanging="360"/>
+      </w:pPr>
+      <w:rPr>
+        <w:rFonts w:ascii="Courier New" w:hAnsi="Courier New" w:cs="Courier New" w:hint="default"/>
+      </w:rPr>
+    </w:lvl>
+    <w:lvl w:ilvl="2" w:tplc="38090005" w:tentative="1">
+      <w:start w:val="1"/>
+      <w:numFmt w:val="bullet"/>
+      <w:lvlText w:val=""/>
+      <w:lvlJc w:val="left"/>
+      <w:pPr>
+        <w:ind w:left="2586" w:hanging="360"/>
+      </w:pPr>
+      <w:rPr>
+        <w:rFonts w:ascii="Wingdings" w:hAnsi="Wingdings" w:hint="default"/>
+      </w:rPr>
+    </w:lvl>
+    <w:lvl w:ilvl="3" w:tplc="38090001" w:tentative="1">
+      <w:start w:val="1"/>
+      <w:numFmt w:val="bullet"/>
+      <w:lvlText w:val=""/>
+      <w:lvlJc w:val="left"/>
+      <w:pPr>
+        <w:ind w:left="3306" w:hanging="360"/>
+      </w:pPr>
+      <w:rPr>
+        <w:rFonts w:ascii="Symbol" w:hAnsi="Symbol" w:hint="default"/>
+      </w:rPr>
+    </w:lvl>
+    <w:lvl w:ilvl="4" w:tplc="38090003" w:tentative="1">
+      <w:start w:val="1"/>
+      <w:numFmt w:val="bullet"/>
+      <w:lvlText w:val="o"/>
+      <w:lvlJc w:val="left"/>
+      <w:pPr>
+        <w:ind w:left="4026" w:hanging="360"/>
+      </w:pPr>
+      <w:rPr>
+        <w:rFonts w:ascii="Courier New" w:hAnsi="Courier New" w:cs="Courier New" w:hint="default"/>
+      </w:rPr>
+    </w:lvl>
+    <w:lvl w:ilvl="5" w:tplc="38090005" w:tentative="1">
+      <w:start w:val="1"/>
+      <w:numFmt w:val="bullet"/>
+      <w:lvlText w:val=""/>
+      <w:lvlJc w:val="left"/>
+      <w:pPr>
+        <w:ind w:left="4746" w:hanging="360"/>
+      </w:pPr>
+      <w:rPr>
+        <w:rFonts w:ascii="Wingdings" w:hAnsi="Wingdings" w:hint="default"/>
+      </w:rPr>
+    </w:lvl>
+    <w:lvl w:ilvl="6" w:tplc="38090001" w:tentative="1">
+      <w:start w:val="1"/>
+      <w:numFmt w:val="bullet"/>
+      <w:lvlText w:val=""/>
+      <w:lvlJc w:val="left"/>
+      <w:pPr>
+        <w:ind w:left="5466" w:hanging="360"/>
+      </w:pPr>
+      <w:rPr>
+        <w:rFonts w:ascii="Symbol" w:hAnsi="Symbol" w:hint="default"/>
+      </w:rPr>
+    </w:lvl>
+    <w:lvl w:ilvl="7" w:tplc="38090003" w:tentative="1">
+      <w:start w:val="1"/>
+      <w:numFmt w:val="bullet"/>
+      <w:lvlText w:val="o"/>
+      <w:lvlJc w:val="left"/>
+      <w:pPr>
+        <w:ind w:left="6186" w:hanging="360"/>
+      </w:pPr>
+      <w:rPr>
+        <w:rFonts w:ascii="Courier New" w:hAnsi="Courier New" w:cs="Courier New" w:hint="default"/>
+      </w:rPr>
+    </w:lvl>
+    <w:lvl w:ilvl="8" w:tplc="38090005" w:tentative="1">
+      <w:start w:val="1"/>
+      <w:numFmt w:val="bullet"/>
+      <w:lvlText w:val=""/>
+      <w:lvlJc w:val="left"/>
+      <w:pPr>
+        <w:ind w:left="6906" w:hanging="360"/>
+      </w:pPr>
+      <w:rPr>
+        <w:rFonts w:ascii="Wingdings" w:hAnsi="Wingdings" w:hint="default"/>
+      </w:rPr>
+    </w:lvl>
+  </w:abstractNum>
+  <w:abstractNum w:abstractNumId="13" w15:restartNumberingAfterBreak="0">
     <w:nsid w:val="64EE4379"/>
     <w:multiLevelType w:val="multilevel"/>
     <w:tmpl w:val="33887266"/>
@@ -7794,7 +8479,7 @@
       </w:pPr>
     </w:lvl>
   </w:abstractNum>
-  <w:abstractNum w:abstractNumId="11" w15:restartNumberingAfterBreak="0">
+  <w:abstractNum w:abstractNumId="14" w15:restartNumberingAfterBreak="0">
     <w:nsid w:val="7042763D"/>
     <w:multiLevelType w:val="hybridMultilevel"/>
     <w:tmpl w:val="A8FA09CA"/>
@@ -7907,7 +8592,7 @@
       </w:rPr>
     </w:lvl>
   </w:abstractNum>
-  <w:abstractNum w:abstractNumId="12" w15:restartNumberingAfterBreak="0">
+  <w:abstractNum w:abstractNumId="15" w15:restartNumberingAfterBreak="0">
     <w:nsid w:val="79E649FA"/>
     <w:multiLevelType w:val="hybridMultilevel"/>
     <w:tmpl w:val="5D54BE58"/>
@@ -8021,42 +8706,51 @@
     </w:lvl>
   </w:abstractNum>
   <w:num w:numId="1" w16cid:durableId="1406143775">
+    <w:abstractNumId w:val="3"/>
+  </w:num>
+  <w:num w:numId="2" w16cid:durableId="1748069314">
+    <w:abstractNumId w:val="7"/>
+  </w:num>
+  <w:num w:numId="3" w16cid:durableId="1296787817">
+    <w:abstractNumId w:val="8"/>
+  </w:num>
+  <w:num w:numId="4" w16cid:durableId="1198738994">
+    <w:abstractNumId w:val="13"/>
+  </w:num>
+  <w:num w:numId="5" w16cid:durableId="845945470">
+    <w:abstractNumId w:val="1"/>
+  </w:num>
+  <w:num w:numId="6" w16cid:durableId="665524019">
+    <w:abstractNumId w:val="10"/>
+  </w:num>
+  <w:num w:numId="7" w16cid:durableId="668020486">
+    <w:abstractNumId w:val="9"/>
+  </w:num>
+  <w:num w:numId="8" w16cid:durableId="1199975083">
+    <w:abstractNumId w:val="4"/>
+  </w:num>
+  <w:num w:numId="9" w16cid:durableId="75135086">
+    <w:abstractNumId w:val="5"/>
+  </w:num>
+  <w:num w:numId="10" w16cid:durableId="497960826">
+    <w:abstractNumId w:val="11"/>
+  </w:num>
+  <w:num w:numId="11" w16cid:durableId="326983446">
     <w:abstractNumId w:val="2"/>
   </w:num>
-  <w:num w:numId="2" w16cid:durableId="1748069314">
-    <w:abstractNumId w:val="5"/>
+  <w:num w:numId="12" w16cid:durableId="1706904810">
+    <w:abstractNumId w:val="14"/>
   </w:num>
-  <w:num w:numId="3" w16cid:durableId="1296787817">
+  <w:num w:numId="13" w16cid:durableId="452290699">
+    <w:abstractNumId w:val="15"/>
+  </w:num>
+  <w:num w:numId="14" w16cid:durableId="1452167094">
+    <w:abstractNumId w:val="0"/>
+  </w:num>
+  <w:num w:numId="15" w16cid:durableId="1269511272">
     <w:abstractNumId w:val="6"/>
   </w:num>
-  <w:num w:numId="4" w16cid:durableId="1198738994">
-    <w:abstractNumId w:val="10"/>
-  </w:num>
-  <w:num w:numId="5" w16cid:durableId="845945470">
-    <w:abstractNumId w:val="0"/>
-  </w:num>
-  <w:num w:numId="6" w16cid:durableId="665524019">
-    <w:abstractNumId w:val="8"/>
-  </w:num>
-  <w:num w:numId="7" w16cid:durableId="668020486">
-    <w:abstractNumId w:val="7"/>
-  </w:num>
-  <w:num w:numId="8" w16cid:durableId="1199975083">
-    <w:abstractNumId w:val="3"/>
-  </w:num>
-  <w:num w:numId="9" w16cid:durableId="75135086">
-    <w:abstractNumId w:val="4"/>
-  </w:num>
-  <w:num w:numId="10" w16cid:durableId="497960826">
-    <w:abstractNumId w:val="9"/>
-  </w:num>
-  <w:num w:numId="11" w16cid:durableId="326983446">
-    <w:abstractNumId w:val="1"/>
-  </w:num>
-  <w:num w:numId="12" w16cid:durableId="1706904810">
-    <w:abstractNumId w:val="11"/>
-  </w:num>
-  <w:num w:numId="13" w16cid:durableId="452290699">
+  <w:num w:numId="16" w16cid:durableId="1899515761">
     <w:abstractNumId w:val="12"/>
   </w:num>
 </w:numbering>

</xml_diff>

<commit_message>
docs: update training module for React with Vite, adding project structure and basic commands
</commit_message>
<xml_diff>
--- a/dokumen/Modul Pelatihan React v2.0.docx
+++ b/dokumen/Modul Pelatihan React v2.0.docx
@@ -85,7 +85,7 @@
       <w:pPr>
         <w:pStyle w:val="Heading1"/>
       </w:pPr>
-      <w:bookmarkStart w:id="0" w:name="_Toc234133813"/>
+      <w:bookmarkStart w:id="0" w:name="_Toc234530561"/>
       <w:r>
         <w:lastRenderedPageBreak/>
         <w:t>KATA PENGANTAR</w:t>
@@ -235,7 +235,7 @@
       <w:pPr>
         <w:pStyle w:val="Heading1"/>
       </w:pPr>
-      <w:bookmarkStart w:id="1" w:name="_Toc234133814"/>
+      <w:bookmarkStart w:id="1" w:name="_Toc234530562"/>
       <w:r>
         <w:lastRenderedPageBreak/>
         <w:t>DAFTAR ISI</w:t>
@@ -291,7 +291,7 @@
           <w:r>
             <w:fldChar w:fldCharType="separate"/>
           </w:r>
-          <w:hyperlink w:anchor="_Toc234133813" w:history="1">
+          <w:hyperlink w:anchor="_Toc234530561" w:history="1">
             <w:r>
               <w:rPr>
                 <w:rStyle w:val="Hyperlink"/>
@@ -314,7 +314,7 @@
               <w:rPr>
                 <w:webHidden/>
               </w:rPr>
-              <w:instrText xml:space="preserve"> PAGEREF _Toc234133813 \h </w:instrText>
+              <w:instrText xml:space="preserve"> PAGEREF _Toc234530561 \h </w:instrText>
             </w:r>
             <w:r>
               <w:rPr>
@@ -351,7 +351,7 @@
               <w:lang w:eastAsia="en-ID"/>
             </w:rPr>
           </w:pPr>
-          <w:hyperlink w:anchor="_Toc234133814" w:history="1">
+          <w:hyperlink w:anchor="_Toc234530562" w:history="1">
             <w:r>
               <w:rPr>
                 <w:rStyle w:val="Hyperlink"/>
@@ -374,7 +374,7 @@
               <w:rPr>
                 <w:webHidden/>
               </w:rPr>
-              <w:instrText xml:space="preserve"> PAGEREF _Toc234133814 \h </w:instrText>
+              <w:instrText xml:space="preserve"> PAGEREF _Toc234530562 \h </w:instrText>
             </w:r>
             <w:r>
               <w:rPr>
@@ -411,7 +411,7 @@
               <w:lang w:eastAsia="en-ID"/>
             </w:rPr>
           </w:pPr>
-          <w:hyperlink w:anchor="_Toc234133815" w:history="1">
+          <w:hyperlink w:anchor="_Toc234530563" w:history="1">
             <w:r>
               <w:rPr>
                 <w:rStyle w:val="Hyperlink"/>
@@ -434,7 +434,7 @@
               <w:rPr>
                 <w:webHidden/>
               </w:rPr>
-              <w:instrText xml:space="preserve"> PAGEREF _Toc234133815 \h </w:instrText>
+              <w:instrText xml:space="preserve"> PAGEREF _Toc234530563 \h </w:instrText>
             </w:r>
             <w:r>
               <w:rPr>
@@ -474,7 +474,7 @@
               <w:lang w:eastAsia="en-ID"/>
             </w:rPr>
           </w:pPr>
-          <w:hyperlink w:anchor="_Toc234133816" w:history="1">
+          <w:hyperlink w:anchor="_Toc234530564" w:history="1">
             <w:r>
               <w:rPr>
                 <w:rStyle w:val="Hyperlink"/>
@@ -516,7 +516,7 @@
                 <w:noProof/>
                 <w:webHidden/>
               </w:rPr>
-              <w:instrText xml:space="preserve"> PAGEREF _Toc234133816 \h </w:instrText>
+              <w:instrText xml:space="preserve"> PAGEREF _Toc234530564 \h </w:instrText>
             </w:r>
             <w:r>
               <w:rPr>
@@ -560,7 +560,7 @@
               <w:lang w:eastAsia="en-ID"/>
             </w:rPr>
           </w:pPr>
-          <w:hyperlink w:anchor="_Toc234133817" w:history="1">
+          <w:hyperlink w:anchor="_Toc234530565" w:history="1">
             <w:r>
               <w:rPr>
                 <w:rStyle w:val="Hyperlink"/>
@@ -602,7 +602,7 @@
                 <w:noProof/>
                 <w:webHidden/>
               </w:rPr>
-              <w:instrText xml:space="preserve"> PAGEREF _Toc234133817 \h </w:instrText>
+              <w:instrText xml:space="preserve"> PAGEREF _Toc234530565 \h </w:instrText>
             </w:r>
             <w:r>
               <w:rPr>
@@ -646,7 +646,7 @@
               <w:lang w:eastAsia="en-ID"/>
             </w:rPr>
           </w:pPr>
-          <w:hyperlink w:anchor="_Toc234133818" w:history="1">
+          <w:hyperlink w:anchor="_Toc234530566" w:history="1">
             <w:r>
               <w:rPr>
                 <w:rStyle w:val="Hyperlink"/>
@@ -688,7 +688,7 @@
                 <w:noProof/>
                 <w:webHidden/>
               </w:rPr>
-              <w:instrText xml:space="preserve"> PAGEREF _Toc234133818 \h </w:instrText>
+              <w:instrText xml:space="preserve"> PAGEREF _Toc234530566 \h </w:instrText>
             </w:r>
             <w:r>
               <w:rPr>
@@ -732,7 +732,7 @@
               <w:lang w:eastAsia="en-ID"/>
             </w:rPr>
           </w:pPr>
-          <w:hyperlink w:anchor="_Toc234133819" w:history="1">
+          <w:hyperlink w:anchor="_Toc234530567" w:history="1">
             <w:r>
               <w:rPr>
                 <w:rStyle w:val="Hyperlink"/>
@@ -774,7 +774,7 @@
                 <w:noProof/>
                 <w:webHidden/>
               </w:rPr>
-              <w:instrText xml:space="preserve"> PAGEREF _Toc234133819 \h </w:instrText>
+              <w:instrText xml:space="preserve"> PAGEREF _Toc234530567 \h </w:instrText>
             </w:r>
             <w:r>
               <w:rPr>
@@ -818,7 +818,7 @@
               <w:lang w:eastAsia="en-ID"/>
             </w:rPr>
           </w:pPr>
-          <w:hyperlink w:anchor="_Toc234133820" w:history="1">
+          <w:hyperlink w:anchor="_Toc234530568" w:history="1">
             <w:r>
               <w:rPr>
                 <w:rStyle w:val="Hyperlink"/>
@@ -860,7 +860,7 @@
                 <w:noProof/>
                 <w:webHidden/>
               </w:rPr>
-              <w:instrText xml:space="preserve"> PAGEREF _Toc234133820 \h </w:instrText>
+              <w:instrText xml:space="preserve"> PAGEREF _Toc234530568 \h </w:instrText>
             </w:r>
             <w:r>
               <w:rPr>
@@ -904,7 +904,7 @@
               <w:lang w:eastAsia="en-ID"/>
             </w:rPr>
           </w:pPr>
-          <w:hyperlink w:anchor="_Toc234133821" w:history="1">
+          <w:hyperlink w:anchor="_Toc234530569" w:history="1">
             <w:r>
               <w:rPr>
                 <w:rStyle w:val="Hyperlink"/>
@@ -946,7 +946,7 @@
                 <w:noProof/>
                 <w:webHidden/>
               </w:rPr>
-              <w:instrText xml:space="preserve"> PAGEREF _Toc234133821 \h </w:instrText>
+              <w:instrText xml:space="preserve"> PAGEREF _Toc234530569 \h </w:instrText>
             </w:r>
             <w:r>
               <w:rPr>
@@ -990,7 +990,7 @@
               <w:lang w:eastAsia="en-ID"/>
             </w:rPr>
           </w:pPr>
-          <w:hyperlink w:anchor="_Toc234133822" w:history="1">
+          <w:hyperlink w:anchor="_Toc234530570" w:history="1">
             <w:r>
               <w:rPr>
                 <w:rStyle w:val="Hyperlink"/>
@@ -1032,7 +1032,7 @@
                 <w:noProof/>
                 <w:webHidden/>
               </w:rPr>
-              <w:instrText xml:space="preserve"> PAGEREF _Toc234133822 \h </w:instrText>
+              <w:instrText xml:space="preserve"> PAGEREF _Toc234530570 \h </w:instrText>
             </w:r>
             <w:r>
               <w:rPr>
@@ -1073,7 +1073,7 @@
               <w:lang w:eastAsia="en-ID"/>
             </w:rPr>
           </w:pPr>
-          <w:hyperlink w:anchor="_Toc234133823" w:history="1">
+          <w:hyperlink w:anchor="_Toc234530571" w:history="1">
             <w:r>
               <w:rPr>
                 <w:rStyle w:val="Hyperlink"/>
@@ -1096,7 +1096,7 @@
               <w:rPr>
                 <w:webHidden/>
               </w:rPr>
-              <w:instrText xml:space="preserve"> PAGEREF _Toc234133823 \h </w:instrText>
+              <w:instrText xml:space="preserve"> PAGEREF _Toc234530571 \h </w:instrText>
             </w:r>
             <w:r>
               <w:rPr>
@@ -1136,7 +1136,7 @@
               <w:lang w:eastAsia="en-ID"/>
             </w:rPr>
           </w:pPr>
-          <w:hyperlink w:anchor="_Toc234133824" w:history="1">
+          <w:hyperlink w:anchor="_Toc234530572" w:history="1">
             <w:r>
               <w:rPr>
                 <w:rStyle w:val="Hyperlink"/>
@@ -1178,7 +1178,7 @@
                 <w:noProof/>
                 <w:webHidden/>
               </w:rPr>
-              <w:instrText xml:space="preserve"> PAGEREF _Toc234133824 \h </w:instrText>
+              <w:instrText xml:space="preserve"> PAGEREF _Toc234530572 \h </w:instrText>
             </w:r>
             <w:r>
               <w:rPr>
@@ -1222,7 +1222,7 @@
               <w:lang w:eastAsia="en-ID"/>
             </w:rPr>
           </w:pPr>
-          <w:hyperlink w:anchor="_Toc234133825" w:history="1">
+          <w:hyperlink w:anchor="_Toc234530573" w:history="1">
             <w:r>
               <w:rPr>
                 <w:rStyle w:val="Hyperlink"/>
@@ -1264,7 +1264,7 @@
                 <w:noProof/>
                 <w:webHidden/>
               </w:rPr>
-              <w:instrText xml:space="preserve"> PAGEREF _Toc234133825 \h </w:instrText>
+              <w:instrText xml:space="preserve"> PAGEREF _Toc234530573 \h </w:instrText>
             </w:r>
             <w:r>
               <w:rPr>
@@ -1308,7 +1308,7 @@
               <w:lang w:eastAsia="en-ID"/>
             </w:rPr>
           </w:pPr>
-          <w:hyperlink w:anchor="_Toc234133826" w:history="1">
+          <w:hyperlink w:anchor="_Toc234530574" w:history="1">
             <w:r>
               <w:rPr>
                 <w:rStyle w:val="Hyperlink"/>
@@ -1350,7 +1350,7 @@
                 <w:noProof/>
                 <w:webHidden/>
               </w:rPr>
-              <w:instrText xml:space="preserve"> PAGEREF _Toc234133826 \h </w:instrText>
+              <w:instrText xml:space="preserve"> PAGEREF _Toc234530574 \h </w:instrText>
             </w:r>
             <w:r>
               <w:rPr>
@@ -1394,7 +1394,7 @@
               <w:lang w:eastAsia="en-ID"/>
             </w:rPr>
           </w:pPr>
-          <w:hyperlink w:anchor="_Toc234133827" w:history="1">
+          <w:hyperlink w:anchor="_Toc234530575" w:history="1">
             <w:r>
               <w:rPr>
                 <w:rStyle w:val="Hyperlink"/>
@@ -1436,7 +1436,7 @@
                 <w:noProof/>
                 <w:webHidden/>
               </w:rPr>
-              <w:instrText xml:space="preserve"> PAGEREF _Toc234133827 \h </w:instrText>
+              <w:instrText xml:space="preserve"> PAGEREF _Toc234530575 \h </w:instrText>
             </w:r>
             <w:r>
               <w:rPr>
@@ -1480,7 +1480,7 @@
               <w:lang w:eastAsia="en-ID"/>
             </w:rPr>
           </w:pPr>
-          <w:hyperlink w:anchor="_Toc234133828" w:history="1">
+          <w:hyperlink w:anchor="_Toc234530576" w:history="1">
             <w:r>
               <w:rPr>
                 <w:rStyle w:val="Hyperlink"/>
@@ -1522,7 +1522,7 @@
                 <w:noProof/>
                 <w:webHidden/>
               </w:rPr>
-              <w:instrText xml:space="preserve"> PAGEREF _Toc234133828 \h </w:instrText>
+              <w:instrText xml:space="preserve"> PAGEREF _Toc234530576 \h </w:instrText>
             </w:r>
             <w:r>
               <w:rPr>
@@ -1566,7 +1566,7 @@
               <w:lang w:eastAsia="en-ID"/>
             </w:rPr>
           </w:pPr>
-          <w:hyperlink w:anchor="_Toc234133829" w:history="1">
+          <w:hyperlink w:anchor="_Toc234530577" w:history="1">
             <w:r>
               <w:rPr>
                 <w:rStyle w:val="Hyperlink"/>
@@ -1608,7 +1608,7 @@
                 <w:noProof/>
                 <w:webHidden/>
               </w:rPr>
-              <w:instrText xml:space="preserve"> PAGEREF _Toc234133829 \h </w:instrText>
+              <w:instrText xml:space="preserve"> PAGEREF _Toc234530577 \h </w:instrText>
             </w:r>
             <w:r>
               <w:rPr>
@@ -1649,7 +1649,7 @@
               <w:lang w:eastAsia="en-ID"/>
             </w:rPr>
           </w:pPr>
-          <w:hyperlink w:anchor="_Toc234133830" w:history="1">
+          <w:hyperlink w:anchor="_Toc234530578" w:history="1">
             <w:r>
               <w:rPr>
                 <w:rStyle w:val="Hyperlink"/>
@@ -1672,7 +1672,7 @@
               <w:rPr>
                 <w:webHidden/>
               </w:rPr>
-              <w:instrText xml:space="preserve"> PAGEREF _Toc234133830 \h </w:instrText>
+              <w:instrText xml:space="preserve"> PAGEREF _Toc234530578 \h </w:instrText>
             </w:r>
             <w:r>
               <w:rPr>
@@ -1690,6 +1690,668 @@
                 <w:webHidden/>
               </w:rPr>
               <w:t>21</w:t>
+            </w:r>
+            <w:r>
+              <w:rPr>
+                <w:webHidden/>
+              </w:rPr>
+              <w:fldChar w:fldCharType="end"/>
+            </w:r>
+          </w:hyperlink>
+        </w:p>
+        <w:p>
+          <w:pPr>
+            <w:pStyle w:val="TOC2"/>
+            <w:tabs>
+              <w:tab w:val="left" w:pos="960"/>
+              <w:tab w:val="right" w:leader="dot" w:pos="9016"/>
+            </w:tabs>
+            <w:rPr>
+              <w:rFonts w:asciiTheme="minorHAnsi" w:eastAsiaTheme="minorEastAsia" w:hAnsiTheme="minorHAnsi"/>
+              <w:noProof/>
+              <w:lang w:eastAsia="en-ID"/>
+            </w:rPr>
+          </w:pPr>
+          <w:hyperlink w:anchor="_Toc234530579" w:history="1">
+            <w:r>
+              <w:rPr>
+                <w:rStyle w:val="Hyperlink"/>
+                <w:noProof/>
+              </w:rPr>
+              <w:t>3.1.</w:t>
+            </w:r>
+            <w:r>
+              <w:rPr>
+                <w:rFonts w:asciiTheme="minorHAnsi" w:eastAsiaTheme="minorEastAsia" w:hAnsiTheme="minorHAnsi"/>
+                <w:noProof/>
+                <w:lang w:eastAsia="en-ID"/>
+              </w:rPr>
+              <w:tab/>
+            </w:r>
+            <w:r>
+              <w:rPr>
+                <w:rStyle w:val="Hyperlink"/>
+                <w:noProof/>
+              </w:rPr>
+              <w:t>Pendahuluan</w:t>
+            </w:r>
+            <w:r>
+              <w:rPr>
+                <w:noProof/>
+                <w:webHidden/>
+              </w:rPr>
+              <w:tab/>
+            </w:r>
+            <w:r>
+              <w:rPr>
+                <w:noProof/>
+                <w:webHidden/>
+              </w:rPr>
+              <w:fldChar w:fldCharType="begin"/>
+            </w:r>
+            <w:r>
+              <w:rPr>
+                <w:noProof/>
+                <w:webHidden/>
+              </w:rPr>
+              <w:instrText xml:space="preserve"> PAGEREF _Toc234530579 \h </w:instrText>
+            </w:r>
+            <w:r>
+              <w:rPr>
+                <w:noProof/>
+                <w:webHidden/>
+              </w:rPr>
+            </w:r>
+            <w:r>
+              <w:rPr>
+                <w:noProof/>
+                <w:webHidden/>
+              </w:rPr>
+              <w:fldChar w:fldCharType="separate"/>
+            </w:r>
+            <w:r>
+              <w:rPr>
+                <w:noProof/>
+                <w:webHidden/>
+              </w:rPr>
+              <w:t>21</w:t>
+            </w:r>
+            <w:r>
+              <w:rPr>
+                <w:noProof/>
+                <w:webHidden/>
+              </w:rPr>
+              <w:fldChar w:fldCharType="end"/>
+            </w:r>
+          </w:hyperlink>
+        </w:p>
+        <w:p>
+          <w:pPr>
+            <w:pStyle w:val="TOC2"/>
+            <w:tabs>
+              <w:tab w:val="left" w:pos="960"/>
+              <w:tab w:val="right" w:leader="dot" w:pos="9016"/>
+            </w:tabs>
+            <w:rPr>
+              <w:rFonts w:asciiTheme="minorHAnsi" w:eastAsiaTheme="minorEastAsia" w:hAnsiTheme="minorHAnsi"/>
+              <w:noProof/>
+              <w:lang w:eastAsia="en-ID"/>
+            </w:rPr>
+          </w:pPr>
+          <w:hyperlink w:anchor="_Toc234530580" w:history="1">
+            <w:r>
+              <w:rPr>
+                <w:rStyle w:val="Hyperlink"/>
+                <w:noProof/>
+              </w:rPr>
+              <w:t>3.2.</w:t>
+            </w:r>
+            <w:r>
+              <w:rPr>
+                <w:rFonts w:asciiTheme="minorHAnsi" w:eastAsiaTheme="minorEastAsia" w:hAnsiTheme="minorHAnsi"/>
+                <w:noProof/>
+                <w:lang w:eastAsia="en-ID"/>
+              </w:rPr>
+              <w:tab/>
+            </w:r>
+            <w:r>
+              <w:rPr>
+                <w:rStyle w:val="Hyperlink"/>
+                <w:noProof/>
+              </w:rPr>
+              <w:t>Mengenal Vite</w:t>
+            </w:r>
+            <w:r>
+              <w:rPr>
+                <w:noProof/>
+                <w:webHidden/>
+              </w:rPr>
+              <w:tab/>
+            </w:r>
+            <w:r>
+              <w:rPr>
+                <w:noProof/>
+                <w:webHidden/>
+              </w:rPr>
+              <w:fldChar w:fldCharType="begin"/>
+            </w:r>
+            <w:r>
+              <w:rPr>
+                <w:noProof/>
+                <w:webHidden/>
+              </w:rPr>
+              <w:instrText xml:space="preserve"> PAGEREF _Toc234530580 \h </w:instrText>
+            </w:r>
+            <w:r>
+              <w:rPr>
+                <w:noProof/>
+                <w:webHidden/>
+              </w:rPr>
+            </w:r>
+            <w:r>
+              <w:rPr>
+                <w:noProof/>
+                <w:webHidden/>
+              </w:rPr>
+              <w:fldChar w:fldCharType="separate"/>
+            </w:r>
+            <w:r>
+              <w:rPr>
+                <w:noProof/>
+                <w:webHidden/>
+              </w:rPr>
+              <w:t>22</w:t>
+            </w:r>
+            <w:r>
+              <w:rPr>
+                <w:noProof/>
+                <w:webHidden/>
+              </w:rPr>
+              <w:fldChar w:fldCharType="end"/>
+            </w:r>
+          </w:hyperlink>
+        </w:p>
+        <w:p>
+          <w:pPr>
+            <w:pStyle w:val="TOC2"/>
+            <w:tabs>
+              <w:tab w:val="left" w:pos="960"/>
+              <w:tab w:val="right" w:leader="dot" w:pos="9016"/>
+            </w:tabs>
+            <w:rPr>
+              <w:rFonts w:asciiTheme="minorHAnsi" w:eastAsiaTheme="minorEastAsia" w:hAnsiTheme="minorHAnsi"/>
+              <w:noProof/>
+              <w:lang w:eastAsia="en-ID"/>
+            </w:rPr>
+          </w:pPr>
+          <w:hyperlink w:anchor="_Toc234530581" w:history="1">
+            <w:r>
+              <w:rPr>
+                <w:rStyle w:val="Hyperlink"/>
+                <w:noProof/>
+              </w:rPr>
+              <w:t>3.3.</w:t>
+            </w:r>
+            <w:r>
+              <w:rPr>
+                <w:rFonts w:asciiTheme="minorHAnsi" w:eastAsiaTheme="minorEastAsia" w:hAnsiTheme="minorHAnsi"/>
+                <w:noProof/>
+                <w:lang w:eastAsia="en-ID"/>
+              </w:rPr>
+              <w:tab/>
+            </w:r>
+            <w:r>
+              <w:rPr>
+                <w:rStyle w:val="Hyperlink"/>
+                <w:noProof/>
+              </w:rPr>
+              <w:t>Membuat Project</w:t>
+            </w:r>
+            <w:r>
+              <w:rPr>
+                <w:noProof/>
+                <w:webHidden/>
+              </w:rPr>
+              <w:tab/>
+            </w:r>
+            <w:r>
+              <w:rPr>
+                <w:noProof/>
+                <w:webHidden/>
+              </w:rPr>
+              <w:fldChar w:fldCharType="begin"/>
+            </w:r>
+            <w:r>
+              <w:rPr>
+                <w:noProof/>
+                <w:webHidden/>
+              </w:rPr>
+              <w:instrText xml:space="preserve"> PAGEREF _Toc234530581 \h </w:instrText>
+            </w:r>
+            <w:r>
+              <w:rPr>
+                <w:noProof/>
+                <w:webHidden/>
+              </w:rPr>
+            </w:r>
+            <w:r>
+              <w:rPr>
+                <w:noProof/>
+                <w:webHidden/>
+              </w:rPr>
+              <w:fldChar w:fldCharType="separate"/>
+            </w:r>
+            <w:r>
+              <w:rPr>
+                <w:noProof/>
+                <w:webHidden/>
+              </w:rPr>
+              <w:t>22</w:t>
+            </w:r>
+            <w:r>
+              <w:rPr>
+                <w:noProof/>
+                <w:webHidden/>
+              </w:rPr>
+              <w:fldChar w:fldCharType="end"/>
+            </w:r>
+          </w:hyperlink>
+        </w:p>
+        <w:p>
+          <w:pPr>
+            <w:pStyle w:val="TOC2"/>
+            <w:tabs>
+              <w:tab w:val="left" w:pos="960"/>
+              <w:tab w:val="right" w:leader="dot" w:pos="9016"/>
+            </w:tabs>
+            <w:rPr>
+              <w:rFonts w:asciiTheme="minorHAnsi" w:eastAsiaTheme="minorEastAsia" w:hAnsiTheme="minorHAnsi"/>
+              <w:noProof/>
+              <w:lang w:eastAsia="en-ID"/>
+            </w:rPr>
+          </w:pPr>
+          <w:hyperlink w:anchor="_Toc234530582" w:history="1">
+            <w:r>
+              <w:rPr>
+                <w:rStyle w:val="Hyperlink"/>
+                <w:noProof/>
+              </w:rPr>
+              <w:t>3.4.</w:t>
+            </w:r>
+            <w:r>
+              <w:rPr>
+                <w:rFonts w:asciiTheme="minorHAnsi" w:eastAsiaTheme="minorEastAsia" w:hAnsiTheme="minorHAnsi"/>
+                <w:noProof/>
+                <w:lang w:eastAsia="en-ID"/>
+              </w:rPr>
+              <w:tab/>
+            </w:r>
+            <w:r>
+              <w:rPr>
+                <w:rStyle w:val="Hyperlink"/>
+                <w:noProof/>
+              </w:rPr>
+              <w:t>Struktur Folder Project</w:t>
+            </w:r>
+            <w:r>
+              <w:rPr>
+                <w:noProof/>
+                <w:webHidden/>
+              </w:rPr>
+              <w:tab/>
+            </w:r>
+            <w:r>
+              <w:rPr>
+                <w:noProof/>
+                <w:webHidden/>
+              </w:rPr>
+              <w:fldChar w:fldCharType="begin"/>
+            </w:r>
+            <w:r>
+              <w:rPr>
+                <w:noProof/>
+                <w:webHidden/>
+              </w:rPr>
+              <w:instrText xml:space="preserve"> PAGEREF _Toc234530582 \h </w:instrText>
+            </w:r>
+            <w:r>
+              <w:rPr>
+                <w:noProof/>
+                <w:webHidden/>
+              </w:rPr>
+            </w:r>
+            <w:r>
+              <w:rPr>
+                <w:noProof/>
+                <w:webHidden/>
+              </w:rPr>
+              <w:fldChar w:fldCharType="separate"/>
+            </w:r>
+            <w:r>
+              <w:rPr>
+                <w:noProof/>
+                <w:webHidden/>
+              </w:rPr>
+              <w:t>24</w:t>
+            </w:r>
+            <w:r>
+              <w:rPr>
+                <w:noProof/>
+                <w:webHidden/>
+              </w:rPr>
+              <w:fldChar w:fldCharType="end"/>
+            </w:r>
+          </w:hyperlink>
+        </w:p>
+        <w:p>
+          <w:pPr>
+            <w:pStyle w:val="TOC2"/>
+            <w:tabs>
+              <w:tab w:val="left" w:pos="960"/>
+              <w:tab w:val="right" w:leader="dot" w:pos="9016"/>
+            </w:tabs>
+            <w:rPr>
+              <w:rFonts w:asciiTheme="minorHAnsi" w:eastAsiaTheme="minorEastAsia" w:hAnsiTheme="minorHAnsi"/>
+              <w:noProof/>
+              <w:lang w:eastAsia="en-ID"/>
+            </w:rPr>
+          </w:pPr>
+          <w:hyperlink w:anchor="_Toc234530583" w:history="1">
+            <w:r>
+              <w:rPr>
+                <w:rStyle w:val="Hyperlink"/>
+                <w:noProof/>
+              </w:rPr>
+              <w:t>3.5.</w:t>
+            </w:r>
+            <w:r>
+              <w:rPr>
+                <w:rFonts w:asciiTheme="minorHAnsi" w:eastAsiaTheme="minorEastAsia" w:hAnsiTheme="minorHAnsi"/>
+                <w:noProof/>
+                <w:lang w:eastAsia="en-ID"/>
+              </w:rPr>
+              <w:tab/>
+            </w:r>
+            <w:r>
+              <w:rPr>
+                <w:rStyle w:val="Hyperlink"/>
+                <w:noProof/>
+              </w:rPr>
+              <w:t>Mengenal File package.json</w:t>
+            </w:r>
+            <w:r>
+              <w:rPr>
+                <w:noProof/>
+                <w:webHidden/>
+              </w:rPr>
+              <w:tab/>
+            </w:r>
+            <w:r>
+              <w:rPr>
+                <w:noProof/>
+                <w:webHidden/>
+              </w:rPr>
+              <w:fldChar w:fldCharType="begin"/>
+            </w:r>
+            <w:r>
+              <w:rPr>
+                <w:noProof/>
+                <w:webHidden/>
+              </w:rPr>
+              <w:instrText xml:space="preserve"> PAGEREF _Toc234530583 \h </w:instrText>
+            </w:r>
+            <w:r>
+              <w:rPr>
+                <w:noProof/>
+                <w:webHidden/>
+              </w:rPr>
+            </w:r>
+            <w:r>
+              <w:rPr>
+                <w:noProof/>
+                <w:webHidden/>
+              </w:rPr>
+              <w:fldChar w:fldCharType="separate"/>
+            </w:r>
+            <w:r>
+              <w:rPr>
+                <w:noProof/>
+                <w:webHidden/>
+              </w:rPr>
+              <w:t>25</w:t>
+            </w:r>
+            <w:r>
+              <w:rPr>
+                <w:noProof/>
+                <w:webHidden/>
+              </w:rPr>
+              <w:fldChar w:fldCharType="end"/>
+            </w:r>
+          </w:hyperlink>
+        </w:p>
+        <w:p>
+          <w:pPr>
+            <w:pStyle w:val="TOC2"/>
+            <w:tabs>
+              <w:tab w:val="left" w:pos="960"/>
+              <w:tab w:val="right" w:leader="dot" w:pos="9016"/>
+            </w:tabs>
+            <w:rPr>
+              <w:rFonts w:asciiTheme="minorHAnsi" w:eastAsiaTheme="minorEastAsia" w:hAnsiTheme="minorHAnsi"/>
+              <w:noProof/>
+              <w:lang w:eastAsia="en-ID"/>
+            </w:rPr>
+          </w:pPr>
+          <w:hyperlink w:anchor="_Toc234530584" w:history="1">
+            <w:r>
+              <w:rPr>
+                <w:rStyle w:val="Hyperlink"/>
+                <w:noProof/>
+              </w:rPr>
+              <w:t>3.6.</w:t>
+            </w:r>
+            <w:r>
+              <w:rPr>
+                <w:rFonts w:asciiTheme="minorHAnsi" w:eastAsiaTheme="minorEastAsia" w:hAnsiTheme="minorHAnsi"/>
+                <w:noProof/>
+                <w:lang w:eastAsia="en-ID"/>
+              </w:rPr>
+              <w:tab/>
+            </w:r>
+            <w:r>
+              <w:rPr>
+                <w:rStyle w:val="Hyperlink"/>
+                <w:noProof/>
+              </w:rPr>
+              <w:t>Perintah Dasar pnpm</w:t>
+            </w:r>
+            <w:r>
+              <w:rPr>
+                <w:noProof/>
+                <w:webHidden/>
+              </w:rPr>
+              <w:tab/>
+            </w:r>
+            <w:r>
+              <w:rPr>
+                <w:noProof/>
+                <w:webHidden/>
+              </w:rPr>
+              <w:fldChar w:fldCharType="begin"/>
+            </w:r>
+            <w:r>
+              <w:rPr>
+                <w:noProof/>
+                <w:webHidden/>
+              </w:rPr>
+              <w:instrText xml:space="preserve"> PAGEREF _Toc234530584 \h </w:instrText>
+            </w:r>
+            <w:r>
+              <w:rPr>
+                <w:noProof/>
+                <w:webHidden/>
+              </w:rPr>
+            </w:r>
+            <w:r>
+              <w:rPr>
+                <w:noProof/>
+                <w:webHidden/>
+              </w:rPr>
+              <w:fldChar w:fldCharType="separate"/>
+            </w:r>
+            <w:r>
+              <w:rPr>
+                <w:noProof/>
+                <w:webHidden/>
+              </w:rPr>
+              <w:t>26</w:t>
+            </w:r>
+            <w:r>
+              <w:rPr>
+                <w:noProof/>
+                <w:webHidden/>
+              </w:rPr>
+              <w:fldChar w:fldCharType="end"/>
+            </w:r>
+          </w:hyperlink>
+        </w:p>
+        <w:p>
+          <w:pPr>
+            <w:pStyle w:val="TOC2"/>
+            <w:tabs>
+              <w:tab w:val="left" w:pos="960"/>
+              <w:tab w:val="right" w:leader="dot" w:pos="9016"/>
+            </w:tabs>
+            <w:rPr>
+              <w:rFonts w:asciiTheme="minorHAnsi" w:eastAsiaTheme="minorEastAsia" w:hAnsiTheme="minorHAnsi"/>
+              <w:noProof/>
+              <w:lang w:eastAsia="en-ID"/>
+            </w:rPr>
+          </w:pPr>
+          <w:hyperlink w:anchor="_Toc234530585" w:history="1">
+            <w:r>
+              <w:rPr>
+                <w:rStyle w:val="Hyperlink"/>
+                <w:noProof/>
+              </w:rPr>
+              <w:t>3.7.</w:t>
+            </w:r>
+            <w:r>
+              <w:rPr>
+                <w:rFonts w:asciiTheme="minorHAnsi" w:eastAsiaTheme="minorEastAsia" w:hAnsiTheme="minorHAnsi"/>
+                <w:noProof/>
+                <w:lang w:eastAsia="en-ID"/>
+              </w:rPr>
+              <w:tab/>
+            </w:r>
+            <w:r>
+              <w:rPr>
+                <w:rStyle w:val="Hyperlink"/>
+                <w:noProof/>
+              </w:rPr>
+              <w:t>Ringkasan Bab</w:t>
+            </w:r>
+            <w:r>
+              <w:rPr>
+                <w:noProof/>
+                <w:webHidden/>
+              </w:rPr>
+              <w:tab/>
+            </w:r>
+            <w:r>
+              <w:rPr>
+                <w:noProof/>
+                <w:webHidden/>
+              </w:rPr>
+              <w:fldChar w:fldCharType="begin"/>
+            </w:r>
+            <w:r>
+              <w:rPr>
+                <w:noProof/>
+                <w:webHidden/>
+              </w:rPr>
+              <w:instrText xml:space="preserve"> PAGEREF _Toc234530585 \h </w:instrText>
+            </w:r>
+            <w:r>
+              <w:rPr>
+                <w:noProof/>
+                <w:webHidden/>
+              </w:rPr>
+            </w:r>
+            <w:r>
+              <w:rPr>
+                <w:noProof/>
+                <w:webHidden/>
+              </w:rPr>
+              <w:fldChar w:fldCharType="separate"/>
+            </w:r>
+            <w:r>
+              <w:rPr>
+                <w:noProof/>
+                <w:webHidden/>
+              </w:rPr>
+              <w:t>26</w:t>
+            </w:r>
+            <w:r>
+              <w:rPr>
+                <w:noProof/>
+                <w:webHidden/>
+              </w:rPr>
+              <w:fldChar w:fldCharType="end"/>
+            </w:r>
+          </w:hyperlink>
+        </w:p>
+        <w:p>
+          <w:pPr>
+            <w:pStyle w:val="TOC1"/>
+            <w:rPr>
+              <w:rFonts w:asciiTheme="minorHAnsi" w:eastAsiaTheme="minorEastAsia" w:hAnsiTheme="minorHAnsi"/>
+              <w:b w:val="0"/>
+              <w:bCs w:val="0"/>
+              <w:lang w:eastAsia="en-ID"/>
+            </w:rPr>
+          </w:pPr>
+          <w:hyperlink w:anchor="_Toc234530586" w:history="1">
+            <w:r>
+              <w:rPr>
+                <w:rStyle w:val="Hyperlink"/>
+              </w:rPr>
+              <w:t>BAB 4</w:t>
+            </w:r>
+            <w:r>
+              <w:rPr>
+                <w:webHidden/>
+              </w:rPr>
+              <w:tab/>
+            </w:r>
+            <w:r>
+              <w:rPr>
+                <w:webHidden/>
+              </w:rPr>
+              <w:fldChar w:fldCharType="begin"/>
+            </w:r>
+            <w:r>
+              <w:rPr>
+                <w:webHidden/>
+              </w:rPr>
+              <w:instrText xml:space="preserve"> PAGEREF _Toc234530586 \h </w:instrText>
+            </w:r>
+            <w:r>
+              <w:rPr>
+                <w:webHidden/>
+              </w:rPr>
+            </w:r>
+            <w:r>
+              <w:rPr>
+                <w:webHidden/>
+              </w:rPr>
+              <w:fldChar w:fldCharType="separate"/>
+            </w:r>
+            <w:r>
+              <w:rPr>
+                <w:webHidden/>
+              </w:rPr>
+              <w:t>28</w:t>
             </w:r>
             <w:r>
               <w:rPr>
@@ -1737,7 +2399,7 @@
       <w:pPr>
         <w:pStyle w:val="Heading1"/>
       </w:pPr>
-      <w:bookmarkStart w:id="2" w:name="_Toc234133815"/>
+      <w:bookmarkStart w:id="2" w:name="_Toc234530563"/>
       <w:r>
         <w:lastRenderedPageBreak/>
         <w:t>BAB I</w:t>
@@ -1760,7 +2422,7 @@
         </w:numPr>
         <w:ind w:left="540" w:hanging="630"/>
       </w:pPr>
-      <w:bookmarkStart w:id="3" w:name="_Toc234133816"/>
+      <w:bookmarkStart w:id="3" w:name="_Toc234530564"/>
       <w:r>
         <w:t>Pendahuluan</w:t>
       </w:r>
@@ -1824,7 +2486,7 @@
         </w:numPr>
         <w:ind w:left="450" w:hanging="450"/>
       </w:pPr>
-      <w:bookmarkStart w:id="4" w:name="_Toc234133817"/>
+      <w:bookmarkStart w:id="4" w:name="_Toc234530565"/>
       <w:r>
         <w:t>Variabel (let dan const)</w:t>
       </w:r>
@@ -2433,7 +3095,7 @@
         </w:numPr>
         <w:ind w:left="450" w:hanging="450"/>
       </w:pPr>
-      <w:bookmarkStart w:id="5" w:name="_Toc234133818"/>
+      <w:bookmarkStart w:id="5" w:name="_Toc234530566"/>
       <w:r>
         <w:lastRenderedPageBreak/>
         <w:t>Arrow Function</w:t>
@@ -2926,7 +3588,7 @@
         </w:numPr>
         <w:ind w:left="450" w:hanging="450"/>
       </w:pPr>
-      <w:bookmarkStart w:id="6" w:name="_Toc234133819"/>
+      <w:bookmarkStart w:id="6" w:name="_Toc234530567"/>
       <w:r>
         <w:lastRenderedPageBreak/>
         <w:t>Template Literals</w:t>
@@ -3173,7 +3835,7 @@
         </w:numPr>
         <w:ind w:left="450" w:hanging="450"/>
       </w:pPr>
-      <w:bookmarkStart w:id="7" w:name="_Toc234133820"/>
+      <w:bookmarkStart w:id="7" w:name="_Toc234530568"/>
       <w:r>
         <w:lastRenderedPageBreak/>
         <w:t>Destructuring Assignment</w:t>
@@ -3623,7 +4285,7 @@
       <w:r>
         <w:br w:type="page"/>
       </w:r>
-      <w:bookmarkStart w:id="8" w:name="_Toc234133821"/>
+      <w:bookmarkStart w:id="8" w:name="_Toc234530569"/>
       <w:r>
         <w:lastRenderedPageBreak/>
         <w:t>Spread dan Rest Operator</w:t>
@@ -3943,7 +4605,7 @@
         </w:numPr>
         <w:ind w:left="450" w:hanging="450"/>
       </w:pPr>
-      <w:bookmarkStart w:id="9" w:name="_Toc234133822"/>
+      <w:bookmarkStart w:id="9" w:name="_Toc234530570"/>
       <w:r>
         <w:lastRenderedPageBreak/>
         <w:t>Ringkasan Bab</w:t>
@@ -4064,7 +4726,7 @@
       <w:pPr>
         <w:pStyle w:val="Heading1"/>
       </w:pPr>
-      <w:bookmarkStart w:id="10" w:name="_Toc234133823"/>
+      <w:bookmarkStart w:id="10" w:name="_Toc234530571"/>
       <w:r>
         <w:lastRenderedPageBreak/>
         <w:t>BAB 2</w:t>
@@ -4085,7 +4747,7 @@
         </w:numPr>
         <w:ind w:left="450" w:hanging="450"/>
       </w:pPr>
-      <w:bookmarkStart w:id="11" w:name="_Toc234133824"/>
+      <w:bookmarkStart w:id="11" w:name="_Toc234530572"/>
       <w:r>
         <w:t>Pendahuluan</w:t>
       </w:r>
@@ -4157,7 +4819,7 @@
         </w:numPr>
         <w:ind w:left="450" w:hanging="450"/>
       </w:pPr>
-      <w:bookmarkStart w:id="12" w:name="_Toc234133825"/>
+      <w:bookmarkStart w:id="12" w:name="_Toc234530573"/>
       <w:r>
         <w:t>Node.js</w:t>
       </w:r>
@@ -4652,7 +5314,7 @@
         </w:numPr>
         <w:ind w:left="426"/>
       </w:pPr>
-      <w:bookmarkStart w:id="13" w:name="_Toc234133826"/>
+      <w:bookmarkStart w:id="13" w:name="_Toc234530574"/>
       <w:r>
         <w:t>Pengenalan npm (Node Package Manager)</w:t>
       </w:r>
@@ -5491,7 +6153,7 @@
         </w:numPr>
         <w:ind w:left="426"/>
       </w:pPr>
-      <w:bookmarkStart w:id="14" w:name="_Toc234133827"/>
+      <w:bookmarkStart w:id="14" w:name="_Toc234530575"/>
       <w:r>
         <w:t>Pengenalan pnpm</w:t>
       </w:r>
@@ -5922,7 +6584,7 @@
         </w:numPr>
         <w:ind w:left="426"/>
       </w:pPr>
-      <w:bookmarkStart w:id="15" w:name="_Toc234133828"/>
+      <w:bookmarkStart w:id="15" w:name="_Toc234530576"/>
       <w:r>
         <w:lastRenderedPageBreak/>
         <w:t>Membuat dan Mengelola Project</w:t>
@@ -6400,7 +7062,7 @@
         </w:numPr>
         <w:ind w:left="426"/>
       </w:pPr>
-      <w:bookmarkStart w:id="16" w:name="_Toc234133829"/>
+      <w:bookmarkStart w:id="16" w:name="_Toc234530577"/>
       <w:r>
         <w:t>Ringkasan Bab</w:t>
       </w:r>
@@ -6469,7 +7131,7 @@
       <w:r>
         <w:br w:type="page"/>
       </w:r>
-      <w:bookmarkStart w:id="17" w:name="_Toc234133830"/>
+      <w:bookmarkStart w:id="17" w:name="_Toc234530578"/>
       <w:r>
         <w:lastRenderedPageBreak/>
         <w:t xml:space="preserve">BAB 3 </w:t>
@@ -6490,9 +7152,11 @@
         </w:numPr>
         <w:ind w:left="426"/>
       </w:pPr>
+      <w:bookmarkStart w:id="18" w:name="_Toc234530579"/>
       <w:r>
         <w:t>Pendahuluan</w:t>
       </w:r>
+      <w:bookmarkEnd w:id="18"/>
     </w:p>
     <w:p>
       <w:pPr>
@@ -6577,9 +7241,11 @@
         </w:numPr>
         <w:ind w:left="426"/>
       </w:pPr>
+      <w:bookmarkStart w:id="19" w:name="_Toc234530580"/>
       <w:r>
         <w:t>Mengenal Vite</w:t>
       </w:r>
+      <w:bookmarkEnd w:id="19"/>
     </w:p>
     <w:p>
       <w:pPr>
@@ -6703,8 +7369,326 @@
         </w:numPr>
         <w:ind w:left="426"/>
       </w:pPr>
+      <w:bookmarkStart w:id="20" w:name="_Toc234530581"/>
       <w:r>
         <w:t>Membuat Project</w:t>
+      </w:r>
+      <w:bookmarkEnd w:id="20"/>
+    </w:p>
+    <w:p>
+      <w:r>
+        <w:t>Buka Terminal atau Command Prompt kemudian jalankan perintah berikut.</w:t>
+      </w:r>
+    </w:p>
+    <w:p>
+      <w:r>
+        <w:drawing>
+          <wp:inline distT="0" distB="0" distL="0" distR="0" wp14:anchorId="5D920248" wp14:editId="456E72E6">
+            <wp:extent cx="3610479" cy="866896"/>
+            <wp:effectExtent l="0" t="0" r="9525" b="9525"/>
+            <wp:docPr id="1132955031" name="Picture 1"/>
+            <wp:cNvGraphicFramePr>
+              <a:graphicFrameLocks xmlns:a="http://schemas.openxmlformats.org/drawingml/2006/main" noChangeAspect="1"/>
+            </wp:cNvGraphicFramePr>
+            <a:graphic xmlns:a="http://schemas.openxmlformats.org/drawingml/2006/main">
+              <a:graphicData uri="http://schemas.openxmlformats.org/drawingml/2006/picture">
+                <pic:pic xmlns:pic="http://schemas.openxmlformats.org/drawingml/2006/picture">
+                  <pic:nvPicPr>
+                    <pic:cNvPr id="1132955031" name=""/>
+                    <pic:cNvPicPr/>
+                  </pic:nvPicPr>
+                  <pic:blipFill>
+                    <a:blip r:embed="rId60"/>
+                    <a:stretch>
+                      <a:fillRect/>
+                    </a:stretch>
+                  </pic:blipFill>
+                  <pic:spPr>
+                    <a:xfrm>
+                      <a:off x="0" y="0"/>
+                      <a:ext cx="3610479" cy="866896"/>
+                    </a:xfrm>
+                    <a:prstGeom prst="rect">
+                      <a:avLst/>
+                    </a:prstGeom>
+                  </pic:spPr>
+                </pic:pic>
+              </a:graphicData>
+            </a:graphic>
+          </wp:inline>
+        </w:drawing>
+      </w:r>
+    </w:p>
+    <w:p>
+      <w:r>
+        <w:lastRenderedPageBreak/>
+        <w:t>Selanjutnya akan muncul beberapa pertanyaan.</w:t>
+      </w:r>
+    </w:p>
+    <w:p>
+      <w:r>
+        <w:drawing>
+          <wp:inline distT="0" distB="0" distL="0" distR="0" wp14:anchorId="76639B07" wp14:editId="2C1A864F">
+            <wp:extent cx="5731510" cy="2809240"/>
+            <wp:effectExtent l="0" t="0" r="2540" b="0"/>
+            <wp:docPr id="943736694" name="Picture 1"/>
+            <wp:cNvGraphicFramePr>
+              <a:graphicFrameLocks xmlns:a="http://schemas.openxmlformats.org/drawingml/2006/main" noChangeAspect="1"/>
+            </wp:cNvGraphicFramePr>
+            <a:graphic xmlns:a="http://schemas.openxmlformats.org/drawingml/2006/main">
+              <a:graphicData uri="http://schemas.openxmlformats.org/drawingml/2006/picture">
+                <pic:pic xmlns:pic="http://schemas.openxmlformats.org/drawingml/2006/picture">
+                  <pic:nvPicPr>
+                    <pic:cNvPr id="943736694" name=""/>
+                    <pic:cNvPicPr/>
+                  </pic:nvPicPr>
+                  <pic:blipFill>
+                    <a:blip r:embed="rId61"/>
+                    <a:stretch>
+                      <a:fillRect/>
+                    </a:stretch>
+                  </pic:blipFill>
+                  <pic:spPr>
+                    <a:xfrm>
+                      <a:off x="0" y="0"/>
+                      <a:ext cx="5731510" cy="2809240"/>
+                    </a:xfrm>
+                    <a:prstGeom prst="rect">
+                      <a:avLst/>
+                    </a:prstGeom>
+                  </pic:spPr>
+                </pic:pic>
+              </a:graphicData>
+            </a:graphic>
+          </wp:inline>
+        </w:drawing>
+      </w:r>
+    </w:p>
+    <w:p>
+      <w:r>
+        <w:t>Apabila proses berhasil maka akan terbentuk folder project baru bernama careerhub.</w:t>
+      </w:r>
+    </w:p>
+    <w:p>
+      <w:pPr>
+        <w:rPr>
+          <w:b/>
+          <w:bCs/>
+        </w:rPr>
+      </w:pPr>
+      <w:r>
+        <w:rPr>
+          <w:b/>
+          <w:bCs/>
+        </w:rPr>
+        <w:t>Masuk ke Folder Project</w:t>
+      </w:r>
+    </w:p>
+    <w:p>
+      <w:r>
+        <w:t>Masuk ke folder project menggunakan perintah berikut.</w:t>
+      </w:r>
+    </w:p>
+    <w:p>
+      <w:r>
+        <w:drawing>
+          <wp:inline distT="0" distB="0" distL="0" distR="0" wp14:anchorId="10FDB1C6" wp14:editId="6F99C38E">
+            <wp:extent cx="3581900" cy="819264"/>
+            <wp:effectExtent l="0" t="0" r="0" b="0"/>
+            <wp:docPr id="896717794" name="Picture 1"/>
+            <wp:cNvGraphicFramePr>
+              <a:graphicFrameLocks xmlns:a="http://schemas.openxmlformats.org/drawingml/2006/main" noChangeAspect="1"/>
+            </wp:cNvGraphicFramePr>
+            <a:graphic xmlns:a="http://schemas.openxmlformats.org/drawingml/2006/main">
+              <a:graphicData uri="http://schemas.openxmlformats.org/drawingml/2006/picture">
+                <pic:pic xmlns:pic="http://schemas.openxmlformats.org/drawingml/2006/picture">
+                  <pic:nvPicPr>
+                    <pic:cNvPr id="896717794" name=""/>
+                    <pic:cNvPicPr/>
+                  </pic:nvPicPr>
+                  <pic:blipFill>
+                    <a:blip r:embed="rId62"/>
+                    <a:stretch>
+                      <a:fillRect/>
+                    </a:stretch>
+                  </pic:blipFill>
+                  <pic:spPr>
+                    <a:xfrm>
+                      <a:off x="0" y="0"/>
+                      <a:ext cx="3581900" cy="819264"/>
+                    </a:xfrm>
+                    <a:prstGeom prst="rect">
+                      <a:avLst/>
+                    </a:prstGeom>
+                  </pic:spPr>
+                </pic:pic>
+              </a:graphicData>
+            </a:graphic>
+          </wp:inline>
+        </w:drawing>
+      </w:r>
+    </w:p>
+    <w:p>
+      <w:pPr>
+        <w:rPr>
+          <w:b/>
+          <w:bCs/>
+        </w:rPr>
+      </w:pPr>
+      <w:r>
+        <w:rPr>
+          <w:b/>
+          <w:bCs/>
+        </w:rPr>
+        <w:t>Menjalankan Project</w:t>
+      </w:r>
+    </w:p>
+    <w:p>
+      <w:r>
+        <w:t>Setelah dependency selesai diinstal, jalankan project.</w:t>
+      </w:r>
+    </w:p>
+    <w:p>
+      <w:r>
+        <w:drawing>
+          <wp:inline distT="0" distB="0" distL="0" distR="0" wp14:anchorId="0995FAA6" wp14:editId="59BD5B97">
+            <wp:extent cx="3620005" cy="847843"/>
+            <wp:effectExtent l="0" t="0" r="0" b="9525"/>
+            <wp:docPr id="1396865868" name="Picture 1"/>
+            <wp:cNvGraphicFramePr>
+              <a:graphicFrameLocks xmlns:a="http://schemas.openxmlformats.org/drawingml/2006/main" noChangeAspect="1"/>
+            </wp:cNvGraphicFramePr>
+            <a:graphic xmlns:a="http://schemas.openxmlformats.org/drawingml/2006/main">
+              <a:graphicData uri="http://schemas.openxmlformats.org/drawingml/2006/picture">
+                <pic:pic xmlns:pic="http://schemas.openxmlformats.org/drawingml/2006/picture">
+                  <pic:nvPicPr>
+                    <pic:cNvPr id="1396865868" name=""/>
+                    <pic:cNvPicPr/>
+                  </pic:nvPicPr>
+                  <pic:blipFill>
+                    <a:blip r:embed="rId63"/>
+                    <a:stretch>
+                      <a:fillRect/>
+                    </a:stretch>
+                  </pic:blipFill>
+                  <pic:spPr>
+                    <a:xfrm>
+                      <a:off x="0" y="0"/>
+                      <a:ext cx="3620005" cy="847843"/>
+                    </a:xfrm>
+                    <a:prstGeom prst="rect">
+                      <a:avLst/>
+                    </a:prstGeom>
+                  </pic:spPr>
+                </pic:pic>
+              </a:graphicData>
+            </a:graphic>
+          </wp:inline>
+        </w:drawing>
+      </w:r>
+    </w:p>
+    <w:p/>
+    <w:p>
+      <w:pPr>
+        <w:spacing w:line="278" w:lineRule="auto"/>
+        <w:jc w:val="left"/>
+      </w:pPr>
+      <w:r>
+        <w:br w:type="page"/>
+      </w:r>
+    </w:p>
+    <w:p>
+      <w:r>
+        <w:lastRenderedPageBreak/>
+        <w:t>Apabila berhasil akan muncul tampilan seperti berikut.</w:t>
+      </w:r>
+    </w:p>
+    <w:p>
+      <w:r>
+        <w:drawing>
+          <wp:inline distT="0" distB="0" distL="0" distR="0" wp14:anchorId="2BD2517F" wp14:editId="068981F7">
+            <wp:extent cx="5731510" cy="1236345"/>
+            <wp:effectExtent l="0" t="0" r="2540" b="1905"/>
+            <wp:docPr id="1643974134" name="Picture 1"/>
+            <wp:cNvGraphicFramePr>
+              <a:graphicFrameLocks xmlns:a="http://schemas.openxmlformats.org/drawingml/2006/main" noChangeAspect="1"/>
+            </wp:cNvGraphicFramePr>
+            <a:graphic xmlns:a="http://schemas.openxmlformats.org/drawingml/2006/main">
+              <a:graphicData uri="http://schemas.openxmlformats.org/drawingml/2006/picture">
+                <pic:pic xmlns:pic="http://schemas.openxmlformats.org/drawingml/2006/picture">
+                  <pic:nvPicPr>
+                    <pic:cNvPr id="1643974134" name=""/>
+                    <pic:cNvPicPr/>
+                  </pic:nvPicPr>
+                  <pic:blipFill>
+                    <a:blip r:embed="rId64"/>
+                    <a:stretch>
+                      <a:fillRect/>
+                    </a:stretch>
+                  </pic:blipFill>
+                  <pic:spPr>
+                    <a:xfrm>
+                      <a:off x="0" y="0"/>
+                      <a:ext cx="5731510" cy="1236345"/>
+                    </a:xfrm>
+                    <a:prstGeom prst="rect">
+                      <a:avLst/>
+                    </a:prstGeom>
+                  </pic:spPr>
+                </pic:pic>
+              </a:graphicData>
+            </a:graphic>
+          </wp:inline>
+        </w:drawing>
+      </w:r>
+    </w:p>
+    <w:p>
+      <w:r>
+        <w:t>Buka browser kemudian akses alamat tersebut.</w:t>
+      </w:r>
+    </w:p>
+    <w:p>
+      <w:r>
+        <w:drawing>
+          <wp:inline distT="0" distB="0" distL="0" distR="0" wp14:anchorId="39F217E7" wp14:editId="178BD5D5">
+            <wp:extent cx="3629532" cy="866896"/>
+            <wp:effectExtent l="0" t="0" r="9525" b="9525"/>
+            <wp:docPr id="521392598" name="Picture 1"/>
+            <wp:cNvGraphicFramePr>
+              <a:graphicFrameLocks xmlns:a="http://schemas.openxmlformats.org/drawingml/2006/main" noChangeAspect="1"/>
+            </wp:cNvGraphicFramePr>
+            <a:graphic xmlns:a="http://schemas.openxmlformats.org/drawingml/2006/main">
+              <a:graphicData uri="http://schemas.openxmlformats.org/drawingml/2006/picture">
+                <pic:pic xmlns:pic="http://schemas.openxmlformats.org/drawingml/2006/picture">
+                  <pic:nvPicPr>
+                    <pic:cNvPr id="521392598" name=""/>
+                    <pic:cNvPicPr/>
+                  </pic:nvPicPr>
+                  <pic:blipFill>
+                    <a:blip r:embed="rId65"/>
+                    <a:stretch>
+                      <a:fillRect/>
+                    </a:stretch>
+                  </pic:blipFill>
+                  <pic:spPr>
+                    <a:xfrm>
+                      <a:off x="0" y="0"/>
+                      <a:ext cx="3629532" cy="866896"/>
+                    </a:xfrm>
+                    <a:prstGeom prst="rect">
+                      <a:avLst/>
+                    </a:prstGeom>
+                  </pic:spPr>
+                </pic:pic>
+              </a:graphicData>
+            </a:graphic>
+          </wp:inline>
+        </w:drawing>
+      </w:r>
+    </w:p>
+    <w:p>
+      <w:r>
+        <w:t>Jika berhasil maka akan muncul halaman awal React bawaan Vite.</w:t>
       </w:r>
     </w:p>
     <w:p/>
@@ -6717,11 +7701,302 @@
         </w:numPr>
         <w:ind w:left="426"/>
       </w:pPr>
-      <w:r>
-        <w:lastRenderedPageBreak/>
+      <w:bookmarkStart w:id="21" w:name="_Toc234530582"/>
+      <w:r>
         <w:t>Struktur Folder Project</w:t>
       </w:r>
-    </w:p>
+      <w:bookmarkEnd w:id="21"/>
+    </w:p>
+    <w:p>
+      <w:r>
+        <w:t>Setelah project berhasil dibuat, akan muncul struktur folder seperti berikut.</w:t>
+      </w:r>
+    </w:p>
+    <w:p>
+      <w:r>
+        <w:drawing>
+          <wp:inline distT="0" distB="0" distL="0" distR="0" wp14:anchorId="71BA61DE" wp14:editId="16496B13">
+            <wp:extent cx="2391109" cy="2400635"/>
+            <wp:effectExtent l="0" t="0" r="9525" b="0"/>
+            <wp:docPr id="1650972995" name="Picture 1"/>
+            <wp:cNvGraphicFramePr>
+              <a:graphicFrameLocks xmlns:a="http://schemas.openxmlformats.org/drawingml/2006/main" noChangeAspect="1"/>
+            </wp:cNvGraphicFramePr>
+            <a:graphic xmlns:a="http://schemas.openxmlformats.org/drawingml/2006/main">
+              <a:graphicData uri="http://schemas.openxmlformats.org/drawingml/2006/picture">
+                <pic:pic xmlns:pic="http://schemas.openxmlformats.org/drawingml/2006/picture">
+                  <pic:nvPicPr>
+                    <pic:cNvPr id="1650972995" name=""/>
+                    <pic:cNvPicPr/>
+                  </pic:nvPicPr>
+                  <pic:blipFill>
+                    <a:blip r:embed="rId66"/>
+                    <a:stretch>
+                      <a:fillRect/>
+                    </a:stretch>
+                  </pic:blipFill>
+                  <pic:spPr>
+                    <a:xfrm>
+                      <a:off x="0" y="0"/>
+                      <a:ext cx="2391109" cy="2400635"/>
+                    </a:xfrm>
+                    <a:prstGeom prst="rect">
+                      <a:avLst/>
+                    </a:prstGeom>
+                  </pic:spPr>
+                </pic:pic>
+              </a:graphicData>
+            </a:graphic>
+          </wp:inline>
+        </w:drawing>
+      </w:r>
+    </w:p>
+    <w:p>
+      <w:r>
+        <w:t>Berikut penjelasan fungsi masing-masing folder.</w:t>
+      </w:r>
+    </w:p>
+    <w:tbl>
+      <w:tblPr>
+        <w:tblStyle w:val="TableGrid"/>
+        <w:tblW w:w="0" w:type="auto"/>
+        <w:tblLook w:val="04A0" w:firstRow="1" w:lastRow="0" w:firstColumn="1" w:lastColumn="0" w:noHBand="0" w:noVBand="1"/>
+      </w:tblPr>
+      <w:tblGrid>
+        <w:gridCol w:w="1944"/>
+        <w:gridCol w:w="6311"/>
+      </w:tblGrid>
+      <w:tr>
+        <w:tc>
+          <w:tcPr>
+            <w:tcW w:w="0" w:type="auto"/>
+            <w:hideMark/>
+          </w:tcPr>
+          <w:p>
+            <w:pPr>
+              <w:spacing w:after="160"/>
+              <w:jc w:val="center"/>
+              <w:rPr>
+                <w:b/>
+                <w:bCs/>
+              </w:rPr>
+            </w:pPr>
+            <w:r>
+              <w:rPr>
+                <w:b/>
+                <w:bCs/>
+              </w:rPr>
+              <w:t>Folder</w:t>
+            </w:r>
+          </w:p>
+        </w:tc>
+        <w:tc>
+          <w:tcPr>
+            <w:tcW w:w="0" w:type="auto"/>
+            <w:hideMark/>
+          </w:tcPr>
+          <w:p>
+            <w:pPr>
+              <w:spacing w:after="160"/>
+              <w:jc w:val="center"/>
+              <w:rPr>
+                <w:b/>
+                <w:bCs/>
+              </w:rPr>
+            </w:pPr>
+            <w:r>
+              <w:rPr>
+                <w:b/>
+                <w:bCs/>
+              </w:rPr>
+              <w:t>Fungsi</w:t>
+            </w:r>
+          </w:p>
+        </w:tc>
+      </w:tr>
+      <w:tr>
+        <w:tc>
+          <w:tcPr>
+            <w:tcW w:w="0" w:type="auto"/>
+            <w:hideMark/>
+          </w:tcPr>
+          <w:p>
+            <w:pPr>
+              <w:spacing w:after="160"/>
+            </w:pPr>
+            <w:r>
+              <w:t>src</w:t>
+            </w:r>
+          </w:p>
+        </w:tc>
+        <w:tc>
+          <w:tcPr>
+            <w:tcW w:w="0" w:type="auto"/>
+            <w:hideMark/>
+          </w:tcPr>
+          <w:p>
+            <w:pPr>
+              <w:spacing w:after="160"/>
+            </w:pPr>
+            <w:r>
+              <w:t>Tempat seluruh kode React ditulis.</w:t>
+            </w:r>
+          </w:p>
+        </w:tc>
+      </w:tr>
+      <w:tr>
+        <w:tc>
+          <w:tcPr>
+            <w:tcW w:w="0" w:type="auto"/>
+            <w:hideMark/>
+          </w:tcPr>
+          <w:p>
+            <w:pPr>
+              <w:spacing w:after="160"/>
+            </w:pPr>
+            <w:r>
+              <w:lastRenderedPageBreak/>
+              <w:t>public</w:t>
+            </w:r>
+          </w:p>
+        </w:tc>
+        <w:tc>
+          <w:tcPr>
+            <w:tcW w:w="0" w:type="auto"/>
+            <w:hideMark/>
+          </w:tcPr>
+          <w:p>
+            <w:pPr>
+              <w:spacing w:after="160"/>
+            </w:pPr>
+            <w:r>
+              <w:t>Menyimpan file statis seperti gambar atau favicon.</w:t>
+            </w:r>
+          </w:p>
+        </w:tc>
+      </w:tr>
+      <w:tr>
+        <w:tc>
+          <w:tcPr>
+            <w:tcW w:w="0" w:type="auto"/>
+            <w:hideMark/>
+          </w:tcPr>
+          <w:p>
+            <w:pPr>
+              <w:spacing w:after="160"/>
+            </w:pPr>
+            <w:r>
+              <w:t>node_modules</w:t>
+            </w:r>
+          </w:p>
+        </w:tc>
+        <w:tc>
+          <w:tcPr>
+            <w:tcW w:w="0" w:type="auto"/>
+            <w:hideMark/>
+          </w:tcPr>
+          <w:p>
+            <w:pPr>
+              <w:spacing w:after="160"/>
+            </w:pPr>
+            <w:r>
+              <w:t>Menyimpan seluruh dependency project.</w:t>
+            </w:r>
+          </w:p>
+        </w:tc>
+      </w:tr>
+      <w:tr>
+        <w:tc>
+          <w:tcPr>
+            <w:tcW w:w="0" w:type="auto"/>
+            <w:hideMark/>
+          </w:tcPr>
+          <w:p>
+            <w:pPr>
+              <w:spacing w:after="160"/>
+            </w:pPr>
+            <w:r>
+              <w:t>package.json</w:t>
+            </w:r>
+          </w:p>
+        </w:tc>
+        <w:tc>
+          <w:tcPr>
+            <w:tcW w:w="0" w:type="auto"/>
+            <w:hideMark/>
+          </w:tcPr>
+          <w:p>
+            <w:pPr>
+              <w:spacing w:after="160"/>
+            </w:pPr>
+            <w:r>
+              <w:t>Menyimpan konfigurasi project serta daftar dependency.</w:t>
+            </w:r>
+          </w:p>
+        </w:tc>
+      </w:tr>
+      <w:tr>
+        <w:tc>
+          <w:tcPr>
+            <w:tcW w:w="0" w:type="auto"/>
+            <w:hideMark/>
+          </w:tcPr>
+          <w:p>
+            <w:pPr>
+              <w:spacing w:after="160"/>
+            </w:pPr>
+            <w:r>
+              <w:t>pnpm-lock.yaml</w:t>
+            </w:r>
+          </w:p>
+        </w:tc>
+        <w:tc>
+          <w:tcPr>
+            <w:tcW w:w="0" w:type="auto"/>
+            <w:hideMark/>
+          </w:tcPr>
+          <w:p>
+            <w:pPr>
+              <w:spacing w:after="160"/>
+            </w:pPr>
+            <w:r>
+              <w:t>Menyimpan versi package yang digunakan.</w:t>
+            </w:r>
+          </w:p>
+        </w:tc>
+      </w:tr>
+      <w:tr>
+        <w:tc>
+          <w:tcPr>
+            <w:tcW w:w="0" w:type="auto"/>
+            <w:hideMark/>
+          </w:tcPr>
+          <w:p>
+            <w:pPr>
+              <w:spacing w:after="160"/>
+            </w:pPr>
+            <w:r>
+              <w:t>vite.config.js</w:t>
+            </w:r>
+          </w:p>
+        </w:tc>
+        <w:tc>
+          <w:tcPr>
+            <w:tcW w:w="0" w:type="auto"/>
+            <w:hideMark/>
+          </w:tcPr>
+          <w:p>
+            <w:pPr>
+              <w:spacing w:after="160"/>
+            </w:pPr>
+            <w:r>
+              <w:t>File konfigurasi Vite.</w:t>
+            </w:r>
+          </w:p>
+        </w:tc>
+      </w:tr>
+    </w:tbl>
+    <w:p/>
     <w:p>
       <w:pPr>
         <w:pStyle w:val="Heading2"/>
@@ -6731,10 +8006,243 @@
         </w:numPr>
         <w:ind w:left="426"/>
       </w:pPr>
+      <w:bookmarkStart w:id="22" w:name="_Toc234530583"/>
       <w:r>
         <w:t>Mengenal File package.json</w:t>
       </w:r>
-    </w:p>
+      <w:bookmarkEnd w:id="22"/>
+    </w:p>
+    <w:p>
+      <w:pPr>
+        <w:ind w:firstLine="426"/>
+      </w:pPr>
+      <w:r>
+        <w:t>Setiap project React memiliki sebuah file bernama package.json.</w:t>
+      </w:r>
+    </w:p>
+    <w:p>
+      <w:pPr>
+        <w:ind w:firstLine="426"/>
+      </w:pPr>
+      <w:r>
+        <w:t>File ini berisi informasi mengenai project, dependency yang digunakan, serta script yang dapat dijalankan.</w:t>
+      </w:r>
+    </w:p>
+    <w:p>
+      <w:pPr>
+        <w:ind w:firstLine="426"/>
+      </w:pPr>
+      <w:r>
+        <w:t>Contoh isi package.json.</w:t>
+      </w:r>
+    </w:p>
+    <w:p>
+      <w:pPr>
+        <w:ind w:firstLine="426"/>
+      </w:pPr>
+      <w:r>
+        <w:drawing>
+          <wp:inline distT="0" distB="0" distL="0" distR="0" wp14:anchorId="1D01ACD4" wp14:editId="64500E57">
+            <wp:extent cx="3581900" cy="2124371"/>
+            <wp:effectExtent l="0" t="0" r="0" b="0"/>
+            <wp:docPr id="1440231923" name="Picture 1"/>
+            <wp:cNvGraphicFramePr>
+              <a:graphicFrameLocks xmlns:a="http://schemas.openxmlformats.org/drawingml/2006/main" noChangeAspect="1"/>
+            </wp:cNvGraphicFramePr>
+            <a:graphic xmlns:a="http://schemas.openxmlformats.org/drawingml/2006/main">
+              <a:graphicData uri="http://schemas.openxmlformats.org/drawingml/2006/picture">
+                <pic:pic xmlns:pic="http://schemas.openxmlformats.org/drawingml/2006/picture">
+                  <pic:nvPicPr>
+                    <pic:cNvPr id="1440231923" name=""/>
+                    <pic:cNvPicPr/>
+                  </pic:nvPicPr>
+                  <pic:blipFill>
+                    <a:blip r:embed="rId67"/>
+                    <a:stretch>
+                      <a:fillRect/>
+                    </a:stretch>
+                  </pic:blipFill>
+                  <pic:spPr>
+                    <a:xfrm>
+                      <a:off x="0" y="0"/>
+                      <a:ext cx="3581900" cy="2124371"/>
+                    </a:xfrm>
+                    <a:prstGeom prst="rect">
+                      <a:avLst/>
+                    </a:prstGeom>
+                  </pic:spPr>
+                </pic:pic>
+              </a:graphicData>
+            </a:graphic>
+          </wp:inline>
+        </w:drawing>
+      </w:r>
+    </w:p>
+    <w:p>
+      <w:pPr>
+        <w:ind w:firstLine="426"/>
+      </w:pPr>
+      <w:r>
+        <w:t>Script yang paling sering digunakan adalah:</w:t>
+      </w:r>
+    </w:p>
+    <w:tbl>
+      <w:tblPr>
+        <w:tblStyle w:val="TableGrid"/>
+        <w:tblW w:w="0" w:type="auto"/>
+        <w:tblInd w:w="475" w:type="dxa"/>
+        <w:tblLook w:val="04A0" w:firstRow="1" w:lastRow="0" w:firstColumn="1" w:lastColumn="0" w:noHBand="0" w:noVBand="1"/>
+      </w:tblPr>
+      <w:tblGrid>
+        <w:gridCol w:w="2183"/>
+        <w:gridCol w:w="3260"/>
+      </w:tblGrid>
+      <w:tr>
+        <w:tc>
+          <w:tcPr>
+            <w:tcW w:w="0" w:type="auto"/>
+            <w:hideMark/>
+          </w:tcPr>
+          <w:p>
+            <w:pPr>
+              <w:spacing w:after="160"/>
+              <w:ind w:firstLine="426"/>
+              <w:rPr>
+                <w:b/>
+                <w:bCs/>
+              </w:rPr>
+            </w:pPr>
+            <w:r>
+              <w:rPr>
+                <w:b/>
+                <w:bCs/>
+              </w:rPr>
+              <w:t>Script</w:t>
+            </w:r>
+          </w:p>
+        </w:tc>
+        <w:tc>
+          <w:tcPr>
+            <w:tcW w:w="0" w:type="auto"/>
+            <w:hideMark/>
+          </w:tcPr>
+          <w:p>
+            <w:pPr>
+              <w:spacing w:after="160"/>
+              <w:ind w:firstLine="426"/>
+              <w:rPr>
+                <w:b/>
+                <w:bCs/>
+              </w:rPr>
+            </w:pPr>
+            <w:r>
+              <w:rPr>
+                <w:b/>
+                <w:bCs/>
+              </w:rPr>
+              <w:t>Fungsi</w:t>
+            </w:r>
+          </w:p>
+        </w:tc>
+      </w:tr>
+      <w:tr>
+        <w:tc>
+          <w:tcPr>
+            <w:tcW w:w="0" w:type="auto"/>
+            <w:hideMark/>
+          </w:tcPr>
+          <w:p>
+            <w:pPr>
+              <w:spacing w:after="160"/>
+              <w:ind w:firstLine="426"/>
+            </w:pPr>
+            <w:r>
+              <w:t>pnpm dev</w:t>
+            </w:r>
+          </w:p>
+        </w:tc>
+        <w:tc>
+          <w:tcPr>
+            <w:tcW w:w="0" w:type="auto"/>
+            <w:hideMark/>
+          </w:tcPr>
+          <w:p>
+            <w:pPr>
+              <w:spacing w:after="160"/>
+              <w:ind w:firstLine="426"/>
+            </w:pPr>
+            <w:r>
+              <w:t>Menjalankan aplikasi.</w:t>
+            </w:r>
+          </w:p>
+        </w:tc>
+      </w:tr>
+      <w:tr>
+        <w:tc>
+          <w:tcPr>
+            <w:tcW w:w="0" w:type="auto"/>
+            <w:hideMark/>
+          </w:tcPr>
+          <w:p>
+            <w:pPr>
+              <w:spacing w:after="160"/>
+              <w:ind w:firstLine="426"/>
+            </w:pPr>
+            <w:r>
+              <w:t>pnpm build</w:t>
+            </w:r>
+          </w:p>
+        </w:tc>
+        <w:tc>
+          <w:tcPr>
+            <w:tcW w:w="0" w:type="auto"/>
+            <w:hideMark/>
+          </w:tcPr>
+          <w:p>
+            <w:pPr>
+              <w:spacing w:after="160"/>
+              <w:ind w:firstLine="426"/>
+            </w:pPr>
+            <w:r>
+              <w:t>Melakukan build project.</w:t>
+            </w:r>
+          </w:p>
+        </w:tc>
+      </w:tr>
+      <w:tr>
+        <w:tc>
+          <w:tcPr>
+            <w:tcW w:w="0" w:type="auto"/>
+            <w:hideMark/>
+          </w:tcPr>
+          <w:p>
+            <w:pPr>
+              <w:spacing w:after="160"/>
+              <w:ind w:firstLine="426"/>
+            </w:pPr>
+            <w:r>
+              <w:t>pnpm preview</w:t>
+            </w:r>
+          </w:p>
+        </w:tc>
+        <w:tc>
+          <w:tcPr>
+            <w:tcW w:w="0" w:type="auto"/>
+            <w:hideMark/>
+          </w:tcPr>
+          <w:p>
+            <w:pPr>
+              <w:spacing w:after="160"/>
+              <w:ind w:firstLine="426"/>
+            </w:pPr>
+            <w:r>
+              <w:t>Menjalankan hasil build.</w:t>
+            </w:r>
+          </w:p>
+        </w:tc>
+      </w:tr>
+    </w:tbl>
+    <w:p/>
     <w:p>
       <w:pPr>
         <w:pStyle w:val="Heading2"/>
@@ -6744,9 +8252,265 @@
         </w:numPr>
         <w:ind w:left="426"/>
       </w:pPr>
-      <w:r>
+      <w:bookmarkStart w:id="23" w:name="_Toc234530584"/>
+      <w:r>
+        <w:lastRenderedPageBreak/>
         <w:t>Perintah Dasar pnpm</w:t>
       </w:r>
+      <w:bookmarkEnd w:id="23"/>
+    </w:p>
+    <w:p>
+      <w:pPr>
+        <w:ind w:firstLine="426"/>
+      </w:pPr>
+      <w:r>
+        <w:t>Selain digunakan untuk membuat project, pnpm juga digunakan untuk mengelola dependency.</w:t>
+      </w:r>
+    </w:p>
+    <w:p>
+      <w:pPr>
+        <w:ind w:firstLine="426"/>
+        <w:rPr>
+          <w:b/>
+          <w:bCs/>
+        </w:rPr>
+      </w:pPr>
+      <w:r>
+        <w:rPr>
+          <w:b/>
+          <w:bCs/>
+        </w:rPr>
+        <w:t>Menginstal Package</w:t>
+      </w:r>
+    </w:p>
+    <w:p>
+      <w:pPr>
+        <w:ind w:firstLine="426"/>
+      </w:pPr>
+      <w:r>
+        <w:drawing>
+          <wp:inline distT="0" distB="0" distL="0" distR="0" wp14:anchorId="1E100347" wp14:editId="675A7336">
+            <wp:extent cx="3581900" cy="866896"/>
+            <wp:effectExtent l="0" t="0" r="0" b="9525"/>
+            <wp:docPr id="765752291" name="Picture 1"/>
+            <wp:cNvGraphicFramePr>
+              <a:graphicFrameLocks xmlns:a="http://schemas.openxmlformats.org/drawingml/2006/main" noChangeAspect="1"/>
+            </wp:cNvGraphicFramePr>
+            <a:graphic xmlns:a="http://schemas.openxmlformats.org/drawingml/2006/main">
+              <a:graphicData uri="http://schemas.openxmlformats.org/drawingml/2006/picture">
+                <pic:pic xmlns:pic="http://schemas.openxmlformats.org/drawingml/2006/picture">
+                  <pic:nvPicPr>
+                    <pic:cNvPr id="765752291" name=""/>
+                    <pic:cNvPicPr/>
+                  </pic:nvPicPr>
+                  <pic:blipFill>
+                    <a:blip r:embed="rId68"/>
+                    <a:stretch>
+                      <a:fillRect/>
+                    </a:stretch>
+                  </pic:blipFill>
+                  <pic:spPr>
+                    <a:xfrm>
+                      <a:off x="0" y="0"/>
+                      <a:ext cx="3581900" cy="866896"/>
+                    </a:xfrm>
+                    <a:prstGeom prst="rect">
+                      <a:avLst/>
+                    </a:prstGeom>
+                  </pic:spPr>
+                </pic:pic>
+              </a:graphicData>
+            </a:graphic>
+          </wp:inline>
+        </w:drawing>
+      </w:r>
+    </w:p>
+    <w:p>
+      <w:pPr>
+        <w:ind w:firstLine="426"/>
+        <w:rPr>
+          <w:b/>
+          <w:bCs/>
+        </w:rPr>
+      </w:pPr>
+      <w:r>
+        <w:rPr>
+          <w:b/>
+          <w:bCs/>
+        </w:rPr>
+        <w:t>Menghapus Package</w:t>
+      </w:r>
+    </w:p>
+    <w:p>
+      <w:pPr>
+        <w:ind w:firstLine="426"/>
+      </w:pPr>
+      <w:r>
+        <w:drawing>
+          <wp:inline distT="0" distB="0" distL="0" distR="0" wp14:anchorId="13CF2D6D" wp14:editId="0E0E739C">
+            <wp:extent cx="3591426" cy="819264"/>
+            <wp:effectExtent l="0" t="0" r="9525" b="0"/>
+            <wp:docPr id="816382068" name="Picture 1"/>
+            <wp:cNvGraphicFramePr>
+              <a:graphicFrameLocks xmlns:a="http://schemas.openxmlformats.org/drawingml/2006/main" noChangeAspect="1"/>
+            </wp:cNvGraphicFramePr>
+            <a:graphic xmlns:a="http://schemas.openxmlformats.org/drawingml/2006/main">
+              <a:graphicData uri="http://schemas.openxmlformats.org/drawingml/2006/picture">
+                <pic:pic xmlns:pic="http://schemas.openxmlformats.org/drawingml/2006/picture">
+                  <pic:nvPicPr>
+                    <pic:cNvPr id="816382068" name=""/>
+                    <pic:cNvPicPr/>
+                  </pic:nvPicPr>
+                  <pic:blipFill>
+                    <a:blip r:embed="rId69"/>
+                    <a:stretch>
+                      <a:fillRect/>
+                    </a:stretch>
+                  </pic:blipFill>
+                  <pic:spPr>
+                    <a:xfrm>
+                      <a:off x="0" y="0"/>
+                      <a:ext cx="3591426" cy="819264"/>
+                    </a:xfrm>
+                    <a:prstGeom prst="rect">
+                      <a:avLst/>
+                    </a:prstGeom>
+                  </pic:spPr>
+                </pic:pic>
+              </a:graphicData>
+            </a:graphic>
+          </wp:inline>
+        </w:drawing>
+      </w:r>
+    </w:p>
+    <w:p>
+      <w:pPr>
+        <w:ind w:firstLine="426"/>
+        <w:rPr>
+          <w:b/>
+          <w:bCs/>
+        </w:rPr>
+      </w:pPr>
+      <w:r>
+        <w:rPr>
+          <w:b/>
+          <w:bCs/>
+        </w:rPr>
+        <w:t>Memperbarui Package</w:t>
+      </w:r>
+    </w:p>
+    <w:p>
+      <w:pPr>
+        <w:ind w:firstLine="426"/>
+        <w:rPr>
+          <w:b/>
+          <w:bCs/>
+        </w:rPr>
+      </w:pPr>
+      <w:r>
+        <w:rPr>
+          <w:b/>
+          <w:bCs/>
+        </w:rPr>
+        <w:drawing>
+          <wp:inline distT="0" distB="0" distL="0" distR="0" wp14:anchorId="7A7B230A" wp14:editId="60FC1EA2">
+            <wp:extent cx="3591426" cy="847843"/>
+            <wp:effectExtent l="0" t="0" r="9525" b="9525"/>
+            <wp:docPr id="1944101595" name="Picture 1"/>
+            <wp:cNvGraphicFramePr>
+              <a:graphicFrameLocks xmlns:a="http://schemas.openxmlformats.org/drawingml/2006/main" noChangeAspect="1"/>
+            </wp:cNvGraphicFramePr>
+            <a:graphic xmlns:a="http://schemas.openxmlformats.org/drawingml/2006/main">
+              <a:graphicData uri="http://schemas.openxmlformats.org/drawingml/2006/picture">
+                <pic:pic xmlns:pic="http://schemas.openxmlformats.org/drawingml/2006/picture">
+                  <pic:nvPicPr>
+                    <pic:cNvPr id="1944101595" name=""/>
+                    <pic:cNvPicPr/>
+                  </pic:nvPicPr>
+                  <pic:blipFill>
+                    <a:blip r:embed="rId70"/>
+                    <a:stretch>
+                      <a:fillRect/>
+                    </a:stretch>
+                  </pic:blipFill>
+                  <pic:spPr>
+                    <a:xfrm>
+                      <a:off x="0" y="0"/>
+                      <a:ext cx="3591426" cy="847843"/>
+                    </a:xfrm>
+                    <a:prstGeom prst="rect">
+                      <a:avLst/>
+                    </a:prstGeom>
+                  </pic:spPr>
+                </pic:pic>
+              </a:graphicData>
+            </a:graphic>
+          </wp:inline>
+        </w:drawing>
+      </w:r>
+    </w:p>
+    <w:p>
+      <w:pPr>
+        <w:ind w:firstLine="426"/>
+        <w:rPr>
+          <w:b/>
+          <w:bCs/>
+        </w:rPr>
+      </w:pPr>
+      <w:r>
+        <w:rPr>
+          <w:b/>
+          <w:bCs/>
+        </w:rPr>
+        <w:t>Melihat Package yang Terpasang</w:t>
+      </w:r>
+    </w:p>
+    <w:p>
+      <w:pPr>
+        <w:ind w:firstLine="426"/>
+      </w:pPr>
+      <w:r>
+        <w:drawing>
+          <wp:inline distT="0" distB="0" distL="0" distR="0" wp14:anchorId="3D74B764" wp14:editId="41AC5D4E">
+            <wp:extent cx="3591426" cy="838317"/>
+            <wp:effectExtent l="0" t="0" r="9525" b="0"/>
+            <wp:docPr id="313150226" name="Picture 1"/>
+            <wp:cNvGraphicFramePr>
+              <a:graphicFrameLocks xmlns:a="http://schemas.openxmlformats.org/drawingml/2006/main" noChangeAspect="1"/>
+            </wp:cNvGraphicFramePr>
+            <a:graphic xmlns:a="http://schemas.openxmlformats.org/drawingml/2006/main">
+              <a:graphicData uri="http://schemas.openxmlformats.org/drawingml/2006/picture">
+                <pic:pic xmlns:pic="http://schemas.openxmlformats.org/drawingml/2006/picture">
+                  <pic:nvPicPr>
+                    <pic:cNvPr id="313150226" name=""/>
+                    <pic:cNvPicPr/>
+                  </pic:nvPicPr>
+                  <pic:blipFill>
+                    <a:blip r:embed="rId71"/>
+                    <a:stretch>
+                      <a:fillRect/>
+                    </a:stretch>
+                  </pic:blipFill>
+                  <pic:spPr>
+                    <a:xfrm>
+                      <a:off x="0" y="0"/>
+                      <a:ext cx="3591426" cy="838317"/>
+                    </a:xfrm>
+                    <a:prstGeom prst="rect">
+                      <a:avLst/>
+                    </a:prstGeom>
+                  </pic:spPr>
+                </pic:pic>
+              </a:graphicData>
+            </a:graphic>
+          </wp:inline>
+        </w:drawing>
+      </w:r>
+    </w:p>
+    <w:p>
+      <w:pPr>
+        <w:ind w:firstLine="426"/>
+      </w:pPr>
     </w:p>
     <w:p>
       <w:pPr>
@@ -6757,14 +8521,166 @@
         </w:numPr>
         <w:ind w:left="426"/>
       </w:pPr>
+      <w:bookmarkStart w:id="24" w:name="_Toc234530585"/>
       <w:r>
         <w:t>Ringkasan Bab</w:t>
       </w:r>
+      <w:bookmarkEnd w:id="24"/>
+    </w:p>
+    <w:p>
+      <w:pPr>
+        <w:ind w:firstLine="426"/>
+      </w:pPr>
+      <w:r>
+        <w:t>Pada bab ini peserta telah berhasil membuat proyek React menggunakan Vite dengan bantuan pnpm sebagai package manager. Peserta juga telah memahami struktur dasar proyek React, fungsi file package.json, serta beberapa perintah dasar pnpm yang sering digunakan dalam pengembangan aplikasi.</w:t>
+      </w:r>
+    </w:p>
+    <w:p>
+      <w:pPr>
+        <w:ind w:firstLine="426"/>
+      </w:pPr>
+      <w:r>
+        <w:lastRenderedPageBreak/>
+        <w:t>Project CareerHub yang telah dibuat akan menjadi studi kasus utama selama pelatihan. Pada bab-bab berikutnya, aplikasi ini akan dikembangkan secara bertahap hingga menjadi sebuah Mini Job Portal yang memiliki berbagai fitur seperti pencarian, pengurutan data, pagination, editing, routing, penggunaan Context API, dan deployment ke Vercel.</w:t>
+      </w:r>
     </w:p>
     <w:p/>
+    <w:p>
+      <w:pPr>
+        <w:spacing w:line="278" w:lineRule="auto"/>
+        <w:jc w:val="left"/>
+      </w:pPr>
+      <w:r>
+        <w:br w:type="page"/>
+      </w:r>
+    </w:p>
+    <w:p>
+      <w:pPr>
+        <w:pStyle w:val="Heading1"/>
+      </w:pPr>
+      <w:bookmarkStart w:id="25" w:name="_Toc234530586"/>
+      <w:r>
+        <w:lastRenderedPageBreak/>
+        <w:t>BAB 4</w:t>
+      </w:r>
+      <w:bookmarkEnd w:id="25"/>
+      <w:r>
+        <w:t xml:space="preserve"> </w:t>
+      </w:r>
+      <w:r>
+        <w:br/>
+      </w:r>
+      <w:r>
+        <w:t>Dasar-dasar React dan Komponen</w:t>
+      </w:r>
+    </w:p>
+    <w:p/>
+    <w:p>
+      <w:pPr>
+        <w:pStyle w:val="Heading2"/>
+        <w:numPr>
+          <w:ilvl w:val="1"/>
+          <w:numId w:val="17"/>
+        </w:numPr>
+        <w:ind w:left="426"/>
+      </w:pPr>
+      <w:r>
+        <w:t>Pendahuluan</w:t>
+      </w:r>
+    </w:p>
+    <w:p>
+      <w:r>
+        <w:t>Pada bab sebelumnya, peserta telah berhasil membuat project React menggunakan Vite serta menjalankan aplikasi pertama. Namun, tampilan yang muncul masih merupakan halaman bawaan dari Vite dan belum mencerminkan aplikasi yang akan dikembangkan.</w:t>
+      </w:r>
+    </w:p>
+    <w:p/>
+    <w:p>
+      <w:r>
+        <w:t>Pada bab ini peserta akan mulai membangun aplikasi CareerHub menggunakan React. Materi yang dipelajari meliputi pengenalan React, konsep JSX, pembuatan Functional Component, serta cara menggunakan komponen di dalam aplikasi. Dengan memahami materi pada bab ini, peserta akan mampu membangun tampilan aplikasi yang tersusun dari beberapa komponen yang saling terhubung.</w:t>
+      </w:r>
+    </w:p>
+    <w:p/>
+    <w:p>
+      <w:pPr>
+        <w:pStyle w:val="Heading2"/>
+        <w:numPr>
+          <w:ilvl w:val="1"/>
+          <w:numId w:val="17"/>
+        </w:numPr>
+        <w:ind w:left="426"/>
+      </w:pPr>
+      <w:r>
+        <w:t>Apa itu React?</w:t>
+      </w:r>
+    </w:p>
+    <w:p>
+      <w:pPr>
+        <w:pStyle w:val="Heading2"/>
+        <w:numPr>
+          <w:ilvl w:val="1"/>
+          <w:numId w:val="17"/>
+        </w:numPr>
+        <w:ind w:left="426"/>
+      </w:pPr>
+      <w:r>
+        <w:t>Mengenal JSX</w:t>
+      </w:r>
+    </w:p>
+    <w:p>
+      <w:pPr>
+        <w:pStyle w:val="Heading2"/>
+        <w:numPr>
+          <w:ilvl w:val="1"/>
+          <w:numId w:val="17"/>
+        </w:numPr>
+        <w:ind w:left="426"/>
+      </w:pPr>
+      <w:r>
+        <w:t>Mengenal Komponen</w:t>
+      </w:r>
+    </w:p>
+    <w:p>
+      <w:pPr>
+        <w:pStyle w:val="Heading2"/>
+        <w:numPr>
+          <w:ilvl w:val="1"/>
+          <w:numId w:val="17"/>
+        </w:numPr>
+        <w:ind w:left="426"/>
+      </w:pPr>
+      <w:r>
+        <w:t>Membuat Komponen Pertama</w:t>
+      </w:r>
+    </w:p>
+    <w:p>
+      <w:pPr>
+        <w:pStyle w:val="Heading2"/>
+        <w:numPr>
+          <w:ilvl w:val="1"/>
+          <w:numId w:val="17"/>
+        </w:numPr>
+        <w:ind w:left="426"/>
+      </w:pPr>
+      <w:r>
+        <w:t>Menggunakan Komponen</w:t>
+      </w:r>
+    </w:p>
+    <w:p>
+      <w:pPr>
+        <w:pStyle w:val="Heading2"/>
+        <w:numPr>
+          <w:ilvl w:val="1"/>
+          <w:numId w:val="17"/>
+        </w:numPr>
+        <w:ind w:left="426"/>
+      </w:pPr>
+      <w:r>
+        <w:t>Ringkasan Bab</w:t>
+      </w:r>
+    </w:p>
     <w:sectPr>
-      <w:headerReference w:type="default" r:id="rId60"/>
-      <w:footerReference w:type="default" r:id="rId61"/>
+      <w:headerReference w:type="default" r:id="rId72"/>
+      <w:footerReference w:type="default" r:id="rId73"/>
       <w:pgSz w:w="11906" w:h="16838"/>
       <w:pgMar w:top="1440" w:right="1440" w:bottom="1440" w:left="1440" w:header="708" w:footer="708" w:gutter="0"/>
       <w:pgNumType w:start="1"/>
@@ -8278,6 +10194,119 @@
     </w:lvl>
   </w:abstractNum>
   <w:abstractNum w:abstractNumId="12" w15:restartNumberingAfterBreak="0">
+    <w:nsid w:val="4EA139ED"/>
+    <w:multiLevelType w:val="multilevel"/>
+    <w:tmpl w:val="929021E8"/>
+    <w:lvl w:ilvl="0">
+      <w:start w:val="1"/>
+      <w:numFmt w:val="decimal"/>
+      <w:lvlText w:val="%1."/>
+      <w:lvlJc w:val="left"/>
+      <w:pPr>
+        <w:ind w:left="360" w:hanging="360"/>
+      </w:pPr>
+      <w:rPr>
+        <w:rFonts w:hint="default"/>
+      </w:rPr>
+    </w:lvl>
+    <w:lvl w:ilvl="1">
+      <w:start w:val="1"/>
+      <w:numFmt w:val="decimal"/>
+      <w:lvlText w:val="4.%2."/>
+      <w:lvlJc w:val="left"/>
+      <w:pPr>
+        <w:ind w:left="792" w:hanging="432"/>
+      </w:pPr>
+      <w:rPr>
+        <w:rFonts w:hint="default"/>
+      </w:rPr>
+    </w:lvl>
+    <w:lvl w:ilvl="2">
+      <w:start w:val="1"/>
+      <w:numFmt w:val="decimal"/>
+      <w:lvlText w:val="%1.%2.%3."/>
+      <w:lvlJc w:val="left"/>
+      <w:pPr>
+        <w:ind w:left="1224" w:hanging="504"/>
+      </w:pPr>
+      <w:rPr>
+        <w:rFonts w:hint="default"/>
+      </w:rPr>
+    </w:lvl>
+    <w:lvl w:ilvl="3">
+      <w:start w:val="1"/>
+      <w:numFmt w:val="decimal"/>
+      <w:lvlText w:val="%1.%2.%3.%4."/>
+      <w:lvlJc w:val="left"/>
+      <w:pPr>
+        <w:ind w:left="1728" w:hanging="648"/>
+      </w:pPr>
+      <w:rPr>
+        <w:rFonts w:hint="default"/>
+      </w:rPr>
+    </w:lvl>
+    <w:lvl w:ilvl="4">
+      <w:start w:val="1"/>
+      <w:numFmt w:val="decimal"/>
+      <w:lvlText w:val="%1.%2.%3.%4.%5."/>
+      <w:lvlJc w:val="left"/>
+      <w:pPr>
+        <w:ind w:left="2232" w:hanging="792"/>
+      </w:pPr>
+      <w:rPr>
+        <w:rFonts w:hint="default"/>
+      </w:rPr>
+    </w:lvl>
+    <w:lvl w:ilvl="5">
+      <w:start w:val="1"/>
+      <w:numFmt w:val="decimal"/>
+      <w:lvlText w:val="%1.%2.%3.%4.%5.%6."/>
+      <w:lvlJc w:val="left"/>
+      <w:pPr>
+        <w:ind w:left="2736" w:hanging="936"/>
+      </w:pPr>
+      <w:rPr>
+        <w:rFonts w:hint="default"/>
+      </w:rPr>
+    </w:lvl>
+    <w:lvl w:ilvl="6">
+      <w:start w:val="1"/>
+      <w:numFmt w:val="decimal"/>
+      <w:lvlText w:val="%1.%2.%3.%4.%5.%6.%7."/>
+      <w:lvlJc w:val="left"/>
+      <w:pPr>
+        <w:ind w:left="3240" w:hanging="1080"/>
+      </w:pPr>
+      <w:rPr>
+        <w:rFonts w:hint="default"/>
+      </w:rPr>
+    </w:lvl>
+    <w:lvl w:ilvl="7">
+      <w:start w:val="1"/>
+      <w:numFmt w:val="decimal"/>
+      <w:lvlText w:val="%1.%2.%3.%4.%5.%6.%7.%8."/>
+      <w:lvlJc w:val="left"/>
+      <w:pPr>
+        <w:ind w:left="3744" w:hanging="1224"/>
+      </w:pPr>
+      <w:rPr>
+        <w:rFonts w:hint="default"/>
+      </w:rPr>
+    </w:lvl>
+    <w:lvl w:ilvl="8">
+      <w:start w:val="1"/>
+      <w:numFmt w:val="decimal"/>
+      <w:lvlText w:val="%1.%2.%3.%4.%5.%6.%7.%8.%9."/>
+      <w:lvlJc w:val="left"/>
+      <w:pPr>
+        <w:ind w:left="4320" w:hanging="1440"/>
+      </w:pPr>
+      <w:rPr>
+        <w:rFonts w:hint="default"/>
+      </w:rPr>
+    </w:lvl>
+  </w:abstractNum>
+  <w:abstractNum w:abstractNumId="13" w15:restartNumberingAfterBreak="0">
     <w:nsid w:val="58212346"/>
     <w:multiLevelType w:val="hybridMultilevel"/>
     <w:tmpl w:val="CC4ADD28"/>
@@ -8390,7 +10419,7 @@
       </w:rPr>
     </w:lvl>
   </w:abstractNum>
-  <w:abstractNum w:abstractNumId="13" w15:restartNumberingAfterBreak="0">
+  <w:abstractNum w:abstractNumId="14" w15:restartNumberingAfterBreak="0">
     <w:nsid w:val="64EE4379"/>
     <w:multiLevelType w:val="multilevel"/>
     <w:tmpl w:val="33887266"/>
@@ -8479,7 +10508,7 @@
       </w:pPr>
     </w:lvl>
   </w:abstractNum>
-  <w:abstractNum w:abstractNumId="14" w15:restartNumberingAfterBreak="0">
+  <w:abstractNum w:abstractNumId="15" w15:restartNumberingAfterBreak="0">
     <w:nsid w:val="7042763D"/>
     <w:multiLevelType w:val="hybridMultilevel"/>
     <w:tmpl w:val="A8FA09CA"/>
@@ -8592,7 +10621,7 @@
       </w:rPr>
     </w:lvl>
   </w:abstractNum>
-  <w:abstractNum w:abstractNumId="15" w15:restartNumberingAfterBreak="0">
+  <w:abstractNum w:abstractNumId="16" w15:restartNumberingAfterBreak="0">
     <w:nsid w:val="79E649FA"/>
     <w:multiLevelType w:val="hybridMultilevel"/>
     <w:tmpl w:val="5D54BE58"/>
@@ -8715,7 +10744,7 @@
     <w:abstractNumId w:val="8"/>
   </w:num>
   <w:num w:numId="4" w16cid:durableId="1198738994">
-    <w:abstractNumId w:val="13"/>
+    <w:abstractNumId w:val="14"/>
   </w:num>
   <w:num w:numId="5" w16cid:durableId="845945470">
     <w:abstractNumId w:val="1"/>
@@ -8739,10 +10768,10 @@
     <w:abstractNumId w:val="2"/>
   </w:num>
   <w:num w:numId="12" w16cid:durableId="1706904810">
-    <w:abstractNumId w:val="14"/>
+    <w:abstractNumId w:val="15"/>
   </w:num>
   <w:num w:numId="13" w16cid:durableId="452290699">
-    <w:abstractNumId w:val="15"/>
+    <w:abstractNumId w:val="16"/>
   </w:num>
   <w:num w:numId="14" w16cid:durableId="1452167094">
     <w:abstractNumId w:val="0"/>
@@ -8751,6 +10780,9 @@
     <w:abstractNumId w:val="6"/>
   </w:num>
   <w:num w:numId="16" w16cid:durableId="1899515761">
+    <w:abstractNumId w:val="13"/>
+  </w:num>
+  <w:num w:numId="17" w16cid:durableId="405762801">
     <w:abstractNumId w:val="12"/>
   </w:num>
 </w:numbering>
@@ -9365,7 +11397,6 @@
   <w:style w:type="character" w:default="1" w:styleId="DefaultParagraphFont">
     <w:name w:val="Default Paragraph Font"/>
     <w:uiPriority w:val="1"/>
-    <w:semiHidden/>
     <w:unhideWhenUsed/>
   </w:style>
   <w:style w:type="table" w:default="1" w:styleId="TableNormal">

</xml_diff>

<commit_message>
docs: update training module for React, adding fundamentals and component creation sections
</commit_message>
<xml_diff>
--- a/dokumen/Modul Pelatihan React v2.0.docx
+++ b/dokumen/Modul Pelatihan React v2.0.docx
@@ -85,7 +85,7 @@
       <w:pPr>
         <w:pStyle w:val="Heading1"/>
       </w:pPr>
-      <w:bookmarkStart w:id="0" w:name="_Toc234530561"/>
+      <w:bookmarkStart w:id="0" w:name="_Toc234532593"/>
       <w:r>
         <w:lastRenderedPageBreak/>
         <w:t>KATA PENGANTAR</w:t>
@@ -235,7 +235,7 @@
       <w:pPr>
         <w:pStyle w:val="Heading1"/>
       </w:pPr>
-      <w:bookmarkStart w:id="1" w:name="_Toc234530562"/>
+      <w:bookmarkStart w:id="1" w:name="_Toc234532594"/>
       <w:r>
         <w:lastRenderedPageBreak/>
         <w:t>DAFTAR ISI</w:t>
@@ -291,7 +291,7 @@
           <w:r>
             <w:fldChar w:fldCharType="separate"/>
           </w:r>
-          <w:hyperlink w:anchor="_Toc234530561" w:history="1">
+          <w:hyperlink w:anchor="_Toc234532593" w:history="1">
             <w:r>
               <w:rPr>
                 <w:rStyle w:val="Hyperlink"/>
@@ -314,7 +314,7 @@
               <w:rPr>
                 <w:webHidden/>
               </w:rPr>
-              <w:instrText xml:space="preserve"> PAGEREF _Toc234530561 \h </w:instrText>
+              <w:instrText xml:space="preserve"> PAGEREF _Toc234532593 \h </w:instrText>
             </w:r>
             <w:r>
               <w:rPr>
@@ -351,7 +351,7 @@
               <w:lang w:eastAsia="en-ID"/>
             </w:rPr>
           </w:pPr>
-          <w:hyperlink w:anchor="_Toc234530562" w:history="1">
+          <w:hyperlink w:anchor="_Toc234532594" w:history="1">
             <w:r>
               <w:rPr>
                 <w:rStyle w:val="Hyperlink"/>
@@ -374,7 +374,7 @@
               <w:rPr>
                 <w:webHidden/>
               </w:rPr>
-              <w:instrText xml:space="preserve"> PAGEREF _Toc234530562 \h </w:instrText>
+              <w:instrText xml:space="preserve"> PAGEREF _Toc234532594 \h </w:instrText>
             </w:r>
             <w:r>
               <w:rPr>
@@ -411,7 +411,7 @@
               <w:lang w:eastAsia="en-ID"/>
             </w:rPr>
           </w:pPr>
-          <w:hyperlink w:anchor="_Toc234530563" w:history="1">
+          <w:hyperlink w:anchor="_Toc234532595" w:history="1">
             <w:r>
               <w:rPr>
                 <w:rStyle w:val="Hyperlink"/>
@@ -434,7 +434,7 @@
               <w:rPr>
                 <w:webHidden/>
               </w:rPr>
-              <w:instrText xml:space="preserve"> PAGEREF _Toc234530563 \h </w:instrText>
+              <w:instrText xml:space="preserve"> PAGEREF _Toc234532595 \h </w:instrText>
             </w:r>
             <w:r>
               <w:rPr>
@@ -474,7 +474,7 @@
               <w:lang w:eastAsia="en-ID"/>
             </w:rPr>
           </w:pPr>
-          <w:hyperlink w:anchor="_Toc234530564" w:history="1">
+          <w:hyperlink w:anchor="_Toc234532596" w:history="1">
             <w:r>
               <w:rPr>
                 <w:rStyle w:val="Hyperlink"/>
@@ -516,7 +516,7 @@
                 <w:noProof/>
                 <w:webHidden/>
               </w:rPr>
-              <w:instrText xml:space="preserve"> PAGEREF _Toc234530564 \h </w:instrText>
+              <w:instrText xml:space="preserve"> PAGEREF _Toc234532596 \h </w:instrText>
             </w:r>
             <w:r>
               <w:rPr>
@@ -560,7 +560,7 @@
               <w:lang w:eastAsia="en-ID"/>
             </w:rPr>
           </w:pPr>
-          <w:hyperlink w:anchor="_Toc234530565" w:history="1">
+          <w:hyperlink w:anchor="_Toc234532597" w:history="1">
             <w:r>
               <w:rPr>
                 <w:rStyle w:val="Hyperlink"/>
@@ -602,7 +602,7 @@
                 <w:noProof/>
                 <w:webHidden/>
               </w:rPr>
-              <w:instrText xml:space="preserve"> PAGEREF _Toc234530565 \h </w:instrText>
+              <w:instrText xml:space="preserve"> PAGEREF _Toc234532597 \h </w:instrText>
             </w:r>
             <w:r>
               <w:rPr>
@@ -646,7 +646,7 @@
               <w:lang w:eastAsia="en-ID"/>
             </w:rPr>
           </w:pPr>
-          <w:hyperlink w:anchor="_Toc234530566" w:history="1">
+          <w:hyperlink w:anchor="_Toc234532598" w:history="1">
             <w:r>
               <w:rPr>
                 <w:rStyle w:val="Hyperlink"/>
@@ -688,7 +688,7 @@
                 <w:noProof/>
                 <w:webHidden/>
               </w:rPr>
-              <w:instrText xml:space="preserve"> PAGEREF _Toc234530566 \h </w:instrText>
+              <w:instrText xml:space="preserve"> PAGEREF _Toc234532598 \h </w:instrText>
             </w:r>
             <w:r>
               <w:rPr>
@@ -732,7 +732,7 @@
               <w:lang w:eastAsia="en-ID"/>
             </w:rPr>
           </w:pPr>
-          <w:hyperlink w:anchor="_Toc234530567" w:history="1">
+          <w:hyperlink w:anchor="_Toc234532599" w:history="1">
             <w:r>
               <w:rPr>
                 <w:rStyle w:val="Hyperlink"/>
@@ -774,7 +774,7 @@
                 <w:noProof/>
                 <w:webHidden/>
               </w:rPr>
-              <w:instrText xml:space="preserve"> PAGEREF _Toc234530567 \h </w:instrText>
+              <w:instrText xml:space="preserve"> PAGEREF _Toc234532599 \h </w:instrText>
             </w:r>
             <w:r>
               <w:rPr>
@@ -818,7 +818,7 @@
               <w:lang w:eastAsia="en-ID"/>
             </w:rPr>
           </w:pPr>
-          <w:hyperlink w:anchor="_Toc234530568" w:history="1">
+          <w:hyperlink w:anchor="_Toc234532600" w:history="1">
             <w:r>
               <w:rPr>
                 <w:rStyle w:val="Hyperlink"/>
@@ -860,7 +860,7 @@
                 <w:noProof/>
                 <w:webHidden/>
               </w:rPr>
-              <w:instrText xml:space="preserve"> PAGEREF _Toc234530568 \h </w:instrText>
+              <w:instrText xml:space="preserve"> PAGEREF _Toc234532600 \h </w:instrText>
             </w:r>
             <w:r>
               <w:rPr>
@@ -904,7 +904,7 @@
               <w:lang w:eastAsia="en-ID"/>
             </w:rPr>
           </w:pPr>
-          <w:hyperlink w:anchor="_Toc234530569" w:history="1">
+          <w:hyperlink w:anchor="_Toc234532601" w:history="1">
             <w:r>
               <w:rPr>
                 <w:rStyle w:val="Hyperlink"/>
@@ -946,7 +946,7 @@
                 <w:noProof/>
                 <w:webHidden/>
               </w:rPr>
-              <w:instrText xml:space="preserve"> PAGEREF _Toc234530569 \h </w:instrText>
+              <w:instrText xml:space="preserve"> PAGEREF _Toc234532601 \h </w:instrText>
             </w:r>
             <w:r>
               <w:rPr>
@@ -990,7 +990,7 @@
               <w:lang w:eastAsia="en-ID"/>
             </w:rPr>
           </w:pPr>
-          <w:hyperlink w:anchor="_Toc234530570" w:history="1">
+          <w:hyperlink w:anchor="_Toc234532602" w:history="1">
             <w:r>
               <w:rPr>
                 <w:rStyle w:val="Hyperlink"/>
@@ -1032,7 +1032,7 @@
                 <w:noProof/>
                 <w:webHidden/>
               </w:rPr>
-              <w:instrText xml:space="preserve"> PAGEREF _Toc234530570 \h </w:instrText>
+              <w:instrText xml:space="preserve"> PAGEREF _Toc234532602 \h </w:instrText>
             </w:r>
             <w:r>
               <w:rPr>
@@ -1073,7 +1073,7 @@
               <w:lang w:eastAsia="en-ID"/>
             </w:rPr>
           </w:pPr>
-          <w:hyperlink w:anchor="_Toc234530571" w:history="1">
+          <w:hyperlink w:anchor="_Toc234532603" w:history="1">
             <w:r>
               <w:rPr>
                 <w:rStyle w:val="Hyperlink"/>
@@ -1096,7 +1096,7 @@
               <w:rPr>
                 <w:webHidden/>
               </w:rPr>
-              <w:instrText xml:space="preserve"> PAGEREF _Toc234530571 \h </w:instrText>
+              <w:instrText xml:space="preserve"> PAGEREF _Toc234532603 \h </w:instrText>
             </w:r>
             <w:r>
               <w:rPr>
@@ -1136,7 +1136,7 @@
               <w:lang w:eastAsia="en-ID"/>
             </w:rPr>
           </w:pPr>
-          <w:hyperlink w:anchor="_Toc234530572" w:history="1">
+          <w:hyperlink w:anchor="_Toc234532604" w:history="1">
             <w:r>
               <w:rPr>
                 <w:rStyle w:val="Hyperlink"/>
@@ -1178,7 +1178,7 @@
                 <w:noProof/>
                 <w:webHidden/>
               </w:rPr>
-              <w:instrText xml:space="preserve"> PAGEREF _Toc234530572 \h </w:instrText>
+              <w:instrText xml:space="preserve"> PAGEREF _Toc234532604 \h </w:instrText>
             </w:r>
             <w:r>
               <w:rPr>
@@ -1222,7 +1222,7 @@
               <w:lang w:eastAsia="en-ID"/>
             </w:rPr>
           </w:pPr>
-          <w:hyperlink w:anchor="_Toc234530573" w:history="1">
+          <w:hyperlink w:anchor="_Toc234532605" w:history="1">
             <w:r>
               <w:rPr>
                 <w:rStyle w:val="Hyperlink"/>
@@ -1264,7 +1264,7 @@
                 <w:noProof/>
                 <w:webHidden/>
               </w:rPr>
-              <w:instrText xml:space="preserve"> PAGEREF _Toc234530573 \h </w:instrText>
+              <w:instrText xml:space="preserve"> PAGEREF _Toc234532605 \h </w:instrText>
             </w:r>
             <w:r>
               <w:rPr>
@@ -1308,7 +1308,7 @@
               <w:lang w:eastAsia="en-ID"/>
             </w:rPr>
           </w:pPr>
-          <w:hyperlink w:anchor="_Toc234530574" w:history="1">
+          <w:hyperlink w:anchor="_Toc234532606" w:history="1">
             <w:r>
               <w:rPr>
                 <w:rStyle w:val="Hyperlink"/>
@@ -1350,7 +1350,7 @@
                 <w:noProof/>
                 <w:webHidden/>
               </w:rPr>
-              <w:instrText xml:space="preserve"> PAGEREF _Toc234530574 \h </w:instrText>
+              <w:instrText xml:space="preserve"> PAGEREF _Toc234532606 \h </w:instrText>
             </w:r>
             <w:r>
               <w:rPr>
@@ -1394,7 +1394,7 @@
               <w:lang w:eastAsia="en-ID"/>
             </w:rPr>
           </w:pPr>
-          <w:hyperlink w:anchor="_Toc234530575" w:history="1">
+          <w:hyperlink w:anchor="_Toc234532607" w:history="1">
             <w:r>
               <w:rPr>
                 <w:rStyle w:val="Hyperlink"/>
@@ -1436,7 +1436,7 @@
                 <w:noProof/>
                 <w:webHidden/>
               </w:rPr>
-              <w:instrText xml:space="preserve"> PAGEREF _Toc234530575 \h </w:instrText>
+              <w:instrText xml:space="preserve"> PAGEREF _Toc234532607 \h </w:instrText>
             </w:r>
             <w:r>
               <w:rPr>
@@ -1480,7 +1480,7 @@
               <w:lang w:eastAsia="en-ID"/>
             </w:rPr>
           </w:pPr>
-          <w:hyperlink w:anchor="_Toc234530576" w:history="1">
+          <w:hyperlink w:anchor="_Toc234532608" w:history="1">
             <w:r>
               <w:rPr>
                 <w:rStyle w:val="Hyperlink"/>
@@ -1522,7 +1522,7 @@
                 <w:noProof/>
                 <w:webHidden/>
               </w:rPr>
-              <w:instrText xml:space="preserve"> PAGEREF _Toc234530576 \h </w:instrText>
+              <w:instrText xml:space="preserve"> PAGEREF _Toc234532608 \h </w:instrText>
             </w:r>
             <w:r>
               <w:rPr>
@@ -1566,7 +1566,7 @@
               <w:lang w:eastAsia="en-ID"/>
             </w:rPr>
           </w:pPr>
-          <w:hyperlink w:anchor="_Toc234530577" w:history="1">
+          <w:hyperlink w:anchor="_Toc234532609" w:history="1">
             <w:r>
               <w:rPr>
                 <w:rStyle w:val="Hyperlink"/>
@@ -1608,7 +1608,7 @@
                 <w:noProof/>
                 <w:webHidden/>
               </w:rPr>
-              <w:instrText xml:space="preserve"> PAGEREF _Toc234530577 \h </w:instrText>
+              <w:instrText xml:space="preserve"> PAGEREF _Toc234532609 \h </w:instrText>
             </w:r>
             <w:r>
               <w:rPr>
@@ -1649,7 +1649,7 @@
               <w:lang w:eastAsia="en-ID"/>
             </w:rPr>
           </w:pPr>
-          <w:hyperlink w:anchor="_Toc234530578" w:history="1">
+          <w:hyperlink w:anchor="_Toc234532610" w:history="1">
             <w:r>
               <w:rPr>
                 <w:rStyle w:val="Hyperlink"/>
@@ -1672,7 +1672,7 @@
               <w:rPr>
                 <w:webHidden/>
               </w:rPr>
-              <w:instrText xml:space="preserve"> PAGEREF _Toc234530578 \h </w:instrText>
+              <w:instrText xml:space="preserve"> PAGEREF _Toc234532610 \h </w:instrText>
             </w:r>
             <w:r>
               <w:rPr>
@@ -1712,7 +1712,7 @@
               <w:lang w:eastAsia="en-ID"/>
             </w:rPr>
           </w:pPr>
-          <w:hyperlink w:anchor="_Toc234530579" w:history="1">
+          <w:hyperlink w:anchor="_Toc234532611" w:history="1">
             <w:r>
               <w:rPr>
                 <w:rStyle w:val="Hyperlink"/>
@@ -1754,7 +1754,7 @@
                 <w:noProof/>
                 <w:webHidden/>
               </w:rPr>
-              <w:instrText xml:space="preserve"> PAGEREF _Toc234530579 \h </w:instrText>
+              <w:instrText xml:space="preserve"> PAGEREF _Toc234532611 \h </w:instrText>
             </w:r>
             <w:r>
               <w:rPr>
@@ -1798,7 +1798,7 @@
               <w:lang w:eastAsia="en-ID"/>
             </w:rPr>
           </w:pPr>
-          <w:hyperlink w:anchor="_Toc234530580" w:history="1">
+          <w:hyperlink w:anchor="_Toc234532612" w:history="1">
             <w:r>
               <w:rPr>
                 <w:rStyle w:val="Hyperlink"/>
@@ -1840,7 +1840,7 @@
                 <w:noProof/>
                 <w:webHidden/>
               </w:rPr>
-              <w:instrText xml:space="preserve"> PAGEREF _Toc234530580 \h </w:instrText>
+              <w:instrText xml:space="preserve"> PAGEREF _Toc234532612 \h </w:instrText>
             </w:r>
             <w:r>
               <w:rPr>
@@ -1884,7 +1884,7 @@
               <w:lang w:eastAsia="en-ID"/>
             </w:rPr>
           </w:pPr>
-          <w:hyperlink w:anchor="_Toc234530581" w:history="1">
+          <w:hyperlink w:anchor="_Toc234532613" w:history="1">
             <w:r>
               <w:rPr>
                 <w:rStyle w:val="Hyperlink"/>
@@ -1926,7 +1926,7 @@
                 <w:noProof/>
                 <w:webHidden/>
               </w:rPr>
-              <w:instrText xml:space="preserve"> PAGEREF _Toc234530581 \h </w:instrText>
+              <w:instrText xml:space="preserve"> PAGEREF _Toc234532613 \h </w:instrText>
             </w:r>
             <w:r>
               <w:rPr>
@@ -1970,7 +1970,7 @@
               <w:lang w:eastAsia="en-ID"/>
             </w:rPr>
           </w:pPr>
-          <w:hyperlink w:anchor="_Toc234530582" w:history="1">
+          <w:hyperlink w:anchor="_Toc234532614" w:history="1">
             <w:r>
               <w:rPr>
                 <w:rStyle w:val="Hyperlink"/>
@@ -2012,7 +2012,7 @@
                 <w:noProof/>
                 <w:webHidden/>
               </w:rPr>
-              <w:instrText xml:space="preserve"> PAGEREF _Toc234530582 \h </w:instrText>
+              <w:instrText xml:space="preserve"> PAGEREF _Toc234532614 \h </w:instrText>
             </w:r>
             <w:r>
               <w:rPr>
@@ -2056,7 +2056,7 @@
               <w:lang w:eastAsia="en-ID"/>
             </w:rPr>
           </w:pPr>
-          <w:hyperlink w:anchor="_Toc234530583" w:history="1">
+          <w:hyperlink w:anchor="_Toc234532615" w:history="1">
             <w:r>
               <w:rPr>
                 <w:rStyle w:val="Hyperlink"/>
@@ -2098,7 +2098,7 @@
                 <w:noProof/>
                 <w:webHidden/>
               </w:rPr>
-              <w:instrText xml:space="preserve"> PAGEREF _Toc234530583 \h </w:instrText>
+              <w:instrText xml:space="preserve"> PAGEREF _Toc234532615 \h </w:instrText>
             </w:r>
             <w:r>
               <w:rPr>
@@ -2142,7 +2142,7 @@
               <w:lang w:eastAsia="en-ID"/>
             </w:rPr>
           </w:pPr>
-          <w:hyperlink w:anchor="_Toc234530584" w:history="1">
+          <w:hyperlink w:anchor="_Toc234532616" w:history="1">
             <w:r>
               <w:rPr>
                 <w:rStyle w:val="Hyperlink"/>
@@ -2184,7 +2184,7 @@
                 <w:noProof/>
                 <w:webHidden/>
               </w:rPr>
-              <w:instrText xml:space="preserve"> PAGEREF _Toc234530584 \h </w:instrText>
+              <w:instrText xml:space="preserve"> PAGEREF _Toc234532616 \h </w:instrText>
             </w:r>
             <w:r>
               <w:rPr>
@@ -2228,7 +2228,7 @@
               <w:lang w:eastAsia="en-ID"/>
             </w:rPr>
           </w:pPr>
-          <w:hyperlink w:anchor="_Toc234530585" w:history="1">
+          <w:hyperlink w:anchor="_Toc234532617" w:history="1">
             <w:r>
               <w:rPr>
                 <w:rStyle w:val="Hyperlink"/>
@@ -2270,7 +2270,7 @@
                 <w:noProof/>
                 <w:webHidden/>
               </w:rPr>
-              <w:instrText xml:space="preserve"> PAGEREF _Toc234530585 \h </w:instrText>
+              <w:instrText xml:space="preserve"> PAGEREF _Toc234532617 \h </w:instrText>
             </w:r>
             <w:r>
               <w:rPr>
@@ -2311,12 +2311,12 @@
               <w:lang w:eastAsia="en-ID"/>
             </w:rPr>
           </w:pPr>
-          <w:hyperlink w:anchor="_Toc234530586" w:history="1">
+          <w:hyperlink w:anchor="_Toc234532618" w:history="1">
             <w:r>
               <w:rPr>
                 <w:rStyle w:val="Hyperlink"/>
               </w:rPr>
-              <w:t>BAB 4</w:t>
+              <w:t>BAB 4  Dasar-dasar React dan Komponen</w:t>
             </w:r>
             <w:r>
               <w:rPr>
@@ -2334,7 +2334,7 @@
               <w:rPr>
                 <w:webHidden/>
               </w:rPr>
-              <w:instrText xml:space="preserve"> PAGEREF _Toc234530586 \h </w:instrText>
+              <w:instrText xml:space="preserve"> PAGEREF _Toc234532618 \h </w:instrText>
             </w:r>
             <w:r>
               <w:rPr>
@@ -2355,6 +2355,608 @@
             </w:r>
             <w:r>
               <w:rPr>
+                <w:webHidden/>
+              </w:rPr>
+              <w:fldChar w:fldCharType="end"/>
+            </w:r>
+          </w:hyperlink>
+        </w:p>
+        <w:p>
+          <w:pPr>
+            <w:pStyle w:val="TOC2"/>
+            <w:tabs>
+              <w:tab w:val="left" w:pos="960"/>
+              <w:tab w:val="right" w:leader="dot" w:pos="9016"/>
+            </w:tabs>
+            <w:rPr>
+              <w:rFonts w:asciiTheme="minorHAnsi" w:eastAsiaTheme="minorEastAsia" w:hAnsiTheme="minorHAnsi"/>
+              <w:noProof/>
+              <w:lang w:eastAsia="en-ID"/>
+            </w:rPr>
+          </w:pPr>
+          <w:hyperlink w:anchor="_Toc234532619" w:history="1">
+            <w:r>
+              <w:rPr>
+                <w:rStyle w:val="Hyperlink"/>
+                <w:noProof/>
+              </w:rPr>
+              <w:t>4.1.</w:t>
+            </w:r>
+            <w:r>
+              <w:rPr>
+                <w:rFonts w:asciiTheme="minorHAnsi" w:eastAsiaTheme="minorEastAsia" w:hAnsiTheme="minorHAnsi"/>
+                <w:noProof/>
+                <w:lang w:eastAsia="en-ID"/>
+              </w:rPr>
+              <w:tab/>
+            </w:r>
+            <w:r>
+              <w:rPr>
+                <w:rStyle w:val="Hyperlink"/>
+                <w:noProof/>
+              </w:rPr>
+              <w:t>Pendahuluan</w:t>
+            </w:r>
+            <w:r>
+              <w:rPr>
+                <w:noProof/>
+                <w:webHidden/>
+              </w:rPr>
+              <w:tab/>
+            </w:r>
+            <w:r>
+              <w:rPr>
+                <w:noProof/>
+                <w:webHidden/>
+              </w:rPr>
+              <w:fldChar w:fldCharType="begin"/>
+            </w:r>
+            <w:r>
+              <w:rPr>
+                <w:noProof/>
+                <w:webHidden/>
+              </w:rPr>
+              <w:instrText xml:space="preserve"> PAGEREF _Toc234532619 \h </w:instrText>
+            </w:r>
+            <w:r>
+              <w:rPr>
+                <w:noProof/>
+                <w:webHidden/>
+              </w:rPr>
+            </w:r>
+            <w:r>
+              <w:rPr>
+                <w:noProof/>
+                <w:webHidden/>
+              </w:rPr>
+              <w:fldChar w:fldCharType="separate"/>
+            </w:r>
+            <w:r>
+              <w:rPr>
+                <w:noProof/>
+                <w:webHidden/>
+              </w:rPr>
+              <w:t>28</w:t>
+            </w:r>
+            <w:r>
+              <w:rPr>
+                <w:noProof/>
+                <w:webHidden/>
+              </w:rPr>
+              <w:fldChar w:fldCharType="end"/>
+            </w:r>
+          </w:hyperlink>
+        </w:p>
+        <w:p>
+          <w:pPr>
+            <w:pStyle w:val="TOC2"/>
+            <w:tabs>
+              <w:tab w:val="left" w:pos="960"/>
+              <w:tab w:val="right" w:leader="dot" w:pos="9016"/>
+            </w:tabs>
+            <w:rPr>
+              <w:rFonts w:asciiTheme="minorHAnsi" w:eastAsiaTheme="minorEastAsia" w:hAnsiTheme="minorHAnsi"/>
+              <w:noProof/>
+              <w:lang w:eastAsia="en-ID"/>
+            </w:rPr>
+          </w:pPr>
+          <w:hyperlink w:anchor="_Toc234532620" w:history="1">
+            <w:r>
+              <w:rPr>
+                <w:rStyle w:val="Hyperlink"/>
+                <w:noProof/>
+              </w:rPr>
+              <w:t>4.2.</w:t>
+            </w:r>
+            <w:r>
+              <w:rPr>
+                <w:rFonts w:asciiTheme="minorHAnsi" w:eastAsiaTheme="minorEastAsia" w:hAnsiTheme="minorHAnsi"/>
+                <w:noProof/>
+                <w:lang w:eastAsia="en-ID"/>
+              </w:rPr>
+              <w:tab/>
+            </w:r>
+            <w:r>
+              <w:rPr>
+                <w:rStyle w:val="Hyperlink"/>
+                <w:noProof/>
+              </w:rPr>
+              <w:t>Apa itu React?</w:t>
+            </w:r>
+            <w:r>
+              <w:rPr>
+                <w:noProof/>
+                <w:webHidden/>
+              </w:rPr>
+              <w:tab/>
+            </w:r>
+            <w:r>
+              <w:rPr>
+                <w:noProof/>
+                <w:webHidden/>
+              </w:rPr>
+              <w:fldChar w:fldCharType="begin"/>
+            </w:r>
+            <w:r>
+              <w:rPr>
+                <w:noProof/>
+                <w:webHidden/>
+              </w:rPr>
+              <w:instrText xml:space="preserve"> PAGEREF _Toc234532620 \h </w:instrText>
+            </w:r>
+            <w:r>
+              <w:rPr>
+                <w:noProof/>
+                <w:webHidden/>
+              </w:rPr>
+            </w:r>
+            <w:r>
+              <w:rPr>
+                <w:noProof/>
+                <w:webHidden/>
+              </w:rPr>
+              <w:fldChar w:fldCharType="separate"/>
+            </w:r>
+            <w:r>
+              <w:rPr>
+                <w:noProof/>
+                <w:webHidden/>
+              </w:rPr>
+              <w:t>28</w:t>
+            </w:r>
+            <w:r>
+              <w:rPr>
+                <w:noProof/>
+                <w:webHidden/>
+              </w:rPr>
+              <w:fldChar w:fldCharType="end"/>
+            </w:r>
+          </w:hyperlink>
+        </w:p>
+        <w:p>
+          <w:pPr>
+            <w:pStyle w:val="TOC2"/>
+            <w:tabs>
+              <w:tab w:val="left" w:pos="960"/>
+              <w:tab w:val="right" w:leader="dot" w:pos="9016"/>
+            </w:tabs>
+            <w:rPr>
+              <w:rFonts w:asciiTheme="minorHAnsi" w:eastAsiaTheme="minorEastAsia" w:hAnsiTheme="minorHAnsi"/>
+              <w:noProof/>
+              <w:lang w:eastAsia="en-ID"/>
+            </w:rPr>
+          </w:pPr>
+          <w:hyperlink w:anchor="_Toc234532621" w:history="1">
+            <w:r>
+              <w:rPr>
+                <w:rStyle w:val="Hyperlink"/>
+                <w:noProof/>
+              </w:rPr>
+              <w:t>4.3.</w:t>
+            </w:r>
+            <w:r>
+              <w:rPr>
+                <w:rFonts w:asciiTheme="minorHAnsi" w:eastAsiaTheme="minorEastAsia" w:hAnsiTheme="minorHAnsi"/>
+                <w:noProof/>
+                <w:lang w:eastAsia="en-ID"/>
+              </w:rPr>
+              <w:tab/>
+            </w:r>
+            <w:r>
+              <w:rPr>
+                <w:rStyle w:val="Hyperlink"/>
+                <w:noProof/>
+              </w:rPr>
+              <w:t>Mengenal JSX</w:t>
+            </w:r>
+            <w:r>
+              <w:rPr>
+                <w:noProof/>
+                <w:webHidden/>
+              </w:rPr>
+              <w:tab/>
+            </w:r>
+            <w:r>
+              <w:rPr>
+                <w:noProof/>
+                <w:webHidden/>
+              </w:rPr>
+              <w:fldChar w:fldCharType="begin"/>
+            </w:r>
+            <w:r>
+              <w:rPr>
+                <w:noProof/>
+                <w:webHidden/>
+              </w:rPr>
+              <w:instrText xml:space="preserve"> PAGEREF _Toc234532621 \h </w:instrText>
+            </w:r>
+            <w:r>
+              <w:rPr>
+                <w:noProof/>
+                <w:webHidden/>
+              </w:rPr>
+            </w:r>
+            <w:r>
+              <w:rPr>
+                <w:noProof/>
+                <w:webHidden/>
+              </w:rPr>
+              <w:fldChar w:fldCharType="separate"/>
+            </w:r>
+            <w:r>
+              <w:rPr>
+                <w:noProof/>
+                <w:webHidden/>
+              </w:rPr>
+              <w:t>29</w:t>
+            </w:r>
+            <w:r>
+              <w:rPr>
+                <w:noProof/>
+                <w:webHidden/>
+              </w:rPr>
+              <w:fldChar w:fldCharType="end"/>
+            </w:r>
+          </w:hyperlink>
+        </w:p>
+        <w:p>
+          <w:pPr>
+            <w:pStyle w:val="TOC2"/>
+            <w:tabs>
+              <w:tab w:val="left" w:pos="960"/>
+              <w:tab w:val="right" w:leader="dot" w:pos="9016"/>
+            </w:tabs>
+            <w:rPr>
+              <w:rFonts w:asciiTheme="minorHAnsi" w:eastAsiaTheme="minorEastAsia" w:hAnsiTheme="minorHAnsi"/>
+              <w:noProof/>
+              <w:lang w:eastAsia="en-ID"/>
+            </w:rPr>
+          </w:pPr>
+          <w:hyperlink w:anchor="_Toc234532622" w:history="1">
+            <w:r>
+              <w:rPr>
+                <w:rStyle w:val="Hyperlink"/>
+                <w:noProof/>
+              </w:rPr>
+              <w:t>4.4.</w:t>
+            </w:r>
+            <w:r>
+              <w:rPr>
+                <w:rFonts w:asciiTheme="minorHAnsi" w:eastAsiaTheme="minorEastAsia" w:hAnsiTheme="minorHAnsi"/>
+                <w:noProof/>
+                <w:lang w:eastAsia="en-ID"/>
+              </w:rPr>
+              <w:tab/>
+            </w:r>
+            <w:r>
+              <w:rPr>
+                <w:rStyle w:val="Hyperlink"/>
+                <w:noProof/>
+              </w:rPr>
+              <w:t>Mengenal Komponen</w:t>
+            </w:r>
+            <w:r>
+              <w:rPr>
+                <w:noProof/>
+                <w:webHidden/>
+              </w:rPr>
+              <w:tab/>
+            </w:r>
+            <w:r>
+              <w:rPr>
+                <w:noProof/>
+                <w:webHidden/>
+              </w:rPr>
+              <w:fldChar w:fldCharType="begin"/>
+            </w:r>
+            <w:r>
+              <w:rPr>
+                <w:noProof/>
+                <w:webHidden/>
+              </w:rPr>
+              <w:instrText xml:space="preserve"> PAGEREF _Toc234532622 \h </w:instrText>
+            </w:r>
+            <w:r>
+              <w:rPr>
+                <w:noProof/>
+                <w:webHidden/>
+              </w:rPr>
+            </w:r>
+            <w:r>
+              <w:rPr>
+                <w:noProof/>
+                <w:webHidden/>
+              </w:rPr>
+              <w:fldChar w:fldCharType="separate"/>
+            </w:r>
+            <w:r>
+              <w:rPr>
+                <w:noProof/>
+                <w:webHidden/>
+              </w:rPr>
+              <w:t>31</w:t>
+            </w:r>
+            <w:r>
+              <w:rPr>
+                <w:noProof/>
+                <w:webHidden/>
+              </w:rPr>
+              <w:fldChar w:fldCharType="end"/>
+            </w:r>
+          </w:hyperlink>
+        </w:p>
+        <w:p>
+          <w:pPr>
+            <w:pStyle w:val="TOC2"/>
+            <w:tabs>
+              <w:tab w:val="left" w:pos="960"/>
+              <w:tab w:val="right" w:leader="dot" w:pos="9016"/>
+            </w:tabs>
+            <w:rPr>
+              <w:rFonts w:asciiTheme="minorHAnsi" w:eastAsiaTheme="minorEastAsia" w:hAnsiTheme="minorHAnsi"/>
+              <w:noProof/>
+              <w:lang w:eastAsia="en-ID"/>
+            </w:rPr>
+          </w:pPr>
+          <w:hyperlink w:anchor="_Toc234532623" w:history="1">
+            <w:r>
+              <w:rPr>
+                <w:rStyle w:val="Hyperlink"/>
+                <w:noProof/>
+              </w:rPr>
+              <w:t>4.5.</w:t>
+            </w:r>
+            <w:r>
+              <w:rPr>
+                <w:rFonts w:asciiTheme="minorHAnsi" w:eastAsiaTheme="minorEastAsia" w:hAnsiTheme="minorHAnsi"/>
+                <w:noProof/>
+                <w:lang w:eastAsia="en-ID"/>
+              </w:rPr>
+              <w:tab/>
+            </w:r>
+            <w:r>
+              <w:rPr>
+                <w:rStyle w:val="Hyperlink"/>
+                <w:noProof/>
+              </w:rPr>
+              <w:t>Membuat Komponen Pertama</w:t>
+            </w:r>
+            <w:r>
+              <w:rPr>
+                <w:noProof/>
+                <w:webHidden/>
+              </w:rPr>
+              <w:tab/>
+            </w:r>
+            <w:r>
+              <w:rPr>
+                <w:noProof/>
+                <w:webHidden/>
+              </w:rPr>
+              <w:fldChar w:fldCharType="begin"/>
+            </w:r>
+            <w:r>
+              <w:rPr>
+                <w:noProof/>
+                <w:webHidden/>
+              </w:rPr>
+              <w:instrText xml:space="preserve"> PAGEREF _Toc234532623 \h </w:instrText>
+            </w:r>
+            <w:r>
+              <w:rPr>
+                <w:noProof/>
+                <w:webHidden/>
+              </w:rPr>
+            </w:r>
+            <w:r>
+              <w:rPr>
+                <w:noProof/>
+                <w:webHidden/>
+              </w:rPr>
+              <w:fldChar w:fldCharType="separate"/>
+            </w:r>
+            <w:r>
+              <w:rPr>
+                <w:noProof/>
+                <w:webHidden/>
+              </w:rPr>
+              <w:t>31</w:t>
+            </w:r>
+            <w:r>
+              <w:rPr>
+                <w:noProof/>
+                <w:webHidden/>
+              </w:rPr>
+              <w:fldChar w:fldCharType="end"/>
+            </w:r>
+          </w:hyperlink>
+        </w:p>
+        <w:p>
+          <w:pPr>
+            <w:pStyle w:val="TOC2"/>
+            <w:tabs>
+              <w:tab w:val="left" w:pos="960"/>
+              <w:tab w:val="right" w:leader="dot" w:pos="9016"/>
+            </w:tabs>
+            <w:rPr>
+              <w:rFonts w:asciiTheme="minorHAnsi" w:eastAsiaTheme="minorEastAsia" w:hAnsiTheme="minorHAnsi"/>
+              <w:noProof/>
+              <w:lang w:eastAsia="en-ID"/>
+            </w:rPr>
+          </w:pPr>
+          <w:hyperlink w:anchor="_Toc234532624" w:history="1">
+            <w:r>
+              <w:rPr>
+                <w:rStyle w:val="Hyperlink"/>
+                <w:noProof/>
+              </w:rPr>
+              <w:t>4.6.</w:t>
+            </w:r>
+            <w:r>
+              <w:rPr>
+                <w:rFonts w:asciiTheme="minorHAnsi" w:eastAsiaTheme="minorEastAsia" w:hAnsiTheme="minorHAnsi"/>
+                <w:noProof/>
+                <w:lang w:eastAsia="en-ID"/>
+              </w:rPr>
+              <w:tab/>
+            </w:r>
+            <w:r>
+              <w:rPr>
+                <w:rStyle w:val="Hyperlink"/>
+                <w:noProof/>
+              </w:rPr>
+              <w:t>Menggunakan Komponen</w:t>
+            </w:r>
+            <w:r>
+              <w:rPr>
+                <w:noProof/>
+                <w:webHidden/>
+              </w:rPr>
+              <w:tab/>
+            </w:r>
+            <w:r>
+              <w:rPr>
+                <w:noProof/>
+                <w:webHidden/>
+              </w:rPr>
+              <w:fldChar w:fldCharType="begin"/>
+            </w:r>
+            <w:r>
+              <w:rPr>
+                <w:noProof/>
+                <w:webHidden/>
+              </w:rPr>
+              <w:instrText xml:space="preserve"> PAGEREF _Toc234532624 \h </w:instrText>
+            </w:r>
+            <w:r>
+              <w:rPr>
+                <w:noProof/>
+                <w:webHidden/>
+              </w:rPr>
+            </w:r>
+            <w:r>
+              <w:rPr>
+                <w:noProof/>
+                <w:webHidden/>
+              </w:rPr>
+              <w:fldChar w:fldCharType="separate"/>
+            </w:r>
+            <w:r>
+              <w:rPr>
+                <w:noProof/>
+                <w:webHidden/>
+              </w:rPr>
+              <w:t>31</w:t>
+            </w:r>
+            <w:r>
+              <w:rPr>
+                <w:noProof/>
+                <w:webHidden/>
+              </w:rPr>
+              <w:fldChar w:fldCharType="end"/>
+            </w:r>
+          </w:hyperlink>
+        </w:p>
+        <w:p>
+          <w:pPr>
+            <w:pStyle w:val="TOC2"/>
+            <w:tabs>
+              <w:tab w:val="left" w:pos="960"/>
+              <w:tab w:val="right" w:leader="dot" w:pos="9016"/>
+            </w:tabs>
+            <w:rPr>
+              <w:rFonts w:asciiTheme="minorHAnsi" w:eastAsiaTheme="minorEastAsia" w:hAnsiTheme="minorHAnsi"/>
+              <w:noProof/>
+              <w:lang w:eastAsia="en-ID"/>
+            </w:rPr>
+          </w:pPr>
+          <w:hyperlink w:anchor="_Toc234532625" w:history="1">
+            <w:r>
+              <w:rPr>
+                <w:rStyle w:val="Hyperlink"/>
+                <w:noProof/>
+              </w:rPr>
+              <w:t>4.7.</w:t>
+            </w:r>
+            <w:r>
+              <w:rPr>
+                <w:rFonts w:asciiTheme="minorHAnsi" w:eastAsiaTheme="minorEastAsia" w:hAnsiTheme="minorHAnsi"/>
+                <w:noProof/>
+                <w:lang w:eastAsia="en-ID"/>
+              </w:rPr>
+              <w:tab/>
+            </w:r>
+            <w:r>
+              <w:rPr>
+                <w:rStyle w:val="Hyperlink"/>
+                <w:noProof/>
+              </w:rPr>
+              <w:t>Ringkasan Bab</w:t>
+            </w:r>
+            <w:r>
+              <w:rPr>
+                <w:noProof/>
+                <w:webHidden/>
+              </w:rPr>
+              <w:tab/>
+            </w:r>
+            <w:r>
+              <w:rPr>
+                <w:noProof/>
+                <w:webHidden/>
+              </w:rPr>
+              <w:fldChar w:fldCharType="begin"/>
+            </w:r>
+            <w:r>
+              <w:rPr>
+                <w:noProof/>
+                <w:webHidden/>
+              </w:rPr>
+              <w:instrText xml:space="preserve"> PAGEREF _Toc234532625 \h </w:instrText>
+            </w:r>
+            <w:r>
+              <w:rPr>
+                <w:noProof/>
+                <w:webHidden/>
+              </w:rPr>
+            </w:r>
+            <w:r>
+              <w:rPr>
+                <w:noProof/>
+                <w:webHidden/>
+              </w:rPr>
+              <w:fldChar w:fldCharType="separate"/>
+            </w:r>
+            <w:r>
+              <w:rPr>
+                <w:noProof/>
+                <w:webHidden/>
+              </w:rPr>
+              <w:t>31</w:t>
+            </w:r>
+            <w:r>
+              <w:rPr>
+                <w:noProof/>
                 <w:webHidden/>
               </w:rPr>
               <w:fldChar w:fldCharType="end"/>
@@ -2399,7 +3001,7 @@
       <w:pPr>
         <w:pStyle w:val="Heading1"/>
       </w:pPr>
-      <w:bookmarkStart w:id="2" w:name="_Toc234530563"/>
+      <w:bookmarkStart w:id="2" w:name="_Toc234532595"/>
       <w:r>
         <w:lastRenderedPageBreak/>
         <w:t>BAB I</w:t>
@@ -2422,7 +3024,7 @@
         </w:numPr>
         <w:ind w:left="540" w:hanging="630"/>
       </w:pPr>
-      <w:bookmarkStart w:id="3" w:name="_Toc234530564"/>
+      <w:bookmarkStart w:id="3" w:name="_Toc234532596"/>
       <w:r>
         <w:t>Pendahuluan</w:t>
       </w:r>
@@ -2486,7 +3088,7 @@
         </w:numPr>
         <w:ind w:left="450" w:hanging="450"/>
       </w:pPr>
-      <w:bookmarkStart w:id="4" w:name="_Toc234530565"/>
+      <w:bookmarkStart w:id="4" w:name="_Toc234532597"/>
       <w:r>
         <w:t>Variabel (let dan const)</w:t>
       </w:r>
@@ -3095,7 +3697,7 @@
         </w:numPr>
         <w:ind w:left="450" w:hanging="450"/>
       </w:pPr>
-      <w:bookmarkStart w:id="5" w:name="_Toc234530566"/>
+      <w:bookmarkStart w:id="5" w:name="_Toc234532598"/>
       <w:r>
         <w:lastRenderedPageBreak/>
         <w:t>Arrow Function</w:t>
@@ -3588,7 +4190,7 @@
         </w:numPr>
         <w:ind w:left="450" w:hanging="450"/>
       </w:pPr>
-      <w:bookmarkStart w:id="6" w:name="_Toc234530567"/>
+      <w:bookmarkStart w:id="6" w:name="_Toc234532599"/>
       <w:r>
         <w:lastRenderedPageBreak/>
         <w:t>Template Literals</w:t>
@@ -3835,7 +4437,7 @@
         </w:numPr>
         <w:ind w:left="450" w:hanging="450"/>
       </w:pPr>
-      <w:bookmarkStart w:id="7" w:name="_Toc234530568"/>
+      <w:bookmarkStart w:id="7" w:name="_Toc234532600"/>
       <w:r>
         <w:lastRenderedPageBreak/>
         <w:t>Destructuring Assignment</w:t>
@@ -4285,7 +4887,7 @@
       <w:r>
         <w:br w:type="page"/>
       </w:r>
-      <w:bookmarkStart w:id="8" w:name="_Toc234530569"/>
+      <w:bookmarkStart w:id="8" w:name="_Toc234532601"/>
       <w:r>
         <w:lastRenderedPageBreak/>
         <w:t>Spread dan Rest Operator</w:t>
@@ -4605,7 +5207,7 @@
         </w:numPr>
         <w:ind w:left="450" w:hanging="450"/>
       </w:pPr>
-      <w:bookmarkStart w:id="9" w:name="_Toc234530570"/>
+      <w:bookmarkStart w:id="9" w:name="_Toc234532602"/>
       <w:r>
         <w:lastRenderedPageBreak/>
         <w:t>Ringkasan Bab</w:t>
@@ -4726,7 +5328,7 @@
       <w:pPr>
         <w:pStyle w:val="Heading1"/>
       </w:pPr>
-      <w:bookmarkStart w:id="10" w:name="_Toc234530571"/>
+      <w:bookmarkStart w:id="10" w:name="_Toc234532603"/>
       <w:r>
         <w:lastRenderedPageBreak/>
         <w:t>BAB 2</w:t>
@@ -4747,7 +5349,7 @@
         </w:numPr>
         <w:ind w:left="450" w:hanging="450"/>
       </w:pPr>
-      <w:bookmarkStart w:id="11" w:name="_Toc234530572"/>
+      <w:bookmarkStart w:id="11" w:name="_Toc234532604"/>
       <w:r>
         <w:t>Pendahuluan</w:t>
       </w:r>
@@ -4819,7 +5421,7 @@
         </w:numPr>
         <w:ind w:left="450" w:hanging="450"/>
       </w:pPr>
-      <w:bookmarkStart w:id="12" w:name="_Toc234530573"/>
+      <w:bookmarkStart w:id="12" w:name="_Toc234532605"/>
       <w:r>
         <w:t>Node.js</w:t>
       </w:r>
@@ -5314,7 +5916,7 @@
         </w:numPr>
         <w:ind w:left="426"/>
       </w:pPr>
-      <w:bookmarkStart w:id="13" w:name="_Toc234530574"/>
+      <w:bookmarkStart w:id="13" w:name="_Toc234532606"/>
       <w:r>
         <w:t>Pengenalan npm (Node Package Manager)</w:t>
       </w:r>
@@ -6153,7 +6755,7 @@
         </w:numPr>
         <w:ind w:left="426"/>
       </w:pPr>
-      <w:bookmarkStart w:id="14" w:name="_Toc234530575"/>
+      <w:bookmarkStart w:id="14" w:name="_Toc234532607"/>
       <w:r>
         <w:t>Pengenalan pnpm</w:t>
       </w:r>
@@ -6584,7 +7186,7 @@
         </w:numPr>
         <w:ind w:left="426"/>
       </w:pPr>
-      <w:bookmarkStart w:id="15" w:name="_Toc234530576"/>
+      <w:bookmarkStart w:id="15" w:name="_Toc234532608"/>
       <w:r>
         <w:lastRenderedPageBreak/>
         <w:t>Membuat dan Mengelola Project</w:t>
@@ -7062,7 +7664,7 @@
         </w:numPr>
         <w:ind w:left="426"/>
       </w:pPr>
-      <w:bookmarkStart w:id="16" w:name="_Toc234530577"/>
+      <w:bookmarkStart w:id="16" w:name="_Toc234532609"/>
       <w:r>
         <w:t>Ringkasan Bab</w:t>
       </w:r>
@@ -7131,7 +7733,7 @@
       <w:r>
         <w:br w:type="page"/>
       </w:r>
-      <w:bookmarkStart w:id="17" w:name="_Toc234530578"/>
+      <w:bookmarkStart w:id="17" w:name="_Toc234532610"/>
       <w:r>
         <w:lastRenderedPageBreak/>
         <w:t xml:space="preserve">BAB 3 </w:t>
@@ -7152,7 +7754,7 @@
         </w:numPr>
         <w:ind w:left="426"/>
       </w:pPr>
-      <w:bookmarkStart w:id="18" w:name="_Toc234530579"/>
+      <w:bookmarkStart w:id="18" w:name="_Toc234532611"/>
       <w:r>
         <w:t>Pendahuluan</w:t>
       </w:r>
@@ -7241,7 +7843,7 @@
         </w:numPr>
         <w:ind w:left="426"/>
       </w:pPr>
-      <w:bookmarkStart w:id="19" w:name="_Toc234530580"/>
+      <w:bookmarkStart w:id="19" w:name="_Toc234532612"/>
       <w:r>
         <w:t>Mengenal Vite</w:t>
       </w:r>
@@ -7369,7 +7971,7 @@
         </w:numPr>
         <w:ind w:left="426"/>
       </w:pPr>
-      <w:bookmarkStart w:id="20" w:name="_Toc234530581"/>
+      <w:bookmarkStart w:id="20" w:name="_Toc234532613"/>
       <w:r>
         <w:t>Membuat Project</w:t>
       </w:r>
@@ -7701,7 +8303,7 @@
         </w:numPr>
         <w:ind w:left="426"/>
       </w:pPr>
-      <w:bookmarkStart w:id="21" w:name="_Toc234530582"/>
+      <w:bookmarkStart w:id="21" w:name="_Toc234532614"/>
       <w:r>
         <w:t>Struktur Folder Project</w:t>
       </w:r>
@@ -8006,7 +8608,7 @@
         </w:numPr>
         <w:ind w:left="426"/>
       </w:pPr>
-      <w:bookmarkStart w:id="22" w:name="_Toc234530583"/>
+      <w:bookmarkStart w:id="22" w:name="_Toc234532615"/>
       <w:r>
         <w:t>Mengenal File package.json</w:t>
       </w:r>
@@ -8252,7 +8854,7 @@
         </w:numPr>
         <w:ind w:left="426"/>
       </w:pPr>
-      <w:bookmarkStart w:id="23" w:name="_Toc234530584"/>
+      <w:bookmarkStart w:id="23" w:name="_Toc234532616"/>
       <w:r>
         <w:lastRenderedPageBreak/>
         <w:t>Perintah Dasar pnpm</w:t>
@@ -8521,7 +9123,7 @@
         </w:numPr>
         <w:ind w:left="426"/>
       </w:pPr>
-      <w:bookmarkStart w:id="24" w:name="_Toc234530585"/>
+      <w:bookmarkStart w:id="24" w:name="_Toc234532617"/>
       <w:r>
         <w:t>Ringkasan Bab</w:t>
       </w:r>
@@ -8558,21 +9160,18 @@
       <w:pPr>
         <w:pStyle w:val="Heading1"/>
       </w:pPr>
-      <w:bookmarkStart w:id="25" w:name="_Toc234530586"/>
+      <w:bookmarkStart w:id="25" w:name="_Toc234532618"/>
       <w:r>
         <w:lastRenderedPageBreak/>
-        <w:t>BAB 4</w:t>
+        <w:t xml:space="preserve">BAB 4 </w:t>
+      </w:r>
+      <w:r>
+        <w:br/>
+      </w:r>
+      <w:r>
+        <w:t>Dasar-dasar React dan Komponen</w:t>
       </w:r>
       <w:bookmarkEnd w:id="25"/>
-      <w:r>
-        <w:t xml:space="preserve"> </w:t>
-      </w:r>
-      <w:r>
-        <w:br/>
-      </w:r>
-      <w:r>
-        <w:t>Dasar-dasar React dan Komponen</w:t>
-      </w:r>
     </w:p>
     <w:p/>
     <w:p>
@@ -8584,17 +9183,24 @@
         </w:numPr>
         <w:ind w:left="426"/>
       </w:pPr>
+      <w:bookmarkStart w:id="26" w:name="_Toc234532619"/>
       <w:r>
         <w:t>Pendahuluan</w:t>
       </w:r>
-    </w:p>
-    <w:p>
+      <w:bookmarkEnd w:id="26"/>
+    </w:p>
+    <w:p>
+      <w:pPr>
+        <w:ind w:firstLine="426"/>
+      </w:pPr>
       <w:r>
         <w:t>Pada bab sebelumnya, peserta telah berhasil membuat project React menggunakan Vite serta menjalankan aplikasi pertama. Namun, tampilan yang muncul masih merupakan halaman bawaan dari Vite dan belum mencerminkan aplikasi yang akan dikembangkan.</w:t>
       </w:r>
     </w:p>
-    <w:p/>
-    <w:p>
+    <w:p>
+      <w:pPr>
+        <w:ind w:firstLine="426"/>
+      </w:pPr>
       <w:r>
         <w:t>Pada bab ini peserta akan mulai membangun aplikasi CareerHub menggunakan React. Materi yang dipelajari meliputi pengenalan React, konsep JSX, pembuatan Functional Component, serta cara menggunakan komponen di dalam aplikasi. Dengan memahami materi pada bab ini, peserta akan mampu membangun tampilan aplikasi yang tersusun dari beberapa komponen yang saling terhubung.</w:t>
       </w:r>
@@ -8609,9 +9215,109 @@
         </w:numPr>
         <w:ind w:left="426"/>
       </w:pPr>
+      <w:bookmarkStart w:id="27" w:name="_Toc234532620"/>
       <w:r>
         <w:t>Apa itu React?</w:t>
       </w:r>
+      <w:bookmarkEnd w:id="27"/>
+    </w:p>
+    <w:p>
+      <w:pPr>
+        <w:ind w:firstLine="426"/>
+      </w:pPr>
+      <w:r>
+        <w:t>React merupakan library JavaScript yang digunakan untuk membangun User Interface (UI) atau antarmuka pengguna.</w:t>
+      </w:r>
+    </w:p>
+    <w:p>
+      <w:pPr>
+        <w:ind w:firstLine="426"/>
+      </w:pPr>
+      <w:r>
+        <w:t>React dikembangkan oleh Meta (Facebook) dan menggunakan konsep Component-Based Architecture, yaitu sebuah aplikasi dibangun dari kumpulan komponen-komponen kecil yang dapat digunakan kembali (reusable).</w:t>
+      </w:r>
+    </w:p>
+    <w:p>
+      <w:pPr>
+        <w:ind w:firstLine="426"/>
+      </w:pPr>
+      <w:r>
+        <w:t>Sebagai contoh, sebuah website biasanya terdiri dari beberapa bagian seperti:</w:t>
+      </w:r>
+    </w:p>
+    <w:p>
+      <w:pPr>
+        <w:pStyle w:val="ListParagraph"/>
+        <w:numPr>
+          <w:ilvl w:val="0"/>
+          <w:numId w:val="18"/>
+        </w:numPr>
+      </w:pPr>
+      <w:r>
+        <w:t>Header</w:t>
+      </w:r>
+    </w:p>
+    <w:p>
+      <w:pPr>
+        <w:pStyle w:val="ListParagraph"/>
+        <w:numPr>
+          <w:ilvl w:val="0"/>
+          <w:numId w:val="18"/>
+        </w:numPr>
+      </w:pPr>
+      <w:r>
+        <w:t>Navigation Bar</w:t>
+      </w:r>
+    </w:p>
+    <w:p>
+      <w:pPr>
+        <w:pStyle w:val="ListParagraph"/>
+        <w:numPr>
+          <w:ilvl w:val="0"/>
+          <w:numId w:val="18"/>
+        </w:numPr>
+      </w:pPr>
+      <w:r>
+        <w:t>Hero Section</w:t>
+      </w:r>
+    </w:p>
+    <w:p>
+      <w:pPr>
+        <w:pStyle w:val="ListParagraph"/>
+        <w:numPr>
+          <w:ilvl w:val="0"/>
+          <w:numId w:val="18"/>
+        </w:numPr>
+      </w:pPr>
+      <w:r>
+        <w:t>Content</w:t>
+      </w:r>
+    </w:p>
+    <w:p>
+      <w:pPr>
+        <w:pStyle w:val="ListParagraph"/>
+        <w:numPr>
+          <w:ilvl w:val="0"/>
+          <w:numId w:val="18"/>
+        </w:numPr>
+      </w:pPr>
+      <w:r>
+        <w:t>Footer</w:t>
+      </w:r>
+    </w:p>
+    <w:p>
+      <w:pPr>
+        <w:ind w:firstLine="426"/>
+      </w:pPr>
+      <w:r>
+        <w:lastRenderedPageBreak/>
+        <w:t>Pada React, setiap bagian tersebut dapat dibuat menjadi komponen yang berdiri sendiri.</w:t>
+      </w:r>
+    </w:p>
+    <w:p>
+      <w:pPr>
+        <w:ind w:firstLine="426"/>
+      </w:pPr>
     </w:p>
     <w:p>
       <w:pPr>
@@ -8622,9 +9328,486 @@
         </w:numPr>
         <w:ind w:left="426"/>
       </w:pPr>
+      <w:bookmarkStart w:id="28" w:name="_Toc234532621"/>
       <w:r>
         <w:t>Mengenal JSX</w:t>
       </w:r>
+      <w:bookmarkEnd w:id="28"/>
+    </w:p>
+    <w:p>
+      <w:pPr>
+        <w:ind w:firstLine="426"/>
+      </w:pPr>
+      <w:r>
+        <w:t>JSX (JavaScript XML) merupakan sintaks yang memungkinkan kita menulis kode HTML di dalam JavaScript.</w:t>
+      </w:r>
+    </w:p>
+    <w:p>
+      <w:pPr>
+        <w:ind w:firstLine="426"/>
+      </w:pPr>
+      <w:r>
+        <w:t>Meskipun terlihat seperti HTML, JSX sebenarnya akan diubah menjadi kode JavaScript oleh React.</w:t>
+      </w:r>
+    </w:p>
+    <w:p>
+      <w:pPr>
+        <w:ind w:firstLine="426"/>
+      </w:pPr>
+      <w:r>
+        <w:t>Contoh JSX:</w:t>
+      </w:r>
+    </w:p>
+    <w:p>
+      <w:pPr>
+        <w:ind w:firstLine="426"/>
+      </w:pPr>
+      <w:r>
+        <w:t xml:space="preserve"> </w:t>
+      </w:r>
+      <w:r>
+        <w:drawing>
+          <wp:inline distT="0" distB="0" distL="0" distR="0" wp14:anchorId="1A65CA27" wp14:editId="4E090685">
+            <wp:extent cx="4077269" cy="1600423"/>
+            <wp:effectExtent l="0" t="0" r="0" b="0"/>
+            <wp:docPr id="387500264" name="Picture 1"/>
+            <wp:cNvGraphicFramePr>
+              <a:graphicFrameLocks xmlns:a="http://schemas.openxmlformats.org/drawingml/2006/main" noChangeAspect="1"/>
+            </wp:cNvGraphicFramePr>
+            <a:graphic xmlns:a="http://schemas.openxmlformats.org/drawingml/2006/main">
+              <a:graphicData uri="http://schemas.openxmlformats.org/drawingml/2006/picture">
+                <pic:pic xmlns:pic="http://schemas.openxmlformats.org/drawingml/2006/picture">
+                  <pic:nvPicPr>
+                    <pic:cNvPr id="387500264" name=""/>
+                    <pic:cNvPicPr/>
+                  </pic:nvPicPr>
+                  <pic:blipFill>
+                    <a:blip r:embed="rId72"/>
+                    <a:stretch>
+                      <a:fillRect/>
+                    </a:stretch>
+                  </pic:blipFill>
+                  <pic:spPr>
+                    <a:xfrm>
+                      <a:off x="0" y="0"/>
+                      <a:ext cx="4077269" cy="1600423"/>
+                    </a:xfrm>
+                    <a:prstGeom prst="rect">
+                      <a:avLst/>
+                    </a:prstGeom>
+                  </pic:spPr>
+                </pic:pic>
+              </a:graphicData>
+            </a:graphic>
+          </wp:inline>
+        </w:drawing>
+      </w:r>
+    </w:p>
+    <w:p>
+      <w:pPr>
+        <w:ind w:firstLine="426"/>
+      </w:pPr>
+      <w:r>
+        <w:t>Mengapa Menggunakan JSX?</w:t>
+      </w:r>
+    </w:p>
+    <w:p>
+      <w:pPr>
+        <w:pStyle w:val="ListParagraph"/>
+        <w:numPr>
+          <w:ilvl w:val="0"/>
+          <w:numId w:val="19"/>
+        </w:numPr>
+      </w:pPr>
+      <w:r>
+        <w:t>JSX memiliki beberapa kelebihan, di antaranya:</w:t>
+      </w:r>
+    </w:p>
+    <w:p>
+      <w:pPr>
+        <w:pStyle w:val="ListParagraph"/>
+        <w:numPr>
+          <w:ilvl w:val="0"/>
+          <w:numId w:val="19"/>
+        </w:numPr>
+      </w:pPr>
+      <w:r>
+        <w:t>Penulisan kode lebih mudah dibaca.</w:t>
+      </w:r>
+    </w:p>
+    <w:p>
+      <w:pPr>
+        <w:pStyle w:val="ListParagraph"/>
+        <w:numPr>
+          <w:ilvl w:val="0"/>
+          <w:numId w:val="19"/>
+        </w:numPr>
+      </w:pPr>
+      <w:r>
+        <w:t>Tampilan dan logika dapat ditulis dalam satu file.</w:t>
+      </w:r>
+    </w:p>
+    <w:p>
+      <w:pPr>
+        <w:pStyle w:val="ListParagraph"/>
+        <w:numPr>
+          <w:ilvl w:val="0"/>
+          <w:numId w:val="19"/>
+        </w:numPr>
+      </w:pPr>
+      <w:r>
+        <w:t>Mempermudah pembuatan komponen.</w:t>
+      </w:r>
+    </w:p>
+    <w:p>
+      <w:pPr>
+        <w:ind w:firstLine="426"/>
+      </w:pPr>
+      <w:r>
+        <w:t>Sebagai contoh:</w:t>
+      </w:r>
+    </w:p>
+    <w:p>
+      <w:pPr>
+        <w:ind w:firstLine="426"/>
+      </w:pPr>
+      <w:r>
+        <w:t>Tanpa JSX:</w:t>
+      </w:r>
+    </w:p>
+    <w:p>
+      <w:pPr>
+        <w:ind w:firstLine="426"/>
+      </w:pPr>
+      <w:r>
+        <w:drawing>
+          <wp:inline distT="0" distB="0" distL="0" distR="0" wp14:anchorId="38A31A03" wp14:editId="6429B796">
+            <wp:extent cx="4439270" cy="828791"/>
+            <wp:effectExtent l="0" t="0" r="0" b="9525"/>
+            <wp:docPr id="1362932059" name="Picture 1"/>
+            <wp:cNvGraphicFramePr>
+              <a:graphicFrameLocks xmlns:a="http://schemas.openxmlformats.org/drawingml/2006/main" noChangeAspect="1"/>
+            </wp:cNvGraphicFramePr>
+            <a:graphic xmlns:a="http://schemas.openxmlformats.org/drawingml/2006/main">
+              <a:graphicData uri="http://schemas.openxmlformats.org/drawingml/2006/picture">
+                <pic:pic xmlns:pic="http://schemas.openxmlformats.org/drawingml/2006/picture">
+                  <pic:nvPicPr>
+                    <pic:cNvPr id="1362932059" name=""/>
+                    <pic:cNvPicPr/>
+                  </pic:nvPicPr>
+                  <pic:blipFill>
+                    <a:blip r:embed="rId73"/>
+                    <a:stretch>
+                      <a:fillRect/>
+                    </a:stretch>
+                  </pic:blipFill>
+                  <pic:spPr>
+                    <a:xfrm>
+                      <a:off x="0" y="0"/>
+                      <a:ext cx="4439270" cy="828791"/>
+                    </a:xfrm>
+                    <a:prstGeom prst="rect">
+                      <a:avLst/>
+                    </a:prstGeom>
+                  </pic:spPr>
+                </pic:pic>
+              </a:graphicData>
+            </a:graphic>
+          </wp:inline>
+        </w:drawing>
+      </w:r>
+    </w:p>
+    <w:p>
+      <w:pPr>
+        <w:ind w:firstLine="426"/>
+      </w:pPr>
+    </w:p>
+    <w:p>
+      <w:pPr>
+        <w:ind w:firstLine="426"/>
+      </w:pPr>
+      <w:r>
+        <w:lastRenderedPageBreak/>
+        <w:t>Dengan JSX:</w:t>
+      </w:r>
+    </w:p>
+    <w:p>
+      <w:pPr>
+        <w:ind w:firstLine="426"/>
+      </w:pPr>
+      <w:r>
+        <w:drawing>
+          <wp:inline distT="0" distB="0" distL="0" distR="0" wp14:anchorId="431A2469" wp14:editId="5CF3B5F8">
+            <wp:extent cx="4448796" cy="828791"/>
+            <wp:effectExtent l="0" t="0" r="0" b="9525"/>
+            <wp:docPr id="2027496789" name="Picture 1"/>
+            <wp:cNvGraphicFramePr>
+              <a:graphicFrameLocks xmlns:a="http://schemas.openxmlformats.org/drawingml/2006/main" noChangeAspect="1"/>
+            </wp:cNvGraphicFramePr>
+            <a:graphic xmlns:a="http://schemas.openxmlformats.org/drawingml/2006/main">
+              <a:graphicData uri="http://schemas.openxmlformats.org/drawingml/2006/picture">
+                <pic:pic xmlns:pic="http://schemas.openxmlformats.org/drawingml/2006/picture">
+                  <pic:nvPicPr>
+                    <pic:cNvPr id="2027496789" name=""/>
+                    <pic:cNvPicPr/>
+                  </pic:nvPicPr>
+                  <pic:blipFill>
+                    <a:blip r:embed="rId74"/>
+                    <a:stretch>
+                      <a:fillRect/>
+                    </a:stretch>
+                  </pic:blipFill>
+                  <pic:spPr>
+                    <a:xfrm>
+                      <a:off x="0" y="0"/>
+                      <a:ext cx="4448796" cy="828791"/>
+                    </a:xfrm>
+                    <a:prstGeom prst="rect">
+                      <a:avLst/>
+                    </a:prstGeom>
+                  </pic:spPr>
+                </pic:pic>
+              </a:graphicData>
+            </a:graphic>
+          </wp:inline>
+        </w:drawing>
+      </w:r>
+    </w:p>
+    <w:p>
+      <w:pPr>
+        <w:ind w:firstLine="426"/>
+      </w:pPr>
+      <w:r>
+        <w:t>Tentunya penulisan menggunakan JSX lebih sederhana dan mudah dipahami.</w:t>
+      </w:r>
+    </w:p>
+    <w:p>
+      <w:pPr>
+        <w:ind w:firstLine="426"/>
+        <w:rPr>
+          <w:b/>
+          <w:bCs/>
+        </w:rPr>
+      </w:pPr>
+      <w:r>
+        <w:rPr>
+          <w:b/>
+          <w:bCs/>
+        </w:rPr>
+        <w:t>Aturan Penulisan JSX</w:t>
+      </w:r>
+    </w:p>
+    <w:p>
+      <w:pPr>
+        <w:ind w:firstLine="426"/>
+      </w:pPr>
+      <w:r>
+        <w:t>Dalam menggunakan JSX terdapat beberapa aturan yang perlu diperhatikan.</w:t>
+      </w:r>
+    </w:p>
+    <w:p>
+      <w:pPr>
+        <w:pStyle w:val="ListParagraph"/>
+        <w:numPr>
+          <w:ilvl w:val="0"/>
+          <w:numId w:val="20"/>
+        </w:numPr>
+      </w:pPr>
+      <w:r>
+        <w:t>Hanya memiliki satu elemen utama</w:t>
+      </w:r>
+    </w:p>
+    <w:p>
+      <w:pPr>
+        <w:pStyle w:val="ListParagraph"/>
+        <w:ind w:left="1146"/>
+      </w:pPr>
+      <w:r>
+        <w:t>Benar:</w:t>
+      </w:r>
+    </w:p>
+    <w:p>
+      <w:pPr>
+        <w:pStyle w:val="ListParagraph"/>
+        <w:ind w:left="1146"/>
+      </w:pPr>
+      <w:r>
+        <w:drawing>
+          <wp:inline distT="0" distB="0" distL="0" distR="0" wp14:anchorId="3A6B49E3" wp14:editId="40FE590A">
+            <wp:extent cx="4410691" cy="1743318"/>
+            <wp:effectExtent l="0" t="0" r="9525" b="9525"/>
+            <wp:docPr id="1725348620" name="Picture 1"/>
+            <wp:cNvGraphicFramePr>
+              <a:graphicFrameLocks xmlns:a="http://schemas.openxmlformats.org/drawingml/2006/main" noChangeAspect="1"/>
+            </wp:cNvGraphicFramePr>
+            <a:graphic xmlns:a="http://schemas.openxmlformats.org/drawingml/2006/main">
+              <a:graphicData uri="http://schemas.openxmlformats.org/drawingml/2006/picture">
+                <pic:pic xmlns:pic="http://schemas.openxmlformats.org/drawingml/2006/picture">
+                  <pic:nvPicPr>
+                    <pic:cNvPr id="1725348620" name=""/>
+                    <pic:cNvPicPr/>
+                  </pic:nvPicPr>
+                  <pic:blipFill>
+                    <a:blip r:embed="rId75"/>
+                    <a:stretch>
+                      <a:fillRect/>
+                    </a:stretch>
+                  </pic:blipFill>
+                  <pic:spPr>
+                    <a:xfrm>
+                      <a:off x="0" y="0"/>
+                      <a:ext cx="4410691" cy="1743318"/>
+                    </a:xfrm>
+                    <a:prstGeom prst="rect">
+                      <a:avLst/>
+                    </a:prstGeom>
+                  </pic:spPr>
+                </pic:pic>
+              </a:graphicData>
+            </a:graphic>
+          </wp:inline>
+        </w:drawing>
+      </w:r>
+    </w:p>
+    <w:p>
+      <w:pPr>
+        <w:pStyle w:val="ListParagraph"/>
+        <w:ind w:left="1146"/>
+      </w:pPr>
+      <w:r>
+        <w:t>Salah:</w:t>
+      </w:r>
+    </w:p>
+    <w:p>
+      <w:pPr>
+        <w:pStyle w:val="ListParagraph"/>
+        <w:ind w:left="1146"/>
+      </w:pPr>
+      <w:r>
+        <w:drawing>
+          <wp:inline distT="0" distB="0" distL="0" distR="0" wp14:anchorId="38728341" wp14:editId="1C2238F2">
+            <wp:extent cx="4420217" cy="1457528"/>
+            <wp:effectExtent l="0" t="0" r="0" b="9525"/>
+            <wp:docPr id="394483818" name="Picture 1"/>
+            <wp:cNvGraphicFramePr>
+              <a:graphicFrameLocks xmlns:a="http://schemas.openxmlformats.org/drawingml/2006/main" noChangeAspect="1"/>
+            </wp:cNvGraphicFramePr>
+            <a:graphic xmlns:a="http://schemas.openxmlformats.org/drawingml/2006/main">
+              <a:graphicData uri="http://schemas.openxmlformats.org/drawingml/2006/picture">
+                <pic:pic xmlns:pic="http://schemas.openxmlformats.org/drawingml/2006/picture">
+                  <pic:nvPicPr>
+                    <pic:cNvPr id="394483818" name=""/>
+                    <pic:cNvPicPr/>
+                  </pic:nvPicPr>
+                  <pic:blipFill>
+                    <a:blip r:embed="rId76"/>
+                    <a:stretch>
+                      <a:fillRect/>
+                    </a:stretch>
+                  </pic:blipFill>
+                  <pic:spPr>
+                    <a:xfrm>
+                      <a:off x="0" y="0"/>
+                      <a:ext cx="4420217" cy="1457528"/>
+                    </a:xfrm>
+                    <a:prstGeom prst="rect">
+                      <a:avLst/>
+                    </a:prstGeom>
+                  </pic:spPr>
+                </pic:pic>
+              </a:graphicData>
+            </a:graphic>
+          </wp:inline>
+        </w:drawing>
+      </w:r>
+    </w:p>
+    <w:p>
+      <w:pPr>
+        <w:pStyle w:val="ListParagraph"/>
+        <w:numPr>
+          <w:ilvl w:val="0"/>
+          <w:numId w:val="20"/>
+        </w:numPr>
+      </w:pPr>
+      <w:r>
+        <w:t>Gunakan className</w:t>
+      </w:r>
+    </w:p>
+    <w:p>
+      <w:pPr>
+        <w:pStyle w:val="ListParagraph"/>
+        <w:ind w:left="1146"/>
+      </w:pPr>
+      <w:r>
+        <w:t>Karena class merupakan keyword JavaScript, maka React menggunakan className.</w:t>
+      </w:r>
+    </w:p>
+    <w:p>
+      <w:pPr>
+        <w:pStyle w:val="ListParagraph"/>
+        <w:ind w:left="1146"/>
+      </w:pPr>
+      <w:r>
+        <w:lastRenderedPageBreak/>
+        <w:drawing>
+          <wp:inline distT="0" distB="0" distL="0" distR="0" wp14:anchorId="13035784" wp14:editId="02411097">
+            <wp:extent cx="4391638" cy="1228896"/>
+            <wp:effectExtent l="0" t="0" r="9525" b="0"/>
+            <wp:docPr id="928470903" name="Picture 1"/>
+            <wp:cNvGraphicFramePr>
+              <a:graphicFrameLocks xmlns:a="http://schemas.openxmlformats.org/drawingml/2006/main" noChangeAspect="1"/>
+            </wp:cNvGraphicFramePr>
+            <a:graphic xmlns:a="http://schemas.openxmlformats.org/drawingml/2006/main">
+              <a:graphicData uri="http://schemas.openxmlformats.org/drawingml/2006/picture">
+                <pic:pic xmlns:pic="http://schemas.openxmlformats.org/drawingml/2006/picture">
+                  <pic:nvPicPr>
+                    <pic:cNvPr id="928470903" name=""/>
+                    <pic:cNvPicPr/>
+                  </pic:nvPicPr>
+                  <pic:blipFill>
+                    <a:blip r:embed="rId77"/>
+                    <a:stretch>
+                      <a:fillRect/>
+                    </a:stretch>
+                  </pic:blipFill>
+                  <pic:spPr>
+                    <a:xfrm>
+                      <a:off x="0" y="0"/>
+                      <a:ext cx="4391638" cy="1228896"/>
+                    </a:xfrm>
+                    <a:prstGeom prst="rect">
+                      <a:avLst/>
+                    </a:prstGeom>
+                  </pic:spPr>
+                </pic:pic>
+              </a:graphicData>
+            </a:graphic>
+          </wp:inline>
+        </w:drawing>
+      </w:r>
+    </w:p>
+    <w:p>
+      <w:pPr>
+        <w:pStyle w:val="ListParagraph"/>
+        <w:ind w:left="1146"/>
+      </w:pPr>
+    </w:p>
+    <w:p>
+      <w:pPr>
+        <w:pStyle w:val="ListParagraph"/>
+        <w:numPr>
+          <w:ilvl w:val="0"/>
+          <w:numId w:val="20"/>
+        </w:numPr>
+      </w:pPr>
+      <w:r>
+        <w:t>Gunakan Kurung Kurawal {}</w:t>
+      </w:r>
+    </w:p>
+    <w:p>
+      <w:pPr>
+        <w:ind w:left="786"/>
+      </w:pPr>
     </w:p>
     <w:p>
       <w:pPr>
@@ -8635,9 +9818,11 @@
         </w:numPr>
         <w:ind w:left="426"/>
       </w:pPr>
+      <w:bookmarkStart w:id="29" w:name="_Toc234532622"/>
       <w:r>
         <w:t>Mengenal Komponen</w:t>
       </w:r>
+      <w:bookmarkEnd w:id="29"/>
     </w:p>
     <w:p>
       <w:pPr>
@@ -8648,9 +9833,11 @@
         </w:numPr>
         <w:ind w:left="426"/>
       </w:pPr>
+      <w:bookmarkStart w:id="30" w:name="_Toc234532623"/>
       <w:r>
         <w:t>Membuat Komponen Pertama</w:t>
       </w:r>
+      <w:bookmarkEnd w:id="30"/>
     </w:p>
     <w:p>
       <w:pPr>
@@ -8661,9 +9848,11 @@
         </w:numPr>
         <w:ind w:left="426"/>
       </w:pPr>
+      <w:bookmarkStart w:id="31" w:name="_Toc234532624"/>
       <w:r>
         <w:t>Menggunakan Komponen</w:t>
       </w:r>
+      <w:bookmarkEnd w:id="31"/>
     </w:p>
     <w:p>
       <w:pPr>
@@ -8674,13 +9863,15 @@
         </w:numPr>
         <w:ind w:left="426"/>
       </w:pPr>
+      <w:bookmarkStart w:id="32" w:name="_Toc234532625"/>
       <w:r>
         <w:t>Ringkasan Bab</w:t>
       </w:r>
+      <w:bookmarkEnd w:id="32"/>
     </w:p>
     <w:sectPr>
-      <w:headerReference w:type="default" r:id="rId72"/>
-      <w:footerReference w:type="default" r:id="rId73"/>
+      <w:headerReference w:type="default" r:id="rId78"/>
+      <w:footerReference w:type="default" r:id="rId79"/>
       <w:pgSz w:w="11906" w:h="16838"/>
       <w:pgMar w:top="1440" w:right="1440" w:bottom="1440" w:left="1440" w:header="708" w:footer="708" w:gutter="0"/>
       <w:pgNumType w:start="1"/>
@@ -9680,6 +10871,119 @@
     </w:lvl>
   </w:abstractNum>
   <w:abstractNum w:abstractNumId="7" w15:restartNumberingAfterBreak="0">
+    <w:nsid w:val="254623FE"/>
+    <w:multiLevelType w:val="hybridMultilevel"/>
+    <w:tmpl w:val="15443EF8"/>
+    <w:lvl w:ilvl="0" w:tplc="38090001">
+      <w:start w:val="1"/>
+      <w:numFmt w:val="bullet"/>
+      <w:lvlText w:val=""/>
+      <w:lvlJc w:val="left"/>
+      <w:pPr>
+        <w:ind w:left="1146" w:hanging="360"/>
+      </w:pPr>
+      <w:rPr>
+        <w:rFonts w:ascii="Symbol" w:hAnsi="Symbol" w:hint="default"/>
+      </w:rPr>
+    </w:lvl>
+    <w:lvl w:ilvl="1" w:tplc="38090003" w:tentative="1">
+      <w:start w:val="1"/>
+      <w:numFmt w:val="bullet"/>
+      <w:lvlText w:val="o"/>
+      <w:lvlJc w:val="left"/>
+      <w:pPr>
+        <w:ind w:left="1866" w:hanging="360"/>
+      </w:pPr>
+      <w:rPr>
+        <w:rFonts w:ascii="Courier New" w:hAnsi="Courier New" w:cs="Courier New" w:hint="default"/>
+      </w:rPr>
+    </w:lvl>
+    <w:lvl w:ilvl="2" w:tplc="38090005" w:tentative="1">
+      <w:start w:val="1"/>
+      <w:numFmt w:val="bullet"/>
+      <w:lvlText w:val=""/>
+      <w:lvlJc w:val="left"/>
+      <w:pPr>
+        <w:ind w:left="2586" w:hanging="360"/>
+      </w:pPr>
+      <w:rPr>
+        <w:rFonts w:ascii="Wingdings" w:hAnsi="Wingdings" w:hint="default"/>
+      </w:rPr>
+    </w:lvl>
+    <w:lvl w:ilvl="3" w:tplc="38090001" w:tentative="1">
+      <w:start w:val="1"/>
+      <w:numFmt w:val="bullet"/>
+      <w:lvlText w:val=""/>
+      <w:lvlJc w:val="left"/>
+      <w:pPr>
+        <w:ind w:left="3306" w:hanging="360"/>
+      </w:pPr>
+      <w:rPr>
+        <w:rFonts w:ascii="Symbol" w:hAnsi="Symbol" w:hint="default"/>
+      </w:rPr>
+    </w:lvl>
+    <w:lvl w:ilvl="4" w:tplc="38090003" w:tentative="1">
+      <w:start w:val="1"/>
+      <w:numFmt w:val="bullet"/>
+      <w:lvlText w:val="o"/>
+      <w:lvlJc w:val="left"/>
+      <w:pPr>
+        <w:ind w:left="4026" w:hanging="360"/>
+      </w:pPr>
+      <w:rPr>
+        <w:rFonts w:ascii="Courier New" w:hAnsi="Courier New" w:cs="Courier New" w:hint="default"/>
+      </w:rPr>
+    </w:lvl>
+    <w:lvl w:ilvl="5" w:tplc="38090005" w:tentative="1">
+      <w:start w:val="1"/>
+      <w:numFmt w:val="bullet"/>
+      <w:lvlText w:val=""/>
+      <w:lvlJc w:val="left"/>
+      <w:pPr>
+        <w:ind w:left="4746" w:hanging="360"/>
+      </w:pPr>
+      <w:rPr>
+        <w:rFonts w:ascii="Wingdings" w:hAnsi="Wingdings" w:hint="default"/>
+      </w:rPr>
+    </w:lvl>
+    <w:lvl w:ilvl="6" w:tplc="38090001" w:tentative="1">
+      <w:start w:val="1"/>
+      <w:numFmt w:val="bullet"/>
+      <w:lvlText w:val=""/>
+      <w:lvlJc w:val="left"/>
+      <w:pPr>
+        <w:ind w:left="5466" w:hanging="360"/>
+      </w:pPr>
+      <w:rPr>
+        <w:rFonts w:ascii="Symbol" w:hAnsi="Symbol" w:hint="default"/>
+      </w:rPr>
+    </w:lvl>
+    <w:lvl w:ilvl="7" w:tplc="38090003" w:tentative="1">
+      <w:start w:val="1"/>
+      <w:numFmt w:val="bullet"/>
+      <w:lvlText w:val="o"/>
+      <w:lvlJc w:val="left"/>
+      <w:pPr>
+        <w:ind w:left="6186" w:hanging="360"/>
+      </w:pPr>
+      <w:rPr>
+        <w:rFonts w:ascii="Courier New" w:hAnsi="Courier New" w:cs="Courier New" w:hint="default"/>
+      </w:rPr>
+    </w:lvl>
+    <w:lvl w:ilvl="8" w:tplc="38090005" w:tentative="1">
+      <w:start w:val="1"/>
+      <w:numFmt w:val="bullet"/>
+      <w:lvlText w:val=""/>
+      <w:lvlJc w:val="left"/>
+      <w:pPr>
+        <w:ind w:left="6906" w:hanging="360"/>
+      </w:pPr>
+      <w:rPr>
+        <w:rFonts w:ascii="Wingdings" w:hAnsi="Wingdings" w:hint="default"/>
+      </w:rPr>
+    </w:lvl>
+  </w:abstractNum>
+  <w:abstractNum w:abstractNumId="8" w15:restartNumberingAfterBreak="0">
     <w:nsid w:val="2D0C5139"/>
     <w:multiLevelType w:val="hybridMultilevel"/>
     <w:tmpl w:val="D32A7A6E"/>
@@ -9765,7 +11069,7 @@
       </w:pPr>
     </w:lvl>
   </w:abstractNum>
-  <w:abstractNum w:abstractNumId="8" w15:restartNumberingAfterBreak="0">
+  <w:abstractNum w:abstractNumId="9" w15:restartNumberingAfterBreak="0">
     <w:nsid w:val="348B03D3"/>
     <w:multiLevelType w:val="hybridMultilevel"/>
     <w:tmpl w:val="BAFA88AE"/>
@@ -9878,7 +11182,93 @@
       </w:rPr>
     </w:lvl>
   </w:abstractNum>
-  <w:abstractNum w:abstractNumId="9" w15:restartNumberingAfterBreak="0">
+  <w:abstractNum w:abstractNumId="10" w15:restartNumberingAfterBreak="0">
+    <w:nsid w:val="3AD41797"/>
+    <w:multiLevelType w:val="hybridMultilevel"/>
+    <w:tmpl w:val="7B68EA98"/>
+    <w:lvl w:ilvl="0" w:tplc="3809000F">
+      <w:start w:val="1"/>
+      <w:numFmt w:val="decimal"/>
+      <w:lvlText w:val="%1."/>
+      <w:lvlJc w:val="left"/>
+      <w:pPr>
+        <w:ind w:left="1146" w:hanging="360"/>
+      </w:pPr>
+    </w:lvl>
+    <w:lvl w:ilvl="1" w:tplc="38090019" w:tentative="1">
+      <w:start w:val="1"/>
+      <w:numFmt w:val="lowerLetter"/>
+      <w:lvlText w:val="%2."/>
+      <w:lvlJc w:val="left"/>
+      <w:pPr>
+        <w:ind w:left="1866" w:hanging="360"/>
+      </w:pPr>
+    </w:lvl>
+    <w:lvl w:ilvl="2" w:tplc="3809001B" w:tentative="1">
+      <w:start w:val="1"/>
+      <w:numFmt w:val="lowerRoman"/>
+      <w:lvlText w:val="%3."/>
+      <w:lvlJc w:val="right"/>
+      <w:pPr>
+        <w:ind w:left="2586" w:hanging="180"/>
+      </w:pPr>
+    </w:lvl>
+    <w:lvl w:ilvl="3" w:tplc="3809000F" w:tentative="1">
+      <w:start w:val="1"/>
+      <w:numFmt w:val="decimal"/>
+      <w:lvlText w:val="%4."/>
+      <w:lvlJc w:val="left"/>
+      <w:pPr>
+        <w:ind w:left="3306" w:hanging="360"/>
+      </w:pPr>
+    </w:lvl>
+    <w:lvl w:ilvl="4" w:tplc="38090019" w:tentative="1">
+      <w:start w:val="1"/>
+      <w:numFmt w:val="lowerLetter"/>
+      <w:lvlText w:val="%5."/>
+      <w:lvlJc w:val="left"/>
+      <w:pPr>
+        <w:ind w:left="4026" w:hanging="360"/>
+      </w:pPr>
+    </w:lvl>
+    <w:lvl w:ilvl="5" w:tplc="3809001B" w:tentative="1">
+      <w:start w:val="1"/>
+      <w:numFmt w:val="lowerRoman"/>
+      <w:lvlText w:val="%6."/>
+      <w:lvlJc w:val="right"/>
+      <w:pPr>
+        <w:ind w:left="4746" w:hanging="180"/>
+      </w:pPr>
+    </w:lvl>
+    <w:lvl w:ilvl="6" w:tplc="3809000F" w:tentative="1">
+      <w:start w:val="1"/>
+      <w:numFmt w:val="decimal"/>
+      <w:lvlText w:val="%7."/>
+      <w:lvlJc w:val="left"/>
+      <w:pPr>
+        <w:ind w:left="5466" w:hanging="360"/>
+      </w:pPr>
+    </w:lvl>
+    <w:lvl w:ilvl="7" w:tplc="38090019" w:tentative="1">
+      <w:start w:val="1"/>
+      <w:numFmt w:val="lowerLetter"/>
+      <w:lvlText w:val="%8."/>
+      <w:lvlJc w:val="left"/>
+      <w:pPr>
+        <w:ind w:left="6186" w:hanging="360"/>
+      </w:pPr>
+    </w:lvl>
+    <w:lvl w:ilvl="8" w:tplc="3809001B" w:tentative="1">
+      <w:start w:val="1"/>
+      <w:numFmt w:val="lowerRoman"/>
+      <w:lvlText w:val="%9."/>
+      <w:lvlJc w:val="right"/>
+      <w:pPr>
+        <w:ind w:left="6906" w:hanging="180"/>
+      </w:pPr>
+    </w:lvl>
+  </w:abstractNum>
+  <w:abstractNum w:abstractNumId="11" w15:restartNumberingAfterBreak="0">
     <w:nsid w:val="3E8D75DB"/>
     <w:multiLevelType w:val="multilevel"/>
     <w:tmpl w:val="9934D454"/>
@@ -9991,7 +11381,7 @@
       </w:rPr>
     </w:lvl>
   </w:abstractNum>
-  <w:abstractNum w:abstractNumId="10" w15:restartNumberingAfterBreak="0">
+  <w:abstractNum w:abstractNumId="12" w15:restartNumberingAfterBreak="0">
     <w:nsid w:val="3F210C07"/>
     <w:multiLevelType w:val="multilevel"/>
     <w:tmpl w:val="4F4227DE"/>
@@ -10083,7 +11473,7 @@
       </w:pPr>
     </w:lvl>
   </w:abstractNum>
-  <w:abstractNum w:abstractNumId="11" w15:restartNumberingAfterBreak="0">
+  <w:abstractNum w:abstractNumId="13" w15:restartNumberingAfterBreak="0">
     <w:nsid w:val="4646393A"/>
     <w:multiLevelType w:val="multilevel"/>
     <w:tmpl w:val="BD224AE8"/>
@@ -10193,7 +11583,7 @@
       </w:rPr>
     </w:lvl>
   </w:abstractNum>
-  <w:abstractNum w:abstractNumId="12" w15:restartNumberingAfterBreak="0">
+  <w:abstractNum w:abstractNumId="14" w15:restartNumberingAfterBreak="0">
     <w:nsid w:val="4EA139ED"/>
     <w:multiLevelType w:val="multilevel"/>
     <w:tmpl w:val="929021E8"/>
@@ -10306,7 +11696,120 @@
       </w:rPr>
     </w:lvl>
   </w:abstractNum>
-  <w:abstractNum w:abstractNumId="13" w15:restartNumberingAfterBreak="0">
+  <w:abstractNum w:abstractNumId="15" w15:restartNumberingAfterBreak="0">
+    <w:nsid w:val="539D7DA0"/>
+    <w:multiLevelType w:val="hybridMultilevel"/>
+    <w:tmpl w:val="781A1894"/>
+    <w:lvl w:ilvl="0" w:tplc="38090001">
+      <w:start w:val="1"/>
+      <w:numFmt w:val="bullet"/>
+      <w:lvlText w:val=""/>
+      <w:lvlJc w:val="left"/>
+      <w:pPr>
+        <w:ind w:left="1146" w:hanging="360"/>
+      </w:pPr>
+      <w:rPr>
+        <w:rFonts w:ascii="Symbol" w:hAnsi="Symbol" w:hint="default"/>
+      </w:rPr>
+    </w:lvl>
+    <w:lvl w:ilvl="1" w:tplc="38090003" w:tentative="1">
+      <w:start w:val="1"/>
+      <w:numFmt w:val="bullet"/>
+      <w:lvlText w:val="o"/>
+      <w:lvlJc w:val="left"/>
+      <w:pPr>
+        <w:ind w:left="1866" w:hanging="360"/>
+      </w:pPr>
+      <w:rPr>
+        <w:rFonts w:ascii="Courier New" w:hAnsi="Courier New" w:cs="Courier New" w:hint="default"/>
+      </w:rPr>
+    </w:lvl>
+    <w:lvl w:ilvl="2" w:tplc="38090005" w:tentative="1">
+      <w:start w:val="1"/>
+      <w:numFmt w:val="bullet"/>
+      <w:lvlText w:val=""/>
+      <w:lvlJc w:val="left"/>
+      <w:pPr>
+        <w:ind w:left="2586" w:hanging="360"/>
+      </w:pPr>
+      <w:rPr>
+        <w:rFonts w:ascii="Wingdings" w:hAnsi="Wingdings" w:hint="default"/>
+      </w:rPr>
+    </w:lvl>
+    <w:lvl w:ilvl="3" w:tplc="38090001" w:tentative="1">
+      <w:start w:val="1"/>
+      <w:numFmt w:val="bullet"/>
+      <w:lvlText w:val=""/>
+      <w:lvlJc w:val="left"/>
+      <w:pPr>
+        <w:ind w:left="3306" w:hanging="360"/>
+      </w:pPr>
+      <w:rPr>
+        <w:rFonts w:ascii="Symbol" w:hAnsi="Symbol" w:hint="default"/>
+      </w:rPr>
+    </w:lvl>
+    <w:lvl w:ilvl="4" w:tplc="38090003" w:tentative="1">
+      <w:start w:val="1"/>
+      <w:numFmt w:val="bullet"/>
+      <w:lvlText w:val="o"/>
+      <w:lvlJc w:val="left"/>
+      <w:pPr>
+        <w:ind w:left="4026" w:hanging="360"/>
+      </w:pPr>
+      <w:rPr>
+        <w:rFonts w:ascii="Courier New" w:hAnsi="Courier New" w:cs="Courier New" w:hint="default"/>
+      </w:rPr>
+    </w:lvl>
+    <w:lvl w:ilvl="5" w:tplc="38090005" w:tentative="1">
+      <w:start w:val="1"/>
+      <w:numFmt w:val="bullet"/>
+      <w:lvlText w:val=""/>
+      <w:lvlJc w:val="left"/>
+      <w:pPr>
+        <w:ind w:left="4746" w:hanging="360"/>
+      </w:pPr>
+      <w:rPr>
+        <w:rFonts w:ascii="Wingdings" w:hAnsi="Wingdings" w:hint="default"/>
+      </w:rPr>
+    </w:lvl>
+    <w:lvl w:ilvl="6" w:tplc="38090001" w:tentative="1">
+      <w:start w:val="1"/>
+      <w:numFmt w:val="bullet"/>
+      <w:lvlText w:val=""/>
+      <w:lvlJc w:val="left"/>
+      <w:pPr>
+        <w:ind w:left="5466" w:hanging="360"/>
+      </w:pPr>
+      <w:rPr>
+        <w:rFonts w:ascii="Symbol" w:hAnsi="Symbol" w:hint="default"/>
+      </w:rPr>
+    </w:lvl>
+    <w:lvl w:ilvl="7" w:tplc="38090003" w:tentative="1">
+      <w:start w:val="1"/>
+      <w:numFmt w:val="bullet"/>
+      <w:lvlText w:val="o"/>
+      <w:lvlJc w:val="left"/>
+      <w:pPr>
+        <w:ind w:left="6186" w:hanging="360"/>
+      </w:pPr>
+      <w:rPr>
+        <w:rFonts w:ascii="Courier New" w:hAnsi="Courier New" w:cs="Courier New" w:hint="default"/>
+      </w:rPr>
+    </w:lvl>
+    <w:lvl w:ilvl="8" w:tplc="38090005" w:tentative="1">
+      <w:start w:val="1"/>
+      <w:numFmt w:val="bullet"/>
+      <w:lvlText w:val=""/>
+      <w:lvlJc w:val="left"/>
+      <w:pPr>
+        <w:ind w:left="6906" w:hanging="360"/>
+      </w:pPr>
+      <w:rPr>
+        <w:rFonts w:ascii="Wingdings" w:hAnsi="Wingdings" w:hint="default"/>
+      </w:rPr>
+    </w:lvl>
+  </w:abstractNum>
+  <w:abstractNum w:abstractNumId="16" w15:restartNumberingAfterBreak="0">
     <w:nsid w:val="58212346"/>
     <w:multiLevelType w:val="hybridMultilevel"/>
     <w:tmpl w:val="CC4ADD28"/>
@@ -10419,7 +11922,7 @@
       </w:rPr>
     </w:lvl>
   </w:abstractNum>
-  <w:abstractNum w:abstractNumId="14" w15:restartNumberingAfterBreak="0">
+  <w:abstractNum w:abstractNumId="17" w15:restartNumberingAfterBreak="0">
     <w:nsid w:val="64EE4379"/>
     <w:multiLevelType w:val="multilevel"/>
     <w:tmpl w:val="33887266"/>
@@ -10508,7 +12011,7 @@
       </w:pPr>
     </w:lvl>
   </w:abstractNum>
-  <w:abstractNum w:abstractNumId="15" w15:restartNumberingAfterBreak="0">
+  <w:abstractNum w:abstractNumId="18" w15:restartNumberingAfterBreak="0">
     <w:nsid w:val="7042763D"/>
     <w:multiLevelType w:val="hybridMultilevel"/>
     <w:tmpl w:val="A8FA09CA"/>
@@ -10621,7 +12124,7 @@
       </w:rPr>
     </w:lvl>
   </w:abstractNum>
-  <w:abstractNum w:abstractNumId="16" w15:restartNumberingAfterBreak="0">
+  <w:abstractNum w:abstractNumId="19" w15:restartNumberingAfterBreak="0">
     <w:nsid w:val="79E649FA"/>
     <w:multiLevelType w:val="hybridMultilevel"/>
     <w:tmpl w:val="5D54BE58"/>
@@ -10738,22 +12241,22 @@
     <w:abstractNumId w:val="3"/>
   </w:num>
   <w:num w:numId="2" w16cid:durableId="1748069314">
-    <w:abstractNumId w:val="7"/>
+    <w:abstractNumId w:val="8"/>
   </w:num>
   <w:num w:numId="3" w16cid:durableId="1296787817">
-    <w:abstractNumId w:val="8"/>
+    <w:abstractNumId w:val="9"/>
   </w:num>
   <w:num w:numId="4" w16cid:durableId="1198738994">
-    <w:abstractNumId w:val="14"/>
+    <w:abstractNumId w:val="17"/>
   </w:num>
   <w:num w:numId="5" w16cid:durableId="845945470">
     <w:abstractNumId w:val="1"/>
   </w:num>
   <w:num w:numId="6" w16cid:durableId="665524019">
-    <w:abstractNumId w:val="10"/>
+    <w:abstractNumId w:val="12"/>
   </w:num>
   <w:num w:numId="7" w16cid:durableId="668020486">
-    <w:abstractNumId w:val="9"/>
+    <w:abstractNumId w:val="11"/>
   </w:num>
   <w:num w:numId="8" w16cid:durableId="1199975083">
     <w:abstractNumId w:val="4"/>
@@ -10762,16 +12265,16 @@
     <w:abstractNumId w:val="5"/>
   </w:num>
   <w:num w:numId="10" w16cid:durableId="497960826">
-    <w:abstractNumId w:val="11"/>
+    <w:abstractNumId w:val="13"/>
   </w:num>
   <w:num w:numId="11" w16cid:durableId="326983446">
     <w:abstractNumId w:val="2"/>
   </w:num>
   <w:num w:numId="12" w16cid:durableId="1706904810">
-    <w:abstractNumId w:val="15"/>
+    <w:abstractNumId w:val="18"/>
   </w:num>
   <w:num w:numId="13" w16cid:durableId="452290699">
-    <w:abstractNumId w:val="16"/>
+    <w:abstractNumId w:val="19"/>
   </w:num>
   <w:num w:numId="14" w16cid:durableId="1452167094">
     <w:abstractNumId w:val="0"/>
@@ -10780,10 +12283,19 @@
     <w:abstractNumId w:val="6"/>
   </w:num>
   <w:num w:numId="16" w16cid:durableId="1899515761">
-    <w:abstractNumId w:val="13"/>
+    <w:abstractNumId w:val="16"/>
   </w:num>
   <w:num w:numId="17" w16cid:durableId="405762801">
-    <w:abstractNumId w:val="12"/>
+    <w:abstractNumId w:val="14"/>
+  </w:num>
+  <w:num w:numId="18" w16cid:durableId="1047142656">
+    <w:abstractNumId w:val="7"/>
+  </w:num>
+  <w:num w:numId="19" w16cid:durableId="156654783">
+    <w:abstractNumId w:val="15"/>
+  </w:num>
+  <w:num w:numId="20" w16cid:durableId="160509088">
+    <w:abstractNumId w:val="10"/>
   </w:num>
 </w:numbering>
 </file>

</xml_diff>

<commit_message>
upload module pelatihan react v2.0
</commit_message>
<xml_diff>
--- a/dokumen/Modul Pelatihan React v2.0.docx
+++ b/dokumen/Modul Pelatihan React v2.0.docx
@@ -85,7 +85,7 @@
       <w:pPr>
         <w:pStyle w:val="Heading1"/>
       </w:pPr>
-      <w:bookmarkStart w:id="0" w:name="_Toc234532593"/>
+      <w:bookmarkStart w:id="0" w:name="_Toc234654639"/>
       <w:r>
         <w:lastRenderedPageBreak/>
         <w:t>KATA PENGANTAR</w:t>
@@ -235,7 +235,7 @@
       <w:pPr>
         <w:pStyle w:val="Heading1"/>
       </w:pPr>
-      <w:bookmarkStart w:id="1" w:name="_Toc234532594"/>
+      <w:bookmarkStart w:id="1" w:name="_Toc234654640"/>
       <w:r>
         <w:lastRenderedPageBreak/>
         <w:t>DAFTAR ISI</w:t>
@@ -291,7 +291,7 @@
           <w:r>
             <w:fldChar w:fldCharType="separate"/>
           </w:r>
-          <w:hyperlink w:anchor="_Toc234532593" w:history="1">
+          <w:hyperlink w:anchor="_Toc234654639" w:history="1">
             <w:r>
               <w:rPr>
                 <w:rStyle w:val="Hyperlink"/>
@@ -314,7 +314,7 @@
               <w:rPr>
                 <w:webHidden/>
               </w:rPr>
-              <w:instrText xml:space="preserve"> PAGEREF _Toc234532593 \h </w:instrText>
+              <w:instrText xml:space="preserve"> PAGEREF _Toc234654639 \h </w:instrText>
             </w:r>
             <w:r>
               <w:rPr>
@@ -351,7 +351,7 @@
               <w:lang w:eastAsia="en-ID"/>
             </w:rPr>
           </w:pPr>
-          <w:hyperlink w:anchor="_Toc234532594" w:history="1">
+          <w:hyperlink w:anchor="_Toc234654640" w:history="1">
             <w:r>
               <w:rPr>
                 <w:rStyle w:val="Hyperlink"/>
@@ -374,7 +374,7 @@
               <w:rPr>
                 <w:webHidden/>
               </w:rPr>
-              <w:instrText xml:space="preserve"> PAGEREF _Toc234532594 \h </w:instrText>
+              <w:instrText xml:space="preserve"> PAGEREF _Toc234654640 \h </w:instrText>
             </w:r>
             <w:r>
               <w:rPr>
@@ -411,7 +411,7 @@
               <w:lang w:eastAsia="en-ID"/>
             </w:rPr>
           </w:pPr>
-          <w:hyperlink w:anchor="_Toc234532595" w:history="1">
+          <w:hyperlink w:anchor="_Toc234654641" w:history="1">
             <w:r>
               <w:rPr>
                 <w:rStyle w:val="Hyperlink"/>
@@ -434,7 +434,7 @@
               <w:rPr>
                 <w:webHidden/>
               </w:rPr>
-              <w:instrText xml:space="preserve"> PAGEREF _Toc234532595 \h </w:instrText>
+              <w:instrText xml:space="preserve"> PAGEREF _Toc234654641 \h </w:instrText>
             </w:r>
             <w:r>
               <w:rPr>
@@ -474,7 +474,7 @@
               <w:lang w:eastAsia="en-ID"/>
             </w:rPr>
           </w:pPr>
-          <w:hyperlink w:anchor="_Toc234532596" w:history="1">
+          <w:hyperlink w:anchor="_Toc234654642" w:history="1">
             <w:r>
               <w:rPr>
                 <w:rStyle w:val="Hyperlink"/>
@@ -516,7 +516,7 @@
                 <w:noProof/>
                 <w:webHidden/>
               </w:rPr>
-              <w:instrText xml:space="preserve"> PAGEREF _Toc234532596 \h </w:instrText>
+              <w:instrText xml:space="preserve"> PAGEREF _Toc234654642 \h </w:instrText>
             </w:r>
             <w:r>
               <w:rPr>
@@ -560,7 +560,7 @@
               <w:lang w:eastAsia="en-ID"/>
             </w:rPr>
           </w:pPr>
-          <w:hyperlink w:anchor="_Toc234532597" w:history="1">
+          <w:hyperlink w:anchor="_Toc234654643" w:history="1">
             <w:r>
               <w:rPr>
                 <w:rStyle w:val="Hyperlink"/>
@@ -602,7 +602,7 @@
                 <w:noProof/>
                 <w:webHidden/>
               </w:rPr>
-              <w:instrText xml:space="preserve"> PAGEREF _Toc234532597 \h </w:instrText>
+              <w:instrText xml:space="preserve"> PAGEREF _Toc234654643 \h </w:instrText>
             </w:r>
             <w:r>
               <w:rPr>
@@ -646,7 +646,7 @@
               <w:lang w:eastAsia="en-ID"/>
             </w:rPr>
           </w:pPr>
-          <w:hyperlink w:anchor="_Toc234532598" w:history="1">
+          <w:hyperlink w:anchor="_Toc234654644" w:history="1">
             <w:r>
               <w:rPr>
                 <w:rStyle w:val="Hyperlink"/>
@@ -688,7 +688,7 @@
                 <w:noProof/>
                 <w:webHidden/>
               </w:rPr>
-              <w:instrText xml:space="preserve"> PAGEREF _Toc234532598 \h </w:instrText>
+              <w:instrText xml:space="preserve"> PAGEREF _Toc234654644 \h </w:instrText>
             </w:r>
             <w:r>
               <w:rPr>
@@ -732,7 +732,7 @@
               <w:lang w:eastAsia="en-ID"/>
             </w:rPr>
           </w:pPr>
-          <w:hyperlink w:anchor="_Toc234532599" w:history="1">
+          <w:hyperlink w:anchor="_Toc234654645" w:history="1">
             <w:r>
               <w:rPr>
                 <w:rStyle w:val="Hyperlink"/>
@@ -774,7 +774,7 @@
                 <w:noProof/>
                 <w:webHidden/>
               </w:rPr>
-              <w:instrText xml:space="preserve"> PAGEREF _Toc234532599 \h </w:instrText>
+              <w:instrText xml:space="preserve"> PAGEREF _Toc234654645 \h </w:instrText>
             </w:r>
             <w:r>
               <w:rPr>
@@ -818,7 +818,7 @@
               <w:lang w:eastAsia="en-ID"/>
             </w:rPr>
           </w:pPr>
-          <w:hyperlink w:anchor="_Toc234532600" w:history="1">
+          <w:hyperlink w:anchor="_Toc234654646" w:history="1">
             <w:r>
               <w:rPr>
                 <w:rStyle w:val="Hyperlink"/>
@@ -860,7 +860,7 @@
                 <w:noProof/>
                 <w:webHidden/>
               </w:rPr>
-              <w:instrText xml:space="preserve"> PAGEREF _Toc234532600 \h </w:instrText>
+              <w:instrText xml:space="preserve"> PAGEREF _Toc234654646 \h </w:instrText>
             </w:r>
             <w:r>
               <w:rPr>
@@ -904,7 +904,7 @@
               <w:lang w:eastAsia="en-ID"/>
             </w:rPr>
           </w:pPr>
-          <w:hyperlink w:anchor="_Toc234532601" w:history="1">
+          <w:hyperlink w:anchor="_Toc234654647" w:history="1">
             <w:r>
               <w:rPr>
                 <w:rStyle w:val="Hyperlink"/>
@@ -946,7 +946,7 @@
                 <w:noProof/>
                 <w:webHidden/>
               </w:rPr>
-              <w:instrText xml:space="preserve"> PAGEREF _Toc234532601 \h </w:instrText>
+              <w:instrText xml:space="preserve"> PAGEREF _Toc234654647 \h </w:instrText>
             </w:r>
             <w:r>
               <w:rPr>
@@ -990,7 +990,7 @@
               <w:lang w:eastAsia="en-ID"/>
             </w:rPr>
           </w:pPr>
-          <w:hyperlink w:anchor="_Toc234532602" w:history="1">
+          <w:hyperlink w:anchor="_Toc234654648" w:history="1">
             <w:r>
               <w:rPr>
                 <w:rStyle w:val="Hyperlink"/>
@@ -1032,7 +1032,7 @@
                 <w:noProof/>
                 <w:webHidden/>
               </w:rPr>
-              <w:instrText xml:space="preserve"> PAGEREF _Toc234532602 \h </w:instrText>
+              <w:instrText xml:space="preserve"> PAGEREF _Toc234654648 \h </w:instrText>
             </w:r>
             <w:r>
               <w:rPr>
@@ -1073,7 +1073,7 @@
               <w:lang w:eastAsia="en-ID"/>
             </w:rPr>
           </w:pPr>
-          <w:hyperlink w:anchor="_Toc234532603" w:history="1">
+          <w:hyperlink w:anchor="_Toc234654649" w:history="1">
             <w:r>
               <w:rPr>
                 <w:rStyle w:val="Hyperlink"/>
@@ -1096,7 +1096,7 @@
               <w:rPr>
                 <w:webHidden/>
               </w:rPr>
-              <w:instrText xml:space="preserve"> PAGEREF _Toc234532603 \h </w:instrText>
+              <w:instrText xml:space="preserve"> PAGEREF _Toc234654649 \h </w:instrText>
             </w:r>
             <w:r>
               <w:rPr>
@@ -1136,7 +1136,7 @@
               <w:lang w:eastAsia="en-ID"/>
             </w:rPr>
           </w:pPr>
-          <w:hyperlink w:anchor="_Toc234532604" w:history="1">
+          <w:hyperlink w:anchor="_Toc234654650" w:history="1">
             <w:r>
               <w:rPr>
                 <w:rStyle w:val="Hyperlink"/>
@@ -1178,7 +1178,7 @@
                 <w:noProof/>
                 <w:webHidden/>
               </w:rPr>
-              <w:instrText xml:space="preserve"> PAGEREF _Toc234532604 \h </w:instrText>
+              <w:instrText xml:space="preserve"> PAGEREF _Toc234654650 \h </w:instrText>
             </w:r>
             <w:r>
               <w:rPr>
@@ -1222,7 +1222,7 @@
               <w:lang w:eastAsia="en-ID"/>
             </w:rPr>
           </w:pPr>
-          <w:hyperlink w:anchor="_Toc234532605" w:history="1">
+          <w:hyperlink w:anchor="_Toc234654651" w:history="1">
             <w:r>
               <w:rPr>
                 <w:rStyle w:val="Hyperlink"/>
@@ -1264,7 +1264,7 @@
                 <w:noProof/>
                 <w:webHidden/>
               </w:rPr>
-              <w:instrText xml:space="preserve"> PAGEREF _Toc234532605 \h </w:instrText>
+              <w:instrText xml:space="preserve"> PAGEREF _Toc234654651 \h </w:instrText>
             </w:r>
             <w:r>
               <w:rPr>
@@ -1308,7 +1308,7 @@
               <w:lang w:eastAsia="en-ID"/>
             </w:rPr>
           </w:pPr>
-          <w:hyperlink w:anchor="_Toc234532606" w:history="1">
+          <w:hyperlink w:anchor="_Toc234654652" w:history="1">
             <w:r>
               <w:rPr>
                 <w:rStyle w:val="Hyperlink"/>
@@ -1350,7 +1350,7 @@
                 <w:noProof/>
                 <w:webHidden/>
               </w:rPr>
-              <w:instrText xml:space="preserve"> PAGEREF _Toc234532606 \h </w:instrText>
+              <w:instrText xml:space="preserve"> PAGEREF _Toc234654652 \h </w:instrText>
             </w:r>
             <w:r>
               <w:rPr>
@@ -1394,7 +1394,7 @@
               <w:lang w:eastAsia="en-ID"/>
             </w:rPr>
           </w:pPr>
-          <w:hyperlink w:anchor="_Toc234532607" w:history="1">
+          <w:hyperlink w:anchor="_Toc234654653" w:history="1">
             <w:r>
               <w:rPr>
                 <w:rStyle w:val="Hyperlink"/>
@@ -1436,7 +1436,7 @@
                 <w:noProof/>
                 <w:webHidden/>
               </w:rPr>
-              <w:instrText xml:space="preserve"> PAGEREF _Toc234532607 \h </w:instrText>
+              <w:instrText xml:space="preserve"> PAGEREF _Toc234654653 \h </w:instrText>
             </w:r>
             <w:r>
               <w:rPr>
@@ -1480,7 +1480,7 @@
               <w:lang w:eastAsia="en-ID"/>
             </w:rPr>
           </w:pPr>
-          <w:hyperlink w:anchor="_Toc234532608" w:history="1">
+          <w:hyperlink w:anchor="_Toc234654654" w:history="1">
             <w:r>
               <w:rPr>
                 <w:rStyle w:val="Hyperlink"/>
@@ -1522,7 +1522,7 @@
                 <w:noProof/>
                 <w:webHidden/>
               </w:rPr>
-              <w:instrText xml:space="preserve"> PAGEREF _Toc234532608 \h </w:instrText>
+              <w:instrText xml:space="preserve"> PAGEREF _Toc234654654 \h </w:instrText>
             </w:r>
             <w:r>
               <w:rPr>
@@ -1566,7 +1566,7 @@
               <w:lang w:eastAsia="en-ID"/>
             </w:rPr>
           </w:pPr>
-          <w:hyperlink w:anchor="_Toc234532609" w:history="1">
+          <w:hyperlink w:anchor="_Toc234654655" w:history="1">
             <w:r>
               <w:rPr>
                 <w:rStyle w:val="Hyperlink"/>
@@ -1608,7 +1608,7 @@
                 <w:noProof/>
                 <w:webHidden/>
               </w:rPr>
-              <w:instrText xml:space="preserve"> PAGEREF _Toc234532609 \h </w:instrText>
+              <w:instrText xml:space="preserve"> PAGEREF _Toc234654655 \h </w:instrText>
             </w:r>
             <w:r>
               <w:rPr>
@@ -1649,7 +1649,7 @@
               <w:lang w:eastAsia="en-ID"/>
             </w:rPr>
           </w:pPr>
-          <w:hyperlink w:anchor="_Toc234532610" w:history="1">
+          <w:hyperlink w:anchor="_Toc234654656" w:history="1">
             <w:r>
               <w:rPr>
                 <w:rStyle w:val="Hyperlink"/>
@@ -1672,7 +1672,7 @@
               <w:rPr>
                 <w:webHidden/>
               </w:rPr>
-              <w:instrText xml:space="preserve"> PAGEREF _Toc234532610 \h </w:instrText>
+              <w:instrText xml:space="preserve"> PAGEREF _Toc234654656 \h </w:instrText>
             </w:r>
             <w:r>
               <w:rPr>
@@ -1693,1270 +1693,6 @@
             </w:r>
             <w:r>
               <w:rPr>
-                <w:webHidden/>
-              </w:rPr>
-              <w:fldChar w:fldCharType="end"/>
-            </w:r>
-          </w:hyperlink>
-        </w:p>
-        <w:p>
-          <w:pPr>
-            <w:pStyle w:val="TOC2"/>
-            <w:tabs>
-              <w:tab w:val="left" w:pos="960"/>
-              <w:tab w:val="right" w:leader="dot" w:pos="9016"/>
-            </w:tabs>
-            <w:rPr>
-              <w:rFonts w:asciiTheme="minorHAnsi" w:eastAsiaTheme="minorEastAsia" w:hAnsiTheme="minorHAnsi"/>
-              <w:noProof/>
-              <w:lang w:eastAsia="en-ID"/>
-            </w:rPr>
-          </w:pPr>
-          <w:hyperlink w:anchor="_Toc234532611" w:history="1">
-            <w:r>
-              <w:rPr>
-                <w:rStyle w:val="Hyperlink"/>
-                <w:noProof/>
-              </w:rPr>
-              <w:t>3.1.</w:t>
-            </w:r>
-            <w:r>
-              <w:rPr>
-                <w:rFonts w:asciiTheme="minorHAnsi" w:eastAsiaTheme="minorEastAsia" w:hAnsiTheme="minorHAnsi"/>
-                <w:noProof/>
-                <w:lang w:eastAsia="en-ID"/>
-              </w:rPr>
-              <w:tab/>
-            </w:r>
-            <w:r>
-              <w:rPr>
-                <w:rStyle w:val="Hyperlink"/>
-                <w:noProof/>
-              </w:rPr>
-              <w:t>Pendahuluan</w:t>
-            </w:r>
-            <w:r>
-              <w:rPr>
-                <w:noProof/>
-                <w:webHidden/>
-              </w:rPr>
-              <w:tab/>
-            </w:r>
-            <w:r>
-              <w:rPr>
-                <w:noProof/>
-                <w:webHidden/>
-              </w:rPr>
-              <w:fldChar w:fldCharType="begin"/>
-            </w:r>
-            <w:r>
-              <w:rPr>
-                <w:noProof/>
-                <w:webHidden/>
-              </w:rPr>
-              <w:instrText xml:space="preserve"> PAGEREF _Toc234532611 \h </w:instrText>
-            </w:r>
-            <w:r>
-              <w:rPr>
-                <w:noProof/>
-                <w:webHidden/>
-              </w:rPr>
-            </w:r>
-            <w:r>
-              <w:rPr>
-                <w:noProof/>
-                <w:webHidden/>
-              </w:rPr>
-              <w:fldChar w:fldCharType="separate"/>
-            </w:r>
-            <w:r>
-              <w:rPr>
-                <w:noProof/>
-                <w:webHidden/>
-              </w:rPr>
-              <w:t>21</w:t>
-            </w:r>
-            <w:r>
-              <w:rPr>
-                <w:noProof/>
-                <w:webHidden/>
-              </w:rPr>
-              <w:fldChar w:fldCharType="end"/>
-            </w:r>
-          </w:hyperlink>
-        </w:p>
-        <w:p>
-          <w:pPr>
-            <w:pStyle w:val="TOC2"/>
-            <w:tabs>
-              <w:tab w:val="left" w:pos="960"/>
-              <w:tab w:val="right" w:leader="dot" w:pos="9016"/>
-            </w:tabs>
-            <w:rPr>
-              <w:rFonts w:asciiTheme="minorHAnsi" w:eastAsiaTheme="minorEastAsia" w:hAnsiTheme="minorHAnsi"/>
-              <w:noProof/>
-              <w:lang w:eastAsia="en-ID"/>
-            </w:rPr>
-          </w:pPr>
-          <w:hyperlink w:anchor="_Toc234532612" w:history="1">
-            <w:r>
-              <w:rPr>
-                <w:rStyle w:val="Hyperlink"/>
-                <w:noProof/>
-              </w:rPr>
-              <w:t>3.2.</w:t>
-            </w:r>
-            <w:r>
-              <w:rPr>
-                <w:rFonts w:asciiTheme="minorHAnsi" w:eastAsiaTheme="minorEastAsia" w:hAnsiTheme="minorHAnsi"/>
-                <w:noProof/>
-                <w:lang w:eastAsia="en-ID"/>
-              </w:rPr>
-              <w:tab/>
-            </w:r>
-            <w:r>
-              <w:rPr>
-                <w:rStyle w:val="Hyperlink"/>
-                <w:noProof/>
-              </w:rPr>
-              <w:t>Mengenal Vite</w:t>
-            </w:r>
-            <w:r>
-              <w:rPr>
-                <w:noProof/>
-                <w:webHidden/>
-              </w:rPr>
-              <w:tab/>
-            </w:r>
-            <w:r>
-              <w:rPr>
-                <w:noProof/>
-                <w:webHidden/>
-              </w:rPr>
-              <w:fldChar w:fldCharType="begin"/>
-            </w:r>
-            <w:r>
-              <w:rPr>
-                <w:noProof/>
-                <w:webHidden/>
-              </w:rPr>
-              <w:instrText xml:space="preserve"> PAGEREF _Toc234532612 \h </w:instrText>
-            </w:r>
-            <w:r>
-              <w:rPr>
-                <w:noProof/>
-                <w:webHidden/>
-              </w:rPr>
-            </w:r>
-            <w:r>
-              <w:rPr>
-                <w:noProof/>
-                <w:webHidden/>
-              </w:rPr>
-              <w:fldChar w:fldCharType="separate"/>
-            </w:r>
-            <w:r>
-              <w:rPr>
-                <w:noProof/>
-                <w:webHidden/>
-              </w:rPr>
-              <w:t>22</w:t>
-            </w:r>
-            <w:r>
-              <w:rPr>
-                <w:noProof/>
-                <w:webHidden/>
-              </w:rPr>
-              <w:fldChar w:fldCharType="end"/>
-            </w:r>
-          </w:hyperlink>
-        </w:p>
-        <w:p>
-          <w:pPr>
-            <w:pStyle w:val="TOC2"/>
-            <w:tabs>
-              <w:tab w:val="left" w:pos="960"/>
-              <w:tab w:val="right" w:leader="dot" w:pos="9016"/>
-            </w:tabs>
-            <w:rPr>
-              <w:rFonts w:asciiTheme="minorHAnsi" w:eastAsiaTheme="minorEastAsia" w:hAnsiTheme="minorHAnsi"/>
-              <w:noProof/>
-              <w:lang w:eastAsia="en-ID"/>
-            </w:rPr>
-          </w:pPr>
-          <w:hyperlink w:anchor="_Toc234532613" w:history="1">
-            <w:r>
-              <w:rPr>
-                <w:rStyle w:val="Hyperlink"/>
-                <w:noProof/>
-              </w:rPr>
-              <w:t>3.3.</w:t>
-            </w:r>
-            <w:r>
-              <w:rPr>
-                <w:rFonts w:asciiTheme="minorHAnsi" w:eastAsiaTheme="minorEastAsia" w:hAnsiTheme="minorHAnsi"/>
-                <w:noProof/>
-                <w:lang w:eastAsia="en-ID"/>
-              </w:rPr>
-              <w:tab/>
-            </w:r>
-            <w:r>
-              <w:rPr>
-                <w:rStyle w:val="Hyperlink"/>
-                <w:noProof/>
-              </w:rPr>
-              <w:t>Membuat Project</w:t>
-            </w:r>
-            <w:r>
-              <w:rPr>
-                <w:noProof/>
-                <w:webHidden/>
-              </w:rPr>
-              <w:tab/>
-            </w:r>
-            <w:r>
-              <w:rPr>
-                <w:noProof/>
-                <w:webHidden/>
-              </w:rPr>
-              <w:fldChar w:fldCharType="begin"/>
-            </w:r>
-            <w:r>
-              <w:rPr>
-                <w:noProof/>
-                <w:webHidden/>
-              </w:rPr>
-              <w:instrText xml:space="preserve"> PAGEREF _Toc234532613 \h </w:instrText>
-            </w:r>
-            <w:r>
-              <w:rPr>
-                <w:noProof/>
-                <w:webHidden/>
-              </w:rPr>
-            </w:r>
-            <w:r>
-              <w:rPr>
-                <w:noProof/>
-                <w:webHidden/>
-              </w:rPr>
-              <w:fldChar w:fldCharType="separate"/>
-            </w:r>
-            <w:r>
-              <w:rPr>
-                <w:noProof/>
-                <w:webHidden/>
-              </w:rPr>
-              <w:t>22</w:t>
-            </w:r>
-            <w:r>
-              <w:rPr>
-                <w:noProof/>
-                <w:webHidden/>
-              </w:rPr>
-              <w:fldChar w:fldCharType="end"/>
-            </w:r>
-          </w:hyperlink>
-        </w:p>
-        <w:p>
-          <w:pPr>
-            <w:pStyle w:val="TOC2"/>
-            <w:tabs>
-              <w:tab w:val="left" w:pos="960"/>
-              <w:tab w:val="right" w:leader="dot" w:pos="9016"/>
-            </w:tabs>
-            <w:rPr>
-              <w:rFonts w:asciiTheme="minorHAnsi" w:eastAsiaTheme="minorEastAsia" w:hAnsiTheme="minorHAnsi"/>
-              <w:noProof/>
-              <w:lang w:eastAsia="en-ID"/>
-            </w:rPr>
-          </w:pPr>
-          <w:hyperlink w:anchor="_Toc234532614" w:history="1">
-            <w:r>
-              <w:rPr>
-                <w:rStyle w:val="Hyperlink"/>
-                <w:noProof/>
-              </w:rPr>
-              <w:t>3.4.</w:t>
-            </w:r>
-            <w:r>
-              <w:rPr>
-                <w:rFonts w:asciiTheme="minorHAnsi" w:eastAsiaTheme="minorEastAsia" w:hAnsiTheme="minorHAnsi"/>
-                <w:noProof/>
-                <w:lang w:eastAsia="en-ID"/>
-              </w:rPr>
-              <w:tab/>
-            </w:r>
-            <w:r>
-              <w:rPr>
-                <w:rStyle w:val="Hyperlink"/>
-                <w:noProof/>
-              </w:rPr>
-              <w:t>Struktur Folder Project</w:t>
-            </w:r>
-            <w:r>
-              <w:rPr>
-                <w:noProof/>
-                <w:webHidden/>
-              </w:rPr>
-              <w:tab/>
-            </w:r>
-            <w:r>
-              <w:rPr>
-                <w:noProof/>
-                <w:webHidden/>
-              </w:rPr>
-              <w:fldChar w:fldCharType="begin"/>
-            </w:r>
-            <w:r>
-              <w:rPr>
-                <w:noProof/>
-                <w:webHidden/>
-              </w:rPr>
-              <w:instrText xml:space="preserve"> PAGEREF _Toc234532614 \h </w:instrText>
-            </w:r>
-            <w:r>
-              <w:rPr>
-                <w:noProof/>
-                <w:webHidden/>
-              </w:rPr>
-            </w:r>
-            <w:r>
-              <w:rPr>
-                <w:noProof/>
-                <w:webHidden/>
-              </w:rPr>
-              <w:fldChar w:fldCharType="separate"/>
-            </w:r>
-            <w:r>
-              <w:rPr>
-                <w:noProof/>
-                <w:webHidden/>
-              </w:rPr>
-              <w:t>24</w:t>
-            </w:r>
-            <w:r>
-              <w:rPr>
-                <w:noProof/>
-                <w:webHidden/>
-              </w:rPr>
-              <w:fldChar w:fldCharType="end"/>
-            </w:r>
-          </w:hyperlink>
-        </w:p>
-        <w:p>
-          <w:pPr>
-            <w:pStyle w:val="TOC2"/>
-            <w:tabs>
-              <w:tab w:val="left" w:pos="960"/>
-              <w:tab w:val="right" w:leader="dot" w:pos="9016"/>
-            </w:tabs>
-            <w:rPr>
-              <w:rFonts w:asciiTheme="minorHAnsi" w:eastAsiaTheme="minorEastAsia" w:hAnsiTheme="minorHAnsi"/>
-              <w:noProof/>
-              <w:lang w:eastAsia="en-ID"/>
-            </w:rPr>
-          </w:pPr>
-          <w:hyperlink w:anchor="_Toc234532615" w:history="1">
-            <w:r>
-              <w:rPr>
-                <w:rStyle w:val="Hyperlink"/>
-                <w:noProof/>
-              </w:rPr>
-              <w:t>3.5.</w:t>
-            </w:r>
-            <w:r>
-              <w:rPr>
-                <w:rFonts w:asciiTheme="minorHAnsi" w:eastAsiaTheme="minorEastAsia" w:hAnsiTheme="minorHAnsi"/>
-                <w:noProof/>
-                <w:lang w:eastAsia="en-ID"/>
-              </w:rPr>
-              <w:tab/>
-            </w:r>
-            <w:r>
-              <w:rPr>
-                <w:rStyle w:val="Hyperlink"/>
-                <w:noProof/>
-              </w:rPr>
-              <w:t>Mengenal File package.json</w:t>
-            </w:r>
-            <w:r>
-              <w:rPr>
-                <w:noProof/>
-                <w:webHidden/>
-              </w:rPr>
-              <w:tab/>
-            </w:r>
-            <w:r>
-              <w:rPr>
-                <w:noProof/>
-                <w:webHidden/>
-              </w:rPr>
-              <w:fldChar w:fldCharType="begin"/>
-            </w:r>
-            <w:r>
-              <w:rPr>
-                <w:noProof/>
-                <w:webHidden/>
-              </w:rPr>
-              <w:instrText xml:space="preserve"> PAGEREF _Toc234532615 \h </w:instrText>
-            </w:r>
-            <w:r>
-              <w:rPr>
-                <w:noProof/>
-                <w:webHidden/>
-              </w:rPr>
-            </w:r>
-            <w:r>
-              <w:rPr>
-                <w:noProof/>
-                <w:webHidden/>
-              </w:rPr>
-              <w:fldChar w:fldCharType="separate"/>
-            </w:r>
-            <w:r>
-              <w:rPr>
-                <w:noProof/>
-                <w:webHidden/>
-              </w:rPr>
-              <w:t>25</w:t>
-            </w:r>
-            <w:r>
-              <w:rPr>
-                <w:noProof/>
-                <w:webHidden/>
-              </w:rPr>
-              <w:fldChar w:fldCharType="end"/>
-            </w:r>
-          </w:hyperlink>
-        </w:p>
-        <w:p>
-          <w:pPr>
-            <w:pStyle w:val="TOC2"/>
-            <w:tabs>
-              <w:tab w:val="left" w:pos="960"/>
-              <w:tab w:val="right" w:leader="dot" w:pos="9016"/>
-            </w:tabs>
-            <w:rPr>
-              <w:rFonts w:asciiTheme="minorHAnsi" w:eastAsiaTheme="minorEastAsia" w:hAnsiTheme="minorHAnsi"/>
-              <w:noProof/>
-              <w:lang w:eastAsia="en-ID"/>
-            </w:rPr>
-          </w:pPr>
-          <w:hyperlink w:anchor="_Toc234532616" w:history="1">
-            <w:r>
-              <w:rPr>
-                <w:rStyle w:val="Hyperlink"/>
-                <w:noProof/>
-              </w:rPr>
-              <w:t>3.6.</w:t>
-            </w:r>
-            <w:r>
-              <w:rPr>
-                <w:rFonts w:asciiTheme="minorHAnsi" w:eastAsiaTheme="minorEastAsia" w:hAnsiTheme="minorHAnsi"/>
-                <w:noProof/>
-                <w:lang w:eastAsia="en-ID"/>
-              </w:rPr>
-              <w:tab/>
-            </w:r>
-            <w:r>
-              <w:rPr>
-                <w:rStyle w:val="Hyperlink"/>
-                <w:noProof/>
-              </w:rPr>
-              <w:t>Perintah Dasar pnpm</w:t>
-            </w:r>
-            <w:r>
-              <w:rPr>
-                <w:noProof/>
-                <w:webHidden/>
-              </w:rPr>
-              <w:tab/>
-            </w:r>
-            <w:r>
-              <w:rPr>
-                <w:noProof/>
-                <w:webHidden/>
-              </w:rPr>
-              <w:fldChar w:fldCharType="begin"/>
-            </w:r>
-            <w:r>
-              <w:rPr>
-                <w:noProof/>
-                <w:webHidden/>
-              </w:rPr>
-              <w:instrText xml:space="preserve"> PAGEREF _Toc234532616 \h </w:instrText>
-            </w:r>
-            <w:r>
-              <w:rPr>
-                <w:noProof/>
-                <w:webHidden/>
-              </w:rPr>
-            </w:r>
-            <w:r>
-              <w:rPr>
-                <w:noProof/>
-                <w:webHidden/>
-              </w:rPr>
-              <w:fldChar w:fldCharType="separate"/>
-            </w:r>
-            <w:r>
-              <w:rPr>
-                <w:noProof/>
-                <w:webHidden/>
-              </w:rPr>
-              <w:t>26</w:t>
-            </w:r>
-            <w:r>
-              <w:rPr>
-                <w:noProof/>
-                <w:webHidden/>
-              </w:rPr>
-              <w:fldChar w:fldCharType="end"/>
-            </w:r>
-          </w:hyperlink>
-        </w:p>
-        <w:p>
-          <w:pPr>
-            <w:pStyle w:val="TOC2"/>
-            <w:tabs>
-              <w:tab w:val="left" w:pos="960"/>
-              <w:tab w:val="right" w:leader="dot" w:pos="9016"/>
-            </w:tabs>
-            <w:rPr>
-              <w:rFonts w:asciiTheme="minorHAnsi" w:eastAsiaTheme="minorEastAsia" w:hAnsiTheme="minorHAnsi"/>
-              <w:noProof/>
-              <w:lang w:eastAsia="en-ID"/>
-            </w:rPr>
-          </w:pPr>
-          <w:hyperlink w:anchor="_Toc234532617" w:history="1">
-            <w:r>
-              <w:rPr>
-                <w:rStyle w:val="Hyperlink"/>
-                <w:noProof/>
-              </w:rPr>
-              <w:t>3.7.</w:t>
-            </w:r>
-            <w:r>
-              <w:rPr>
-                <w:rFonts w:asciiTheme="minorHAnsi" w:eastAsiaTheme="minorEastAsia" w:hAnsiTheme="minorHAnsi"/>
-                <w:noProof/>
-                <w:lang w:eastAsia="en-ID"/>
-              </w:rPr>
-              <w:tab/>
-            </w:r>
-            <w:r>
-              <w:rPr>
-                <w:rStyle w:val="Hyperlink"/>
-                <w:noProof/>
-              </w:rPr>
-              <w:t>Ringkasan Bab</w:t>
-            </w:r>
-            <w:r>
-              <w:rPr>
-                <w:noProof/>
-                <w:webHidden/>
-              </w:rPr>
-              <w:tab/>
-            </w:r>
-            <w:r>
-              <w:rPr>
-                <w:noProof/>
-                <w:webHidden/>
-              </w:rPr>
-              <w:fldChar w:fldCharType="begin"/>
-            </w:r>
-            <w:r>
-              <w:rPr>
-                <w:noProof/>
-                <w:webHidden/>
-              </w:rPr>
-              <w:instrText xml:space="preserve"> PAGEREF _Toc234532617 \h </w:instrText>
-            </w:r>
-            <w:r>
-              <w:rPr>
-                <w:noProof/>
-                <w:webHidden/>
-              </w:rPr>
-            </w:r>
-            <w:r>
-              <w:rPr>
-                <w:noProof/>
-                <w:webHidden/>
-              </w:rPr>
-              <w:fldChar w:fldCharType="separate"/>
-            </w:r>
-            <w:r>
-              <w:rPr>
-                <w:noProof/>
-                <w:webHidden/>
-              </w:rPr>
-              <w:t>26</w:t>
-            </w:r>
-            <w:r>
-              <w:rPr>
-                <w:noProof/>
-                <w:webHidden/>
-              </w:rPr>
-              <w:fldChar w:fldCharType="end"/>
-            </w:r>
-          </w:hyperlink>
-        </w:p>
-        <w:p>
-          <w:pPr>
-            <w:pStyle w:val="TOC1"/>
-            <w:rPr>
-              <w:rFonts w:asciiTheme="minorHAnsi" w:eastAsiaTheme="minorEastAsia" w:hAnsiTheme="minorHAnsi"/>
-              <w:b w:val="0"/>
-              <w:bCs w:val="0"/>
-              <w:lang w:eastAsia="en-ID"/>
-            </w:rPr>
-          </w:pPr>
-          <w:hyperlink w:anchor="_Toc234532618" w:history="1">
-            <w:r>
-              <w:rPr>
-                <w:rStyle w:val="Hyperlink"/>
-              </w:rPr>
-              <w:t>BAB 4  Dasar-dasar React dan Komponen</w:t>
-            </w:r>
-            <w:r>
-              <w:rPr>
-                <w:webHidden/>
-              </w:rPr>
-              <w:tab/>
-            </w:r>
-            <w:r>
-              <w:rPr>
-                <w:webHidden/>
-              </w:rPr>
-              <w:fldChar w:fldCharType="begin"/>
-            </w:r>
-            <w:r>
-              <w:rPr>
-                <w:webHidden/>
-              </w:rPr>
-              <w:instrText xml:space="preserve"> PAGEREF _Toc234532618 \h </w:instrText>
-            </w:r>
-            <w:r>
-              <w:rPr>
-                <w:webHidden/>
-              </w:rPr>
-            </w:r>
-            <w:r>
-              <w:rPr>
-                <w:webHidden/>
-              </w:rPr>
-              <w:fldChar w:fldCharType="separate"/>
-            </w:r>
-            <w:r>
-              <w:rPr>
-                <w:webHidden/>
-              </w:rPr>
-              <w:t>28</w:t>
-            </w:r>
-            <w:r>
-              <w:rPr>
-                <w:webHidden/>
-              </w:rPr>
-              <w:fldChar w:fldCharType="end"/>
-            </w:r>
-          </w:hyperlink>
-        </w:p>
-        <w:p>
-          <w:pPr>
-            <w:pStyle w:val="TOC2"/>
-            <w:tabs>
-              <w:tab w:val="left" w:pos="960"/>
-              <w:tab w:val="right" w:leader="dot" w:pos="9016"/>
-            </w:tabs>
-            <w:rPr>
-              <w:rFonts w:asciiTheme="minorHAnsi" w:eastAsiaTheme="minorEastAsia" w:hAnsiTheme="minorHAnsi"/>
-              <w:noProof/>
-              <w:lang w:eastAsia="en-ID"/>
-            </w:rPr>
-          </w:pPr>
-          <w:hyperlink w:anchor="_Toc234532619" w:history="1">
-            <w:r>
-              <w:rPr>
-                <w:rStyle w:val="Hyperlink"/>
-                <w:noProof/>
-              </w:rPr>
-              <w:t>4.1.</w:t>
-            </w:r>
-            <w:r>
-              <w:rPr>
-                <w:rFonts w:asciiTheme="minorHAnsi" w:eastAsiaTheme="minorEastAsia" w:hAnsiTheme="minorHAnsi"/>
-                <w:noProof/>
-                <w:lang w:eastAsia="en-ID"/>
-              </w:rPr>
-              <w:tab/>
-            </w:r>
-            <w:r>
-              <w:rPr>
-                <w:rStyle w:val="Hyperlink"/>
-                <w:noProof/>
-              </w:rPr>
-              <w:t>Pendahuluan</w:t>
-            </w:r>
-            <w:r>
-              <w:rPr>
-                <w:noProof/>
-                <w:webHidden/>
-              </w:rPr>
-              <w:tab/>
-            </w:r>
-            <w:r>
-              <w:rPr>
-                <w:noProof/>
-                <w:webHidden/>
-              </w:rPr>
-              <w:fldChar w:fldCharType="begin"/>
-            </w:r>
-            <w:r>
-              <w:rPr>
-                <w:noProof/>
-                <w:webHidden/>
-              </w:rPr>
-              <w:instrText xml:space="preserve"> PAGEREF _Toc234532619 \h </w:instrText>
-            </w:r>
-            <w:r>
-              <w:rPr>
-                <w:noProof/>
-                <w:webHidden/>
-              </w:rPr>
-            </w:r>
-            <w:r>
-              <w:rPr>
-                <w:noProof/>
-                <w:webHidden/>
-              </w:rPr>
-              <w:fldChar w:fldCharType="separate"/>
-            </w:r>
-            <w:r>
-              <w:rPr>
-                <w:noProof/>
-                <w:webHidden/>
-              </w:rPr>
-              <w:t>28</w:t>
-            </w:r>
-            <w:r>
-              <w:rPr>
-                <w:noProof/>
-                <w:webHidden/>
-              </w:rPr>
-              <w:fldChar w:fldCharType="end"/>
-            </w:r>
-          </w:hyperlink>
-        </w:p>
-        <w:p>
-          <w:pPr>
-            <w:pStyle w:val="TOC2"/>
-            <w:tabs>
-              <w:tab w:val="left" w:pos="960"/>
-              <w:tab w:val="right" w:leader="dot" w:pos="9016"/>
-            </w:tabs>
-            <w:rPr>
-              <w:rFonts w:asciiTheme="minorHAnsi" w:eastAsiaTheme="minorEastAsia" w:hAnsiTheme="minorHAnsi"/>
-              <w:noProof/>
-              <w:lang w:eastAsia="en-ID"/>
-            </w:rPr>
-          </w:pPr>
-          <w:hyperlink w:anchor="_Toc234532620" w:history="1">
-            <w:r>
-              <w:rPr>
-                <w:rStyle w:val="Hyperlink"/>
-                <w:noProof/>
-              </w:rPr>
-              <w:t>4.2.</w:t>
-            </w:r>
-            <w:r>
-              <w:rPr>
-                <w:rFonts w:asciiTheme="minorHAnsi" w:eastAsiaTheme="minorEastAsia" w:hAnsiTheme="minorHAnsi"/>
-                <w:noProof/>
-                <w:lang w:eastAsia="en-ID"/>
-              </w:rPr>
-              <w:tab/>
-            </w:r>
-            <w:r>
-              <w:rPr>
-                <w:rStyle w:val="Hyperlink"/>
-                <w:noProof/>
-              </w:rPr>
-              <w:t>Apa itu React?</w:t>
-            </w:r>
-            <w:r>
-              <w:rPr>
-                <w:noProof/>
-                <w:webHidden/>
-              </w:rPr>
-              <w:tab/>
-            </w:r>
-            <w:r>
-              <w:rPr>
-                <w:noProof/>
-                <w:webHidden/>
-              </w:rPr>
-              <w:fldChar w:fldCharType="begin"/>
-            </w:r>
-            <w:r>
-              <w:rPr>
-                <w:noProof/>
-                <w:webHidden/>
-              </w:rPr>
-              <w:instrText xml:space="preserve"> PAGEREF _Toc234532620 \h </w:instrText>
-            </w:r>
-            <w:r>
-              <w:rPr>
-                <w:noProof/>
-                <w:webHidden/>
-              </w:rPr>
-            </w:r>
-            <w:r>
-              <w:rPr>
-                <w:noProof/>
-                <w:webHidden/>
-              </w:rPr>
-              <w:fldChar w:fldCharType="separate"/>
-            </w:r>
-            <w:r>
-              <w:rPr>
-                <w:noProof/>
-                <w:webHidden/>
-              </w:rPr>
-              <w:t>28</w:t>
-            </w:r>
-            <w:r>
-              <w:rPr>
-                <w:noProof/>
-                <w:webHidden/>
-              </w:rPr>
-              <w:fldChar w:fldCharType="end"/>
-            </w:r>
-          </w:hyperlink>
-        </w:p>
-        <w:p>
-          <w:pPr>
-            <w:pStyle w:val="TOC2"/>
-            <w:tabs>
-              <w:tab w:val="left" w:pos="960"/>
-              <w:tab w:val="right" w:leader="dot" w:pos="9016"/>
-            </w:tabs>
-            <w:rPr>
-              <w:rFonts w:asciiTheme="minorHAnsi" w:eastAsiaTheme="minorEastAsia" w:hAnsiTheme="minorHAnsi"/>
-              <w:noProof/>
-              <w:lang w:eastAsia="en-ID"/>
-            </w:rPr>
-          </w:pPr>
-          <w:hyperlink w:anchor="_Toc234532621" w:history="1">
-            <w:r>
-              <w:rPr>
-                <w:rStyle w:val="Hyperlink"/>
-                <w:noProof/>
-              </w:rPr>
-              <w:t>4.3.</w:t>
-            </w:r>
-            <w:r>
-              <w:rPr>
-                <w:rFonts w:asciiTheme="minorHAnsi" w:eastAsiaTheme="minorEastAsia" w:hAnsiTheme="minorHAnsi"/>
-                <w:noProof/>
-                <w:lang w:eastAsia="en-ID"/>
-              </w:rPr>
-              <w:tab/>
-            </w:r>
-            <w:r>
-              <w:rPr>
-                <w:rStyle w:val="Hyperlink"/>
-                <w:noProof/>
-              </w:rPr>
-              <w:t>Mengenal JSX</w:t>
-            </w:r>
-            <w:r>
-              <w:rPr>
-                <w:noProof/>
-                <w:webHidden/>
-              </w:rPr>
-              <w:tab/>
-            </w:r>
-            <w:r>
-              <w:rPr>
-                <w:noProof/>
-                <w:webHidden/>
-              </w:rPr>
-              <w:fldChar w:fldCharType="begin"/>
-            </w:r>
-            <w:r>
-              <w:rPr>
-                <w:noProof/>
-                <w:webHidden/>
-              </w:rPr>
-              <w:instrText xml:space="preserve"> PAGEREF _Toc234532621 \h </w:instrText>
-            </w:r>
-            <w:r>
-              <w:rPr>
-                <w:noProof/>
-                <w:webHidden/>
-              </w:rPr>
-            </w:r>
-            <w:r>
-              <w:rPr>
-                <w:noProof/>
-                <w:webHidden/>
-              </w:rPr>
-              <w:fldChar w:fldCharType="separate"/>
-            </w:r>
-            <w:r>
-              <w:rPr>
-                <w:noProof/>
-                <w:webHidden/>
-              </w:rPr>
-              <w:t>29</w:t>
-            </w:r>
-            <w:r>
-              <w:rPr>
-                <w:noProof/>
-                <w:webHidden/>
-              </w:rPr>
-              <w:fldChar w:fldCharType="end"/>
-            </w:r>
-          </w:hyperlink>
-        </w:p>
-        <w:p>
-          <w:pPr>
-            <w:pStyle w:val="TOC2"/>
-            <w:tabs>
-              <w:tab w:val="left" w:pos="960"/>
-              <w:tab w:val="right" w:leader="dot" w:pos="9016"/>
-            </w:tabs>
-            <w:rPr>
-              <w:rFonts w:asciiTheme="minorHAnsi" w:eastAsiaTheme="minorEastAsia" w:hAnsiTheme="minorHAnsi"/>
-              <w:noProof/>
-              <w:lang w:eastAsia="en-ID"/>
-            </w:rPr>
-          </w:pPr>
-          <w:hyperlink w:anchor="_Toc234532622" w:history="1">
-            <w:r>
-              <w:rPr>
-                <w:rStyle w:val="Hyperlink"/>
-                <w:noProof/>
-              </w:rPr>
-              <w:t>4.4.</w:t>
-            </w:r>
-            <w:r>
-              <w:rPr>
-                <w:rFonts w:asciiTheme="minorHAnsi" w:eastAsiaTheme="minorEastAsia" w:hAnsiTheme="minorHAnsi"/>
-                <w:noProof/>
-                <w:lang w:eastAsia="en-ID"/>
-              </w:rPr>
-              <w:tab/>
-            </w:r>
-            <w:r>
-              <w:rPr>
-                <w:rStyle w:val="Hyperlink"/>
-                <w:noProof/>
-              </w:rPr>
-              <w:t>Mengenal Komponen</w:t>
-            </w:r>
-            <w:r>
-              <w:rPr>
-                <w:noProof/>
-                <w:webHidden/>
-              </w:rPr>
-              <w:tab/>
-            </w:r>
-            <w:r>
-              <w:rPr>
-                <w:noProof/>
-                <w:webHidden/>
-              </w:rPr>
-              <w:fldChar w:fldCharType="begin"/>
-            </w:r>
-            <w:r>
-              <w:rPr>
-                <w:noProof/>
-                <w:webHidden/>
-              </w:rPr>
-              <w:instrText xml:space="preserve"> PAGEREF _Toc234532622 \h </w:instrText>
-            </w:r>
-            <w:r>
-              <w:rPr>
-                <w:noProof/>
-                <w:webHidden/>
-              </w:rPr>
-            </w:r>
-            <w:r>
-              <w:rPr>
-                <w:noProof/>
-                <w:webHidden/>
-              </w:rPr>
-              <w:fldChar w:fldCharType="separate"/>
-            </w:r>
-            <w:r>
-              <w:rPr>
-                <w:noProof/>
-                <w:webHidden/>
-              </w:rPr>
-              <w:t>31</w:t>
-            </w:r>
-            <w:r>
-              <w:rPr>
-                <w:noProof/>
-                <w:webHidden/>
-              </w:rPr>
-              <w:fldChar w:fldCharType="end"/>
-            </w:r>
-          </w:hyperlink>
-        </w:p>
-        <w:p>
-          <w:pPr>
-            <w:pStyle w:val="TOC2"/>
-            <w:tabs>
-              <w:tab w:val="left" w:pos="960"/>
-              <w:tab w:val="right" w:leader="dot" w:pos="9016"/>
-            </w:tabs>
-            <w:rPr>
-              <w:rFonts w:asciiTheme="minorHAnsi" w:eastAsiaTheme="minorEastAsia" w:hAnsiTheme="minorHAnsi"/>
-              <w:noProof/>
-              <w:lang w:eastAsia="en-ID"/>
-            </w:rPr>
-          </w:pPr>
-          <w:hyperlink w:anchor="_Toc234532623" w:history="1">
-            <w:r>
-              <w:rPr>
-                <w:rStyle w:val="Hyperlink"/>
-                <w:noProof/>
-              </w:rPr>
-              <w:t>4.5.</w:t>
-            </w:r>
-            <w:r>
-              <w:rPr>
-                <w:rFonts w:asciiTheme="minorHAnsi" w:eastAsiaTheme="minorEastAsia" w:hAnsiTheme="minorHAnsi"/>
-                <w:noProof/>
-                <w:lang w:eastAsia="en-ID"/>
-              </w:rPr>
-              <w:tab/>
-            </w:r>
-            <w:r>
-              <w:rPr>
-                <w:rStyle w:val="Hyperlink"/>
-                <w:noProof/>
-              </w:rPr>
-              <w:t>Membuat Komponen Pertama</w:t>
-            </w:r>
-            <w:r>
-              <w:rPr>
-                <w:noProof/>
-                <w:webHidden/>
-              </w:rPr>
-              <w:tab/>
-            </w:r>
-            <w:r>
-              <w:rPr>
-                <w:noProof/>
-                <w:webHidden/>
-              </w:rPr>
-              <w:fldChar w:fldCharType="begin"/>
-            </w:r>
-            <w:r>
-              <w:rPr>
-                <w:noProof/>
-                <w:webHidden/>
-              </w:rPr>
-              <w:instrText xml:space="preserve"> PAGEREF _Toc234532623 \h </w:instrText>
-            </w:r>
-            <w:r>
-              <w:rPr>
-                <w:noProof/>
-                <w:webHidden/>
-              </w:rPr>
-            </w:r>
-            <w:r>
-              <w:rPr>
-                <w:noProof/>
-                <w:webHidden/>
-              </w:rPr>
-              <w:fldChar w:fldCharType="separate"/>
-            </w:r>
-            <w:r>
-              <w:rPr>
-                <w:noProof/>
-                <w:webHidden/>
-              </w:rPr>
-              <w:t>31</w:t>
-            </w:r>
-            <w:r>
-              <w:rPr>
-                <w:noProof/>
-                <w:webHidden/>
-              </w:rPr>
-              <w:fldChar w:fldCharType="end"/>
-            </w:r>
-          </w:hyperlink>
-        </w:p>
-        <w:p>
-          <w:pPr>
-            <w:pStyle w:val="TOC2"/>
-            <w:tabs>
-              <w:tab w:val="left" w:pos="960"/>
-              <w:tab w:val="right" w:leader="dot" w:pos="9016"/>
-            </w:tabs>
-            <w:rPr>
-              <w:rFonts w:asciiTheme="minorHAnsi" w:eastAsiaTheme="minorEastAsia" w:hAnsiTheme="minorHAnsi"/>
-              <w:noProof/>
-              <w:lang w:eastAsia="en-ID"/>
-            </w:rPr>
-          </w:pPr>
-          <w:hyperlink w:anchor="_Toc234532624" w:history="1">
-            <w:r>
-              <w:rPr>
-                <w:rStyle w:val="Hyperlink"/>
-                <w:noProof/>
-              </w:rPr>
-              <w:t>4.6.</w:t>
-            </w:r>
-            <w:r>
-              <w:rPr>
-                <w:rFonts w:asciiTheme="minorHAnsi" w:eastAsiaTheme="minorEastAsia" w:hAnsiTheme="minorHAnsi"/>
-                <w:noProof/>
-                <w:lang w:eastAsia="en-ID"/>
-              </w:rPr>
-              <w:tab/>
-            </w:r>
-            <w:r>
-              <w:rPr>
-                <w:rStyle w:val="Hyperlink"/>
-                <w:noProof/>
-              </w:rPr>
-              <w:t>Menggunakan Komponen</w:t>
-            </w:r>
-            <w:r>
-              <w:rPr>
-                <w:noProof/>
-                <w:webHidden/>
-              </w:rPr>
-              <w:tab/>
-            </w:r>
-            <w:r>
-              <w:rPr>
-                <w:noProof/>
-                <w:webHidden/>
-              </w:rPr>
-              <w:fldChar w:fldCharType="begin"/>
-            </w:r>
-            <w:r>
-              <w:rPr>
-                <w:noProof/>
-                <w:webHidden/>
-              </w:rPr>
-              <w:instrText xml:space="preserve"> PAGEREF _Toc234532624 \h </w:instrText>
-            </w:r>
-            <w:r>
-              <w:rPr>
-                <w:noProof/>
-                <w:webHidden/>
-              </w:rPr>
-            </w:r>
-            <w:r>
-              <w:rPr>
-                <w:noProof/>
-                <w:webHidden/>
-              </w:rPr>
-              <w:fldChar w:fldCharType="separate"/>
-            </w:r>
-            <w:r>
-              <w:rPr>
-                <w:noProof/>
-                <w:webHidden/>
-              </w:rPr>
-              <w:t>31</w:t>
-            </w:r>
-            <w:r>
-              <w:rPr>
-                <w:noProof/>
-                <w:webHidden/>
-              </w:rPr>
-              <w:fldChar w:fldCharType="end"/>
-            </w:r>
-          </w:hyperlink>
-        </w:p>
-        <w:p>
-          <w:pPr>
-            <w:pStyle w:val="TOC2"/>
-            <w:tabs>
-              <w:tab w:val="left" w:pos="960"/>
-              <w:tab w:val="right" w:leader="dot" w:pos="9016"/>
-            </w:tabs>
-            <w:rPr>
-              <w:rFonts w:asciiTheme="minorHAnsi" w:eastAsiaTheme="minorEastAsia" w:hAnsiTheme="minorHAnsi"/>
-              <w:noProof/>
-              <w:lang w:eastAsia="en-ID"/>
-            </w:rPr>
-          </w:pPr>
-          <w:hyperlink w:anchor="_Toc234532625" w:history="1">
-            <w:r>
-              <w:rPr>
-                <w:rStyle w:val="Hyperlink"/>
-                <w:noProof/>
-              </w:rPr>
-              <w:t>4.7.</w:t>
-            </w:r>
-            <w:r>
-              <w:rPr>
-                <w:rFonts w:asciiTheme="minorHAnsi" w:eastAsiaTheme="minorEastAsia" w:hAnsiTheme="minorHAnsi"/>
-                <w:noProof/>
-                <w:lang w:eastAsia="en-ID"/>
-              </w:rPr>
-              <w:tab/>
-            </w:r>
-            <w:r>
-              <w:rPr>
-                <w:rStyle w:val="Hyperlink"/>
-                <w:noProof/>
-              </w:rPr>
-              <w:t>Ringkasan Bab</w:t>
-            </w:r>
-            <w:r>
-              <w:rPr>
-                <w:noProof/>
-                <w:webHidden/>
-              </w:rPr>
-              <w:tab/>
-            </w:r>
-            <w:r>
-              <w:rPr>
-                <w:noProof/>
-                <w:webHidden/>
-              </w:rPr>
-              <w:fldChar w:fldCharType="begin"/>
-            </w:r>
-            <w:r>
-              <w:rPr>
-                <w:noProof/>
-                <w:webHidden/>
-              </w:rPr>
-              <w:instrText xml:space="preserve"> PAGEREF _Toc234532625 \h </w:instrText>
-            </w:r>
-            <w:r>
-              <w:rPr>
-                <w:noProof/>
-                <w:webHidden/>
-              </w:rPr>
-            </w:r>
-            <w:r>
-              <w:rPr>
-                <w:noProof/>
-                <w:webHidden/>
-              </w:rPr>
-              <w:fldChar w:fldCharType="separate"/>
-            </w:r>
-            <w:r>
-              <w:rPr>
-                <w:noProof/>
-                <w:webHidden/>
-              </w:rPr>
-              <w:t>31</w:t>
-            </w:r>
-            <w:r>
-              <w:rPr>
-                <w:noProof/>
                 <w:webHidden/>
               </w:rPr>
               <w:fldChar w:fldCharType="end"/>
@@ -3001,7 +1737,7 @@
       <w:pPr>
         <w:pStyle w:val="Heading1"/>
       </w:pPr>
-      <w:bookmarkStart w:id="2" w:name="_Toc234532595"/>
+      <w:bookmarkStart w:id="2" w:name="_Toc234654641"/>
       <w:r>
         <w:lastRenderedPageBreak/>
         <w:t>BAB I</w:t>
@@ -3024,7 +1760,7 @@
         </w:numPr>
         <w:ind w:left="540" w:hanging="630"/>
       </w:pPr>
-      <w:bookmarkStart w:id="3" w:name="_Toc234532596"/>
+      <w:bookmarkStart w:id="3" w:name="_Toc234654642"/>
       <w:r>
         <w:t>Pendahuluan</w:t>
       </w:r>
@@ -3088,7 +1824,7 @@
         </w:numPr>
         <w:ind w:left="450" w:hanging="450"/>
       </w:pPr>
-      <w:bookmarkStart w:id="4" w:name="_Toc234532597"/>
+      <w:bookmarkStart w:id="4" w:name="_Toc234654643"/>
       <w:r>
         <w:t>Variabel (let dan const)</w:t>
       </w:r>
@@ -3697,7 +2433,7 @@
         </w:numPr>
         <w:ind w:left="450" w:hanging="450"/>
       </w:pPr>
-      <w:bookmarkStart w:id="5" w:name="_Toc234532598"/>
+      <w:bookmarkStart w:id="5" w:name="_Toc234654644"/>
       <w:r>
         <w:lastRenderedPageBreak/>
         <w:t>Arrow Function</w:t>
@@ -4190,7 +2926,7 @@
         </w:numPr>
         <w:ind w:left="450" w:hanging="450"/>
       </w:pPr>
-      <w:bookmarkStart w:id="6" w:name="_Toc234532599"/>
+      <w:bookmarkStart w:id="6" w:name="_Toc234654645"/>
       <w:r>
         <w:lastRenderedPageBreak/>
         <w:t>Template Literals</w:t>
@@ -4437,7 +3173,7 @@
         </w:numPr>
         <w:ind w:left="450" w:hanging="450"/>
       </w:pPr>
-      <w:bookmarkStart w:id="7" w:name="_Toc234532600"/>
+      <w:bookmarkStart w:id="7" w:name="_Toc234654646"/>
       <w:r>
         <w:lastRenderedPageBreak/>
         <w:t>Destructuring Assignment</w:t>
@@ -4887,7 +3623,7 @@
       <w:r>
         <w:br w:type="page"/>
       </w:r>
-      <w:bookmarkStart w:id="8" w:name="_Toc234532601"/>
+      <w:bookmarkStart w:id="8" w:name="_Toc234654647"/>
       <w:r>
         <w:lastRenderedPageBreak/>
         <w:t>Spread dan Rest Operator</w:t>
@@ -5207,7 +3943,7 @@
         </w:numPr>
         <w:ind w:left="450" w:hanging="450"/>
       </w:pPr>
-      <w:bookmarkStart w:id="9" w:name="_Toc234532602"/>
+      <w:bookmarkStart w:id="9" w:name="_Toc234654648"/>
       <w:r>
         <w:lastRenderedPageBreak/>
         <w:t>Ringkasan Bab</w:t>
@@ -5328,7 +4064,7 @@
       <w:pPr>
         <w:pStyle w:val="Heading1"/>
       </w:pPr>
-      <w:bookmarkStart w:id="10" w:name="_Toc234532603"/>
+      <w:bookmarkStart w:id="10" w:name="_Toc234654649"/>
       <w:r>
         <w:lastRenderedPageBreak/>
         <w:t>BAB 2</w:t>
@@ -5349,7 +4085,7 @@
         </w:numPr>
         <w:ind w:left="450" w:hanging="450"/>
       </w:pPr>
-      <w:bookmarkStart w:id="11" w:name="_Toc234532604"/>
+      <w:bookmarkStart w:id="11" w:name="_Toc234654650"/>
       <w:r>
         <w:t>Pendahuluan</w:t>
       </w:r>
@@ -5421,7 +4157,7 @@
         </w:numPr>
         <w:ind w:left="450" w:hanging="450"/>
       </w:pPr>
-      <w:bookmarkStart w:id="12" w:name="_Toc234532605"/>
+      <w:bookmarkStart w:id="12" w:name="_Toc234654651"/>
       <w:r>
         <w:t>Node.js</w:t>
       </w:r>
@@ -5916,7 +4652,7 @@
         </w:numPr>
         <w:ind w:left="426"/>
       </w:pPr>
-      <w:bookmarkStart w:id="13" w:name="_Toc234532606"/>
+      <w:bookmarkStart w:id="13" w:name="_Toc234654652"/>
       <w:r>
         <w:t>Pengenalan npm (Node Package Manager)</w:t>
       </w:r>
@@ -6755,7 +5491,7 @@
         </w:numPr>
         <w:ind w:left="426"/>
       </w:pPr>
-      <w:bookmarkStart w:id="14" w:name="_Toc234532607"/>
+      <w:bookmarkStart w:id="14" w:name="_Toc234654653"/>
       <w:r>
         <w:t>Pengenalan pnpm</w:t>
       </w:r>
@@ -7186,7 +5922,7 @@
         </w:numPr>
         <w:ind w:left="426"/>
       </w:pPr>
-      <w:bookmarkStart w:id="15" w:name="_Toc234532608"/>
+      <w:bookmarkStart w:id="15" w:name="_Toc234654654"/>
       <w:r>
         <w:lastRenderedPageBreak/>
         <w:t>Membuat dan Mengelola Project</w:t>
@@ -7664,7 +6400,7 @@
         </w:numPr>
         <w:ind w:left="426"/>
       </w:pPr>
-      <w:bookmarkStart w:id="16" w:name="_Toc234532609"/>
+      <w:bookmarkStart w:id="16" w:name="_Toc234654655"/>
       <w:r>
         <w:t>Ringkasan Bab</w:t>
       </w:r>
@@ -7733,7 +6469,7 @@
       <w:r>
         <w:br w:type="page"/>
       </w:r>
-      <w:bookmarkStart w:id="17" w:name="_Toc234532610"/>
+      <w:bookmarkStart w:id="17" w:name="_Toc234654656"/>
       <w:r>
         <w:lastRenderedPageBreak/>
         <w:t xml:space="preserve">BAB 3 </w:t>
@@ -7747,2131 +6483,79 @@
     <w:p/>
     <w:p>
       <w:pPr>
-        <w:pStyle w:val="Heading2"/>
-        <w:numPr>
-          <w:ilvl w:val="1"/>
-          <w:numId w:val="15"/>
-        </w:numPr>
-        <w:ind w:left="426"/>
-      </w:pPr>
-      <w:bookmarkStart w:id="18" w:name="_Toc234532611"/>
-      <w:r>
-        <w:t>Pendahuluan</w:t>
-      </w:r>
-      <w:bookmarkEnd w:id="18"/>
-    </w:p>
-    <w:p>
-      <w:pPr>
-        <w:ind w:firstLine="426"/>
-      </w:pPr>
-      <w:r>
-        <w:t>Pada bab sebelumnya, peserta telah mempelajari cara menginstal Node.js, mengenal npm dan pnpm, serta memahami fungsi package manager dalam pengembangan aplikasi JavaScript. Setelah lingkungan pengembangan siap digunakan, langkah berikutnya adalah membuat proyek React yang akan digunakan selama proses pelatihan.</w:t>
-      </w:r>
-    </w:p>
-    <w:p>
-      <w:pPr>
-        <w:ind w:firstLine="426"/>
-      </w:pPr>
-      <w:r>
-        <w:t>Dalam pelatihan ini, peserta akan mengembangkan sebuah aplikasi sederhana bernama CareerHub, yaitu sebuah aplikasi Mini Job Portal yang digunakan untuk menampilkan daftar lowongan pekerjaan. Aplikasi ini akan terus dikembangkan secara bertahap hingga pertemuan terakhir, sehingga setiap materi yang dipelajari akan langsung diterapkan pada proyek yang sama.</w:t>
-      </w:r>
-    </w:p>
-    <w:p>
-      <w:pPr>
-        <w:ind w:firstLine="426"/>
-      </w:pPr>
-      <w:r>
-        <w:t>Pada bab ini peserta akan mempelajari cara membuat proyek React menggunakan Vite, menjalankan aplikasi pertama, memahami struktur folder proyek, serta mengenal beberapa perintah dasar pnpm yang digunakan dalam proses pengembangan.</w:t>
-      </w:r>
-    </w:p>
-    <w:p>
-      <w:pPr>
-        <w:ind w:firstLine="426"/>
-      </w:pPr>
-      <w:r>
-        <w:rPr>
-          <w:b/>
-          <w:bCs/>
-        </w:rPr>
-        <w:t>Studi Kasus</w:t>
-      </w:r>
-    </w:p>
-    <w:p>
-      <w:pPr>
-        <w:ind w:firstLine="426"/>
-      </w:pPr>
-      <w:r>
-        <w:t>Project Pelatihan : CareerHub</w:t>
-      </w:r>
-    </w:p>
-    <w:p>
-      <w:pPr>
-        <w:ind w:firstLine="426"/>
-      </w:pPr>
-      <w:r>
-        <w:t>Selama pelatihan React Fundamental, seluruh materi akan diterapkan pada satu proyek yang sama, yaitu CareerHub.</w:t>
-      </w:r>
-    </w:p>
-    <w:p>
-      <w:pPr>
-        <w:ind w:firstLine="426"/>
-      </w:pPr>
-      <w:r>
-        <w:t>CareerHub merupakan aplikasi sederhana yang berfungsi untuk menampilkan informasi lowongan pekerjaan. Seiring bertambahnya materi, aplikasi ini akan dikembangkan menjadi lebih lengkap dengan berbagai fitur seperti pencarian, pengurutan data, pagination, editing data, routing, hingga deployment ke internet.</w:t>
-      </w:r>
-    </w:p>
-    <w:p>
-      <w:pPr>
-        <w:ind w:firstLine="426"/>
-      </w:pPr>
-      <w:r>
-        <w:lastRenderedPageBreak/>
-        <w:t>Pada bab ini peserta belum akan membuat fitur-fitur tersebut. Fokus utama adalah membuat proyek React dan memastikan aplikasi dapat dijalankan dengan baik.</w:t>
-      </w:r>
-    </w:p>
-    <w:p>
-      <w:pPr>
-        <w:ind w:firstLine="426"/>
-      </w:pPr>
-    </w:p>
-    <w:p>
-      <w:pPr>
-        <w:pStyle w:val="Heading2"/>
-        <w:numPr>
-          <w:ilvl w:val="1"/>
-          <w:numId w:val="15"/>
-        </w:numPr>
-        <w:ind w:left="426"/>
-      </w:pPr>
-      <w:bookmarkStart w:id="19" w:name="_Toc234532612"/>
-      <w:r>
-        <w:t>Mengenal Vite</w:t>
-      </w:r>
-      <w:bookmarkEnd w:id="19"/>
-    </w:p>
-    <w:p>
-      <w:pPr>
-        <w:ind w:firstLine="426"/>
-      </w:pPr>
-      <w:r>
-        <w:t>Vite merupakan sebuah build tool modern yang digunakan untuk membuat dan menjalankan aplikasi JavaScript seperti React, Vue, maupun framework lainnya.</w:t>
-      </w:r>
-    </w:p>
-    <w:p>
-      <w:pPr>
-        <w:ind w:firstLine="426"/>
-      </w:pPr>
-      <w:r>
-        <w:t>Vite dirancang agar proses pengembangan aplikasi menjadi lebih cepat dibandingkan build tool sebelumnya, seperti Create React App (CRA). Dengan Vite, proses menjalankan aplikasi dan memperbarui perubahan kode (Hot Module Replacement) berlangsung hampir secara instan sehingga sangat membantu selama proses pengembangan.</w:t>
-      </w:r>
-    </w:p>
-    <w:p>
-      <w:pPr>
-        <w:ind w:firstLine="426"/>
-      </w:pPr>
-      <w:r>
-        <w:t>Pada pelatihan ini seluruh proyek React akan dibuat menggunakan Vite.</w:t>
-      </w:r>
-    </w:p>
-    <w:p>
-      <w:pPr>
-        <w:ind w:firstLine="426"/>
-        <w:rPr>
-          <w:b/>
-          <w:bCs/>
-        </w:rPr>
-      </w:pPr>
-      <w:r>
-        <w:rPr>
-          <w:b/>
-          <w:bCs/>
-        </w:rPr>
-        <w:t>Keunggulan Vite</w:t>
-      </w:r>
-    </w:p>
-    <w:p>
-      <w:pPr>
-        <w:ind w:firstLine="426"/>
-      </w:pPr>
-      <w:r>
-        <w:t>Beberapa kelebihan Vite antara lain:</w:t>
-      </w:r>
-    </w:p>
-    <w:p>
-      <w:pPr>
-        <w:pStyle w:val="ListParagraph"/>
-        <w:numPr>
-          <w:ilvl w:val="0"/>
-          <w:numId w:val="16"/>
-        </w:numPr>
-      </w:pPr>
-      <w:r>
-        <w:t>Proses pembuatan proyek lebih cepat.</w:t>
-      </w:r>
-    </w:p>
-    <w:p>
-      <w:pPr>
-        <w:pStyle w:val="ListParagraph"/>
-        <w:numPr>
-          <w:ilvl w:val="0"/>
-          <w:numId w:val="16"/>
-        </w:numPr>
-      </w:pPr>
-      <w:r>
-        <w:t>Startup development server sangat ringan.</w:t>
-      </w:r>
-    </w:p>
-    <w:p>
-      <w:pPr>
-        <w:pStyle w:val="ListParagraph"/>
-        <w:numPr>
-          <w:ilvl w:val="0"/>
-          <w:numId w:val="16"/>
-        </w:numPr>
-      </w:pPr>
-      <w:r>
-        <w:t>Mendukung Hot Module Replacement (HMR).</w:t>
-      </w:r>
-    </w:p>
-    <w:p>
-      <w:pPr>
-        <w:pStyle w:val="ListParagraph"/>
-        <w:numPr>
-          <w:ilvl w:val="0"/>
-          <w:numId w:val="16"/>
-        </w:numPr>
-      </w:pPr>
-      <w:r>
-        <w:t>Konfigurasi sederhana.</w:t>
-      </w:r>
-    </w:p>
-    <w:p>
-      <w:pPr>
-        <w:pStyle w:val="ListParagraph"/>
-        <w:numPr>
-          <w:ilvl w:val="0"/>
-          <w:numId w:val="16"/>
-        </w:numPr>
-      </w:pPr>
-      <w:r>
-        <w:t>Cocok digunakan untuk pengembangan React modern.</w:t>
-      </w:r>
-    </w:p>
-    <w:p>
-      <w:pPr>
-        <w:ind w:firstLine="426"/>
-      </w:pPr>
-    </w:p>
-    <w:p>
-      <w:pPr>
-        <w:pStyle w:val="Heading2"/>
-        <w:numPr>
-          <w:ilvl w:val="1"/>
-          <w:numId w:val="15"/>
-        </w:numPr>
-        <w:ind w:left="426"/>
-      </w:pPr>
-      <w:bookmarkStart w:id="20" w:name="_Toc234532613"/>
-      <w:r>
-        <w:t>Membuat Project</w:t>
-      </w:r>
-      <w:bookmarkEnd w:id="20"/>
-    </w:p>
-    <w:p>
-      <w:r>
-        <w:t>Buka Terminal atau Command Prompt kemudian jalankan perintah berikut.</w:t>
-      </w:r>
-    </w:p>
-    <w:p>
-      <w:r>
-        <w:drawing>
-          <wp:inline distT="0" distB="0" distL="0" distR="0" wp14:anchorId="5D920248" wp14:editId="456E72E6">
-            <wp:extent cx="3610479" cy="866896"/>
-            <wp:effectExtent l="0" t="0" r="9525" b="9525"/>
-            <wp:docPr id="1132955031" name="Picture 1"/>
-            <wp:cNvGraphicFramePr>
-              <a:graphicFrameLocks xmlns:a="http://schemas.openxmlformats.org/drawingml/2006/main" noChangeAspect="1"/>
-            </wp:cNvGraphicFramePr>
-            <a:graphic xmlns:a="http://schemas.openxmlformats.org/drawingml/2006/main">
-              <a:graphicData uri="http://schemas.openxmlformats.org/drawingml/2006/picture">
-                <pic:pic xmlns:pic="http://schemas.openxmlformats.org/drawingml/2006/picture">
-                  <pic:nvPicPr>
-                    <pic:cNvPr id="1132955031" name=""/>
-                    <pic:cNvPicPr/>
-                  </pic:nvPicPr>
-                  <pic:blipFill>
-                    <a:blip r:embed="rId60"/>
-                    <a:stretch>
-                      <a:fillRect/>
-                    </a:stretch>
-                  </pic:blipFill>
-                  <pic:spPr>
-                    <a:xfrm>
-                      <a:off x="0" y="0"/>
-                      <a:ext cx="3610479" cy="866896"/>
-                    </a:xfrm>
-                    <a:prstGeom prst="rect">
-                      <a:avLst/>
-                    </a:prstGeom>
-                  </pic:spPr>
-                </pic:pic>
-              </a:graphicData>
-            </a:graphic>
-          </wp:inline>
-        </w:drawing>
-      </w:r>
-    </w:p>
-    <w:p>
-      <w:r>
-        <w:lastRenderedPageBreak/>
-        <w:t>Selanjutnya akan muncul beberapa pertanyaan.</w:t>
-      </w:r>
-    </w:p>
-    <w:p>
-      <w:r>
-        <w:drawing>
-          <wp:inline distT="0" distB="0" distL="0" distR="0" wp14:anchorId="76639B07" wp14:editId="2C1A864F">
-            <wp:extent cx="5731510" cy="2809240"/>
-            <wp:effectExtent l="0" t="0" r="2540" b="0"/>
-            <wp:docPr id="943736694" name="Picture 1"/>
-            <wp:cNvGraphicFramePr>
-              <a:graphicFrameLocks xmlns:a="http://schemas.openxmlformats.org/drawingml/2006/main" noChangeAspect="1"/>
-            </wp:cNvGraphicFramePr>
-            <a:graphic xmlns:a="http://schemas.openxmlformats.org/drawingml/2006/main">
-              <a:graphicData uri="http://schemas.openxmlformats.org/drawingml/2006/picture">
-                <pic:pic xmlns:pic="http://schemas.openxmlformats.org/drawingml/2006/picture">
-                  <pic:nvPicPr>
-                    <pic:cNvPr id="943736694" name=""/>
-                    <pic:cNvPicPr/>
-                  </pic:nvPicPr>
-                  <pic:blipFill>
-                    <a:blip r:embed="rId61"/>
-                    <a:stretch>
-                      <a:fillRect/>
-                    </a:stretch>
-                  </pic:blipFill>
-                  <pic:spPr>
-                    <a:xfrm>
-                      <a:off x="0" y="0"/>
-                      <a:ext cx="5731510" cy="2809240"/>
-                    </a:xfrm>
-                    <a:prstGeom prst="rect">
-                      <a:avLst/>
-                    </a:prstGeom>
-                  </pic:spPr>
-                </pic:pic>
-              </a:graphicData>
-            </a:graphic>
-          </wp:inline>
-        </w:drawing>
-      </w:r>
-    </w:p>
-    <w:p>
-      <w:r>
-        <w:t>Apabila proses berhasil maka akan terbentuk folder project baru bernama careerhub.</w:t>
-      </w:r>
-    </w:p>
-    <w:p>
-      <w:pPr>
-        <w:rPr>
-          <w:b/>
-          <w:bCs/>
-        </w:rPr>
-      </w:pPr>
-      <w:r>
-        <w:rPr>
-          <w:b/>
-          <w:bCs/>
-        </w:rPr>
-        <w:t>Masuk ke Folder Project</w:t>
-      </w:r>
-    </w:p>
-    <w:p>
-      <w:r>
-        <w:t>Masuk ke folder project menggunakan perintah berikut.</w:t>
-      </w:r>
-    </w:p>
-    <w:p>
-      <w:r>
-        <w:drawing>
-          <wp:inline distT="0" distB="0" distL="0" distR="0" wp14:anchorId="10FDB1C6" wp14:editId="6F99C38E">
-            <wp:extent cx="3581900" cy="819264"/>
-            <wp:effectExtent l="0" t="0" r="0" b="0"/>
-            <wp:docPr id="896717794" name="Picture 1"/>
-            <wp:cNvGraphicFramePr>
-              <a:graphicFrameLocks xmlns:a="http://schemas.openxmlformats.org/drawingml/2006/main" noChangeAspect="1"/>
-            </wp:cNvGraphicFramePr>
-            <a:graphic xmlns:a="http://schemas.openxmlformats.org/drawingml/2006/main">
-              <a:graphicData uri="http://schemas.openxmlformats.org/drawingml/2006/picture">
-                <pic:pic xmlns:pic="http://schemas.openxmlformats.org/drawingml/2006/picture">
-                  <pic:nvPicPr>
-                    <pic:cNvPr id="896717794" name=""/>
-                    <pic:cNvPicPr/>
-                  </pic:nvPicPr>
-                  <pic:blipFill>
-                    <a:blip r:embed="rId62"/>
-                    <a:stretch>
-                      <a:fillRect/>
-                    </a:stretch>
-                  </pic:blipFill>
-                  <pic:spPr>
-                    <a:xfrm>
-                      <a:off x="0" y="0"/>
-                      <a:ext cx="3581900" cy="819264"/>
-                    </a:xfrm>
-                    <a:prstGeom prst="rect">
-                      <a:avLst/>
-                    </a:prstGeom>
-                  </pic:spPr>
-                </pic:pic>
-              </a:graphicData>
-            </a:graphic>
-          </wp:inline>
-        </w:drawing>
-      </w:r>
-    </w:p>
-    <w:p>
-      <w:pPr>
-        <w:rPr>
-          <w:b/>
-          <w:bCs/>
-        </w:rPr>
-      </w:pPr>
-      <w:r>
-        <w:rPr>
-          <w:b/>
-          <w:bCs/>
-        </w:rPr>
-        <w:t>Menjalankan Project</w:t>
-      </w:r>
-    </w:p>
-    <w:p>
-      <w:r>
-        <w:t>Setelah dependency selesai diinstal, jalankan project.</w:t>
-      </w:r>
-    </w:p>
-    <w:p>
-      <w:r>
-        <w:drawing>
-          <wp:inline distT="0" distB="0" distL="0" distR="0" wp14:anchorId="0995FAA6" wp14:editId="59BD5B97">
-            <wp:extent cx="3620005" cy="847843"/>
-            <wp:effectExtent l="0" t="0" r="0" b="9525"/>
-            <wp:docPr id="1396865868" name="Picture 1"/>
-            <wp:cNvGraphicFramePr>
-              <a:graphicFrameLocks xmlns:a="http://schemas.openxmlformats.org/drawingml/2006/main" noChangeAspect="1"/>
-            </wp:cNvGraphicFramePr>
-            <a:graphic xmlns:a="http://schemas.openxmlformats.org/drawingml/2006/main">
-              <a:graphicData uri="http://schemas.openxmlformats.org/drawingml/2006/picture">
-                <pic:pic xmlns:pic="http://schemas.openxmlformats.org/drawingml/2006/picture">
-                  <pic:nvPicPr>
-                    <pic:cNvPr id="1396865868" name=""/>
-                    <pic:cNvPicPr/>
-                  </pic:nvPicPr>
-                  <pic:blipFill>
-                    <a:blip r:embed="rId63"/>
-                    <a:stretch>
-                      <a:fillRect/>
-                    </a:stretch>
-                  </pic:blipFill>
-                  <pic:spPr>
-                    <a:xfrm>
-                      <a:off x="0" y="0"/>
-                      <a:ext cx="3620005" cy="847843"/>
-                    </a:xfrm>
-                    <a:prstGeom prst="rect">
-                      <a:avLst/>
-                    </a:prstGeom>
-                  </pic:spPr>
-                </pic:pic>
-              </a:graphicData>
-            </a:graphic>
-          </wp:inline>
-        </w:drawing>
-      </w:r>
-    </w:p>
-    <w:p/>
-    <w:p>
-      <w:pPr>
-        <w:spacing w:line="278" w:lineRule="auto"/>
-        <w:jc w:val="left"/>
-      </w:pPr>
-      <w:r>
-        <w:br w:type="page"/>
-      </w:r>
-    </w:p>
-    <w:p>
-      <w:r>
-        <w:lastRenderedPageBreak/>
-        <w:t>Apabila berhasil akan muncul tampilan seperti berikut.</w:t>
-      </w:r>
-    </w:p>
-    <w:p>
-      <w:r>
-        <w:drawing>
-          <wp:inline distT="0" distB="0" distL="0" distR="0" wp14:anchorId="2BD2517F" wp14:editId="068981F7">
-            <wp:extent cx="5731510" cy="1236345"/>
-            <wp:effectExtent l="0" t="0" r="2540" b="1905"/>
-            <wp:docPr id="1643974134" name="Picture 1"/>
-            <wp:cNvGraphicFramePr>
-              <a:graphicFrameLocks xmlns:a="http://schemas.openxmlformats.org/drawingml/2006/main" noChangeAspect="1"/>
-            </wp:cNvGraphicFramePr>
-            <a:graphic xmlns:a="http://schemas.openxmlformats.org/drawingml/2006/main">
-              <a:graphicData uri="http://schemas.openxmlformats.org/drawingml/2006/picture">
-                <pic:pic xmlns:pic="http://schemas.openxmlformats.org/drawingml/2006/picture">
-                  <pic:nvPicPr>
-                    <pic:cNvPr id="1643974134" name=""/>
-                    <pic:cNvPicPr/>
-                  </pic:nvPicPr>
-                  <pic:blipFill>
-                    <a:blip r:embed="rId64"/>
-                    <a:stretch>
-                      <a:fillRect/>
-                    </a:stretch>
-                  </pic:blipFill>
-                  <pic:spPr>
-                    <a:xfrm>
-                      <a:off x="0" y="0"/>
-                      <a:ext cx="5731510" cy="1236345"/>
-                    </a:xfrm>
-                    <a:prstGeom prst="rect">
-                      <a:avLst/>
-                    </a:prstGeom>
-                  </pic:spPr>
-                </pic:pic>
-              </a:graphicData>
-            </a:graphic>
-          </wp:inline>
-        </w:drawing>
-      </w:r>
-    </w:p>
-    <w:p>
-      <w:r>
-        <w:t>Buka browser kemudian akses alamat tersebut.</w:t>
-      </w:r>
-    </w:p>
-    <w:p>
-      <w:r>
-        <w:drawing>
-          <wp:inline distT="0" distB="0" distL="0" distR="0" wp14:anchorId="39F217E7" wp14:editId="178BD5D5">
-            <wp:extent cx="3629532" cy="866896"/>
-            <wp:effectExtent l="0" t="0" r="9525" b="9525"/>
-            <wp:docPr id="521392598" name="Picture 1"/>
-            <wp:cNvGraphicFramePr>
-              <a:graphicFrameLocks xmlns:a="http://schemas.openxmlformats.org/drawingml/2006/main" noChangeAspect="1"/>
-            </wp:cNvGraphicFramePr>
-            <a:graphic xmlns:a="http://schemas.openxmlformats.org/drawingml/2006/main">
-              <a:graphicData uri="http://schemas.openxmlformats.org/drawingml/2006/picture">
-                <pic:pic xmlns:pic="http://schemas.openxmlformats.org/drawingml/2006/picture">
-                  <pic:nvPicPr>
-                    <pic:cNvPr id="521392598" name=""/>
-                    <pic:cNvPicPr/>
-                  </pic:nvPicPr>
-                  <pic:blipFill>
-                    <a:blip r:embed="rId65"/>
-                    <a:stretch>
-                      <a:fillRect/>
-                    </a:stretch>
-                  </pic:blipFill>
-                  <pic:spPr>
-                    <a:xfrm>
-                      <a:off x="0" y="0"/>
-                      <a:ext cx="3629532" cy="866896"/>
-                    </a:xfrm>
-                    <a:prstGeom prst="rect">
-                      <a:avLst/>
-                    </a:prstGeom>
-                  </pic:spPr>
-                </pic:pic>
-              </a:graphicData>
-            </a:graphic>
-          </wp:inline>
-        </w:drawing>
-      </w:r>
-    </w:p>
-    <w:p>
-      <w:r>
-        <w:t>Jika berhasil maka akan muncul halaman awal React bawaan Vite.</w:t>
-      </w:r>
-    </w:p>
-    <w:p/>
-    <w:p>
-      <w:pPr>
-        <w:pStyle w:val="Heading2"/>
-        <w:numPr>
-          <w:ilvl w:val="1"/>
-          <w:numId w:val="15"/>
-        </w:numPr>
-        <w:ind w:left="426"/>
-      </w:pPr>
-      <w:bookmarkStart w:id="21" w:name="_Toc234532614"/>
-      <w:r>
-        <w:t>Struktur Folder Project</w:t>
-      </w:r>
-      <w:bookmarkEnd w:id="21"/>
-    </w:p>
-    <w:p>
-      <w:r>
-        <w:t>Setelah project berhasil dibuat, akan muncul struktur folder seperti berikut.</w:t>
-      </w:r>
-    </w:p>
-    <w:p>
-      <w:r>
-        <w:drawing>
-          <wp:inline distT="0" distB="0" distL="0" distR="0" wp14:anchorId="71BA61DE" wp14:editId="16496B13">
-            <wp:extent cx="2391109" cy="2400635"/>
-            <wp:effectExtent l="0" t="0" r="9525" b="0"/>
-            <wp:docPr id="1650972995" name="Picture 1"/>
-            <wp:cNvGraphicFramePr>
-              <a:graphicFrameLocks xmlns:a="http://schemas.openxmlformats.org/drawingml/2006/main" noChangeAspect="1"/>
-            </wp:cNvGraphicFramePr>
-            <a:graphic xmlns:a="http://schemas.openxmlformats.org/drawingml/2006/main">
-              <a:graphicData uri="http://schemas.openxmlformats.org/drawingml/2006/picture">
-                <pic:pic xmlns:pic="http://schemas.openxmlformats.org/drawingml/2006/picture">
-                  <pic:nvPicPr>
-                    <pic:cNvPr id="1650972995" name=""/>
-                    <pic:cNvPicPr/>
-                  </pic:nvPicPr>
-                  <pic:blipFill>
-                    <a:blip r:embed="rId66"/>
-                    <a:stretch>
-                      <a:fillRect/>
-                    </a:stretch>
-                  </pic:blipFill>
-                  <pic:spPr>
-                    <a:xfrm>
-                      <a:off x="0" y="0"/>
-                      <a:ext cx="2391109" cy="2400635"/>
-                    </a:xfrm>
-                    <a:prstGeom prst="rect">
-                      <a:avLst/>
-                    </a:prstGeom>
-                  </pic:spPr>
-                </pic:pic>
-              </a:graphicData>
-            </a:graphic>
-          </wp:inline>
-        </w:drawing>
-      </w:r>
-    </w:p>
-    <w:p>
-      <w:r>
-        <w:t>Berikut penjelasan fungsi masing-masing folder.</w:t>
-      </w:r>
-    </w:p>
-    <w:tbl>
-      <w:tblPr>
-        <w:tblStyle w:val="TableGrid"/>
-        <w:tblW w:w="0" w:type="auto"/>
-        <w:tblLook w:val="04A0" w:firstRow="1" w:lastRow="0" w:firstColumn="1" w:lastColumn="0" w:noHBand="0" w:noVBand="1"/>
-      </w:tblPr>
-      <w:tblGrid>
-        <w:gridCol w:w="1944"/>
-        <w:gridCol w:w="6311"/>
-      </w:tblGrid>
-      <w:tr>
-        <w:tc>
-          <w:tcPr>
-            <w:tcW w:w="0" w:type="auto"/>
-            <w:hideMark/>
-          </w:tcPr>
-          <w:p>
-            <w:pPr>
-              <w:spacing w:after="160"/>
-              <w:jc w:val="center"/>
-              <w:rPr>
-                <w:b/>
-                <w:bCs/>
-              </w:rPr>
-            </w:pPr>
-            <w:r>
-              <w:rPr>
-                <w:b/>
-                <w:bCs/>
-              </w:rPr>
-              <w:t>Folder</w:t>
-            </w:r>
-          </w:p>
-        </w:tc>
-        <w:tc>
-          <w:tcPr>
-            <w:tcW w:w="0" w:type="auto"/>
-            <w:hideMark/>
-          </w:tcPr>
-          <w:p>
-            <w:pPr>
-              <w:spacing w:after="160"/>
-              <w:jc w:val="center"/>
-              <w:rPr>
-                <w:b/>
-                <w:bCs/>
-              </w:rPr>
-            </w:pPr>
-            <w:r>
-              <w:rPr>
-                <w:b/>
-                <w:bCs/>
-              </w:rPr>
-              <w:t>Fungsi</w:t>
-            </w:r>
-          </w:p>
-        </w:tc>
-      </w:tr>
-      <w:tr>
-        <w:tc>
-          <w:tcPr>
-            <w:tcW w:w="0" w:type="auto"/>
-            <w:hideMark/>
-          </w:tcPr>
-          <w:p>
-            <w:pPr>
-              <w:spacing w:after="160"/>
-            </w:pPr>
-            <w:r>
-              <w:t>src</w:t>
-            </w:r>
-          </w:p>
-        </w:tc>
-        <w:tc>
-          <w:tcPr>
-            <w:tcW w:w="0" w:type="auto"/>
-            <w:hideMark/>
-          </w:tcPr>
-          <w:p>
-            <w:pPr>
-              <w:spacing w:after="160"/>
-            </w:pPr>
-            <w:r>
-              <w:t>Tempat seluruh kode React ditulis.</w:t>
-            </w:r>
-          </w:p>
-        </w:tc>
-      </w:tr>
-      <w:tr>
-        <w:tc>
-          <w:tcPr>
-            <w:tcW w:w="0" w:type="auto"/>
-            <w:hideMark/>
-          </w:tcPr>
-          <w:p>
-            <w:pPr>
-              <w:spacing w:after="160"/>
-            </w:pPr>
-            <w:r>
-              <w:lastRenderedPageBreak/>
-              <w:t>public</w:t>
-            </w:r>
-          </w:p>
-        </w:tc>
-        <w:tc>
-          <w:tcPr>
-            <w:tcW w:w="0" w:type="auto"/>
-            <w:hideMark/>
-          </w:tcPr>
-          <w:p>
-            <w:pPr>
-              <w:spacing w:after="160"/>
-            </w:pPr>
-            <w:r>
-              <w:t>Menyimpan file statis seperti gambar atau favicon.</w:t>
-            </w:r>
-          </w:p>
-        </w:tc>
-      </w:tr>
-      <w:tr>
-        <w:tc>
-          <w:tcPr>
-            <w:tcW w:w="0" w:type="auto"/>
-            <w:hideMark/>
-          </w:tcPr>
-          <w:p>
-            <w:pPr>
-              <w:spacing w:after="160"/>
-            </w:pPr>
-            <w:r>
-              <w:t>node_modules</w:t>
-            </w:r>
-          </w:p>
-        </w:tc>
-        <w:tc>
-          <w:tcPr>
-            <w:tcW w:w="0" w:type="auto"/>
-            <w:hideMark/>
-          </w:tcPr>
-          <w:p>
-            <w:pPr>
-              <w:spacing w:after="160"/>
-            </w:pPr>
-            <w:r>
-              <w:t>Menyimpan seluruh dependency project.</w:t>
-            </w:r>
-          </w:p>
-        </w:tc>
-      </w:tr>
-      <w:tr>
-        <w:tc>
-          <w:tcPr>
-            <w:tcW w:w="0" w:type="auto"/>
-            <w:hideMark/>
-          </w:tcPr>
-          <w:p>
-            <w:pPr>
-              <w:spacing w:after="160"/>
-            </w:pPr>
-            <w:r>
-              <w:t>package.json</w:t>
-            </w:r>
-          </w:p>
-        </w:tc>
-        <w:tc>
-          <w:tcPr>
-            <w:tcW w:w="0" w:type="auto"/>
-            <w:hideMark/>
-          </w:tcPr>
-          <w:p>
-            <w:pPr>
-              <w:spacing w:after="160"/>
-            </w:pPr>
-            <w:r>
-              <w:t>Menyimpan konfigurasi project serta daftar dependency.</w:t>
-            </w:r>
-          </w:p>
-        </w:tc>
-      </w:tr>
-      <w:tr>
-        <w:tc>
-          <w:tcPr>
-            <w:tcW w:w="0" w:type="auto"/>
-            <w:hideMark/>
-          </w:tcPr>
-          <w:p>
-            <w:pPr>
-              <w:spacing w:after="160"/>
-            </w:pPr>
-            <w:r>
-              <w:t>pnpm-lock.yaml</w:t>
-            </w:r>
-          </w:p>
-        </w:tc>
-        <w:tc>
-          <w:tcPr>
-            <w:tcW w:w="0" w:type="auto"/>
-            <w:hideMark/>
-          </w:tcPr>
-          <w:p>
-            <w:pPr>
-              <w:spacing w:after="160"/>
-            </w:pPr>
-            <w:r>
-              <w:t>Menyimpan versi package yang digunakan.</w:t>
-            </w:r>
-          </w:p>
-        </w:tc>
-      </w:tr>
-      <w:tr>
-        <w:tc>
-          <w:tcPr>
-            <w:tcW w:w="0" w:type="auto"/>
-            <w:hideMark/>
-          </w:tcPr>
-          <w:p>
-            <w:pPr>
-              <w:spacing w:after="160"/>
-            </w:pPr>
-            <w:r>
-              <w:t>vite.config.js</w:t>
-            </w:r>
-          </w:p>
-        </w:tc>
-        <w:tc>
-          <w:tcPr>
-            <w:tcW w:w="0" w:type="auto"/>
-            <w:hideMark/>
-          </w:tcPr>
-          <w:p>
-            <w:pPr>
-              <w:spacing w:after="160"/>
-            </w:pPr>
-            <w:r>
-              <w:t>File konfigurasi Vite.</w:t>
-            </w:r>
-          </w:p>
-        </w:tc>
-      </w:tr>
-    </w:tbl>
-    <w:p/>
-    <w:p>
-      <w:pPr>
-        <w:pStyle w:val="Heading2"/>
-        <w:numPr>
-          <w:ilvl w:val="1"/>
-          <w:numId w:val="15"/>
-        </w:numPr>
-        <w:ind w:left="426"/>
-      </w:pPr>
-      <w:bookmarkStart w:id="22" w:name="_Toc234532615"/>
-      <w:r>
-        <w:t>Mengenal File package.json</w:t>
-      </w:r>
-      <w:bookmarkEnd w:id="22"/>
-    </w:p>
-    <w:p>
-      <w:pPr>
-        <w:ind w:firstLine="426"/>
-      </w:pPr>
-      <w:r>
-        <w:t>Setiap project React memiliki sebuah file bernama package.json.</w:t>
-      </w:r>
-    </w:p>
-    <w:p>
-      <w:pPr>
-        <w:ind w:firstLine="426"/>
-      </w:pPr>
-      <w:r>
-        <w:t>File ini berisi informasi mengenai project, dependency yang digunakan, serta script yang dapat dijalankan.</w:t>
-      </w:r>
-    </w:p>
-    <w:p>
-      <w:pPr>
-        <w:ind w:firstLine="426"/>
-      </w:pPr>
-      <w:r>
-        <w:t>Contoh isi package.json.</w:t>
-      </w:r>
-    </w:p>
-    <w:p>
-      <w:pPr>
-        <w:ind w:firstLine="426"/>
-      </w:pPr>
-      <w:r>
-        <w:drawing>
-          <wp:inline distT="0" distB="0" distL="0" distR="0" wp14:anchorId="1D01ACD4" wp14:editId="64500E57">
-            <wp:extent cx="3581900" cy="2124371"/>
-            <wp:effectExtent l="0" t="0" r="0" b="0"/>
-            <wp:docPr id="1440231923" name="Picture 1"/>
-            <wp:cNvGraphicFramePr>
-              <a:graphicFrameLocks xmlns:a="http://schemas.openxmlformats.org/drawingml/2006/main" noChangeAspect="1"/>
-            </wp:cNvGraphicFramePr>
-            <a:graphic xmlns:a="http://schemas.openxmlformats.org/drawingml/2006/main">
-              <a:graphicData uri="http://schemas.openxmlformats.org/drawingml/2006/picture">
-                <pic:pic xmlns:pic="http://schemas.openxmlformats.org/drawingml/2006/picture">
-                  <pic:nvPicPr>
-                    <pic:cNvPr id="1440231923" name=""/>
-                    <pic:cNvPicPr/>
-                  </pic:nvPicPr>
-                  <pic:blipFill>
-                    <a:blip r:embed="rId67"/>
-                    <a:stretch>
-                      <a:fillRect/>
-                    </a:stretch>
-                  </pic:blipFill>
-                  <pic:spPr>
-                    <a:xfrm>
-                      <a:off x="0" y="0"/>
-                      <a:ext cx="3581900" cy="2124371"/>
-                    </a:xfrm>
-                    <a:prstGeom prst="rect">
-                      <a:avLst/>
-                    </a:prstGeom>
-                  </pic:spPr>
-                </pic:pic>
-              </a:graphicData>
-            </a:graphic>
-          </wp:inline>
-        </w:drawing>
-      </w:r>
-    </w:p>
-    <w:p>
-      <w:pPr>
-        <w:ind w:firstLine="426"/>
-      </w:pPr>
-      <w:r>
-        <w:t>Script yang paling sering digunakan adalah:</w:t>
-      </w:r>
-    </w:p>
-    <w:tbl>
-      <w:tblPr>
-        <w:tblStyle w:val="TableGrid"/>
-        <w:tblW w:w="0" w:type="auto"/>
-        <w:tblInd w:w="475" w:type="dxa"/>
-        <w:tblLook w:val="04A0" w:firstRow="1" w:lastRow="0" w:firstColumn="1" w:lastColumn="0" w:noHBand="0" w:noVBand="1"/>
-      </w:tblPr>
-      <w:tblGrid>
-        <w:gridCol w:w="2183"/>
-        <w:gridCol w:w="3260"/>
-      </w:tblGrid>
-      <w:tr>
-        <w:tc>
-          <w:tcPr>
-            <w:tcW w:w="0" w:type="auto"/>
-            <w:hideMark/>
-          </w:tcPr>
-          <w:p>
-            <w:pPr>
-              <w:spacing w:after="160"/>
-              <w:ind w:firstLine="426"/>
-              <w:rPr>
-                <w:b/>
-                <w:bCs/>
-              </w:rPr>
-            </w:pPr>
-            <w:r>
-              <w:rPr>
-                <w:b/>
-                <w:bCs/>
-              </w:rPr>
-              <w:t>Script</w:t>
-            </w:r>
-          </w:p>
-        </w:tc>
-        <w:tc>
-          <w:tcPr>
-            <w:tcW w:w="0" w:type="auto"/>
-            <w:hideMark/>
-          </w:tcPr>
-          <w:p>
-            <w:pPr>
-              <w:spacing w:after="160"/>
-              <w:ind w:firstLine="426"/>
-              <w:rPr>
-                <w:b/>
-                <w:bCs/>
-              </w:rPr>
-            </w:pPr>
-            <w:r>
-              <w:rPr>
-                <w:b/>
-                <w:bCs/>
-              </w:rPr>
-              <w:t>Fungsi</w:t>
-            </w:r>
-          </w:p>
-        </w:tc>
-      </w:tr>
-      <w:tr>
-        <w:tc>
-          <w:tcPr>
-            <w:tcW w:w="0" w:type="auto"/>
-            <w:hideMark/>
-          </w:tcPr>
-          <w:p>
-            <w:pPr>
-              <w:spacing w:after="160"/>
-              <w:ind w:firstLine="426"/>
-            </w:pPr>
-            <w:r>
-              <w:t>pnpm dev</w:t>
-            </w:r>
-          </w:p>
-        </w:tc>
-        <w:tc>
-          <w:tcPr>
-            <w:tcW w:w="0" w:type="auto"/>
-            <w:hideMark/>
-          </w:tcPr>
-          <w:p>
-            <w:pPr>
-              <w:spacing w:after="160"/>
-              <w:ind w:firstLine="426"/>
-            </w:pPr>
-            <w:r>
-              <w:t>Menjalankan aplikasi.</w:t>
-            </w:r>
-          </w:p>
-        </w:tc>
-      </w:tr>
-      <w:tr>
-        <w:tc>
-          <w:tcPr>
-            <w:tcW w:w="0" w:type="auto"/>
-            <w:hideMark/>
-          </w:tcPr>
-          <w:p>
-            <w:pPr>
-              <w:spacing w:after="160"/>
-              <w:ind w:firstLine="426"/>
-            </w:pPr>
-            <w:r>
-              <w:t>pnpm build</w:t>
-            </w:r>
-          </w:p>
-        </w:tc>
-        <w:tc>
-          <w:tcPr>
-            <w:tcW w:w="0" w:type="auto"/>
-            <w:hideMark/>
-          </w:tcPr>
-          <w:p>
-            <w:pPr>
-              <w:spacing w:after="160"/>
-              <w:ind w:firstLine="426"/>
-            </w:pPr>
-            <w:r>
-              <w:t>Melakukan build project.</w:t>
-            </w:r>
-          </w:p>
-        </w:tc>
-      </w:tr>
-      <w:tr>
-        <w:tc>
-          <w:tcPr>
-            <w:tcW w:w="0" w:type="auto"/>
-            <w:hideMark/>
-          </w:tcPr>
-          <w:p>
-            <w:pPr>
-              <w:spacing w:after="160"/>
-              <w:ind w:firstLine="426"/>
-            </w:pPr>
-            <w:r>
-              <w:t>pnpm preview</w:t>
-            </w:r>
-          </w:p>
-        </w:tc>
-        <w:tc>
-          <w:tcPr>
-            <w:tcW w:w="0" w:type="auto"/>
-            <w:hideMark/>
-          </w:tcPr>
-          <w:p>
-            <w:pPr>
-              <w:spacing w:after="160"/>
-              <w:ind w:firstLine="426"/>
-            </w:pPr>
-            <w:r>
-              <w:t>Menjalankan hasil build.</w:t>
-            </w:r>
-          </w:p>
-        </w:tc>
-      </w:tr>
-    </w:tbl>
-    <w:p/>
-    <w:p>
-      <w:pPr>
-        <w:pStyle w:val="Heading2"/>
-        <w:numPr>
-          <w:ilvl w:val="1"/>
-          <w:numId w:val="15"/>
-        </w:numPr>
-        <w:ind w:left="426"/>
-      </w:pPr>
-      <w:bookmarkStart w:id="23" w:name="_Toc234532616"/>
-      <w:r>
-        <w:lastRenderedPageBreak/>
-        <w:t>Perintah Dasar pnpm</w:t>
-      </w:r>
-      <w:bookmarkEnd w:id="23"/>
-    </w:p>
-    <w:p>
-      <w:pPr>
-        <w:ind w:firstLine="426"/>
-      </w:pPr>
-      <w:r>
-        <w:t>Selain digunakan untuk membuat project, pnpm juga digunakan untuk mengelola dependency.</w:t>
-      </w:r>
-    </w:p>
-    <w:p>
-      <w:pPr>
-        <w:ind w:firstLine="426"/>
-        <w:rPr>
-          <w:b/>
-          <w:bCs/>
-        </w:rPr>
-      </w:pPr>
-      <w:r>
-        <w:rPr>
-          <w:b/>
-          <w:bCs/>
-        </w:rPr>
-        <w:t>Menginstal Package</w:t>
-      </w:r>
-    </w:p>
-    <w:p>
-      <w:pPr>
-        <w:ind w:firstLine="426"/>
-      </w:pPr>
-      <w:r>
-        <w:drawing>
-          <wp:inline distT="0" distB="0" distL="0" distR="0" wp14:anchorId="1E100347" wp14:editId="675A7336">
-            <wp:extent cx="3581900" cy="866896"/>
-            <wp:effectExtent l="0" t="0" r="0" b="9525"/>
-            <wp:docPr id="765752291" name="Picture 1"/>
-            <wp:cNvGraphicFramePr>
-              <a:graphicFrameLocks xmlns:a="http://schemas.openxmlformats.org/drawingml/2006/main" noChangeAspect="1"/>
-            </wp:cNvGraphicFramePr>
-            <a:graphic xmlns:a="http://schemas.openxmlformats.org/drawingml/2006/main">
-              <a:graphicData uri="http://schemas.openxmlformats.org/drawingml/2006/picture">
-                <pic:pic xmlns:pic="http://schemas.openxmlformats.org/drawingml/2006/picture">
-                  <pic:nvPicPr>
-                    <pic:cNvPr id="765752291" name=""/>
-                    <pic:cNvPicPr/>
-                  </pic:nvPicPr>
-                  <pic:blipFill>
-                    <a:blip r:embed="rId68"/>
-                    <a:stretch>
-                      <a:fillRect/>
-                    </a:stretch>
-                  </pic:blipFill>
-                  <pic:spPr>
-                    <a:xfrm>
-                      <a:off x="0" y="0"/>
-                      <a:ext cx="3581900" cy="866896"/>
-                    </a:xfrm>
-                    <a:prstGeom prst="rect">
-                      <a:avLst/>
-                    </a:prstGeom>
-                  </pic:spPr>
-                </pic:pic>
-              </a:graphicData>
-            </a:graphic>
-          </wp:inline>
-        </w:drawing>
-      </w:r>
-    </w:p>
-    <w:p>
-      <w:pPr>
-        <w:ind w:firstLine="426"/>
-        <w:rPr>
-          <w:b/>
-          <w:bCs/>
-        </w:rPr>
-      </w:pPr>
-      <w:r>
-        <w:rPr>
-          <w:b/>
-          <w:bCs/>
-        </w:rPr>
-        <w:t>Menghapus Package</w:t>
-      </w:r>
-    </w:p>
-    <w:p>
-      <w:pPr>
-        <w:ind w:firstLine="426"/>
-      </w:pPr>
-      <w:r>
-        <w:drawing>
-          <wp:inline distT="0" distB="0" distL="0" distR="0" wp14:anchorId="13CF2D6D" wp14:editId="0E0E739C">
-            <wp:extent cx="3591426" cy="819264"/>
-            <wp:effectExtent l="0" t="0" r="9525" b="0"/>
-            <wp:docPr id="816382068" name="Picture 1"/>
-            <wp:cNvGraphicFramePr>
-              <a:graphicFrameLocks xmlns:a="http://schemas.openxmlformats.org/drawingml/2006/main" noChangeAspect="1"/>
-            </wp:cNvGraphicFramePr>
-            <a:graphic xmlns:a="http://schemas.openxmlformats.org/drawingml/2006/main">
-              <a:graphicData uri="http://schemas.openxmlformats.org/drawingml/2006/picture">
-                <pic:pic xmlns:pic="http://schemas.openxmlformats.org/drawingml/2006/picture">
-                  <pic:nvPicPr>
-                    <pic:cNvPr id="816382068" name=""/>
-                    <pic:cNvPicPr/>
-                  </pic:nvPicPr>
-                  <pic:blipFill>
-                    <a:blip r:embed="rId69"/>
-                    <a:stretch>
-                      <a:fillRect/>
-                    </a:stretch>
-                  </pic:blipFill>
-                  <pic:spPr>
-                    <a:xfrm>
-                      <a:off x="0" y="0"/>
-                      <a:ext cx="3591426" cy="819264"/>
-                    </a:xfrm>
-                    <a:prstGeom prst="rect">
-                      <a:avLst/>
-                    </a:prstGeom>
-                  </pic:spPr>
-                </pic:pic>
-              </a:graphicData>
-            </a:graphic>
-          </wp:inline>
-        </w:drawing>
-      </w:r>
-    </w:p>
-    <w:p>
-      <w:pPr>
-        <w:ind w:firstLine="426"/>
-        <w:rPr>
-          <w:b/>
-          <w:bCs/>
-        </w:rPr>
-      </w:pPr>
-      <w:r>
-        <w:rPr>
-          <w:b/>
-          <w:bCs/>
-        </w:rPr>
-        <w:t>Memperbarui Package</w:t>
-      </w:r>
-    </w:p>
-    <w:p>
-      <w:pPr>
-        <w:ind w:firstLine="426"/>
-        <w:rPr>
-          <w:b/>
-          <w:bCs/>
-        </w:rPr>
-      </w:pPr>
-      <w:r>
-        <w:rPr>
-          <w:b/>
-          <w:bCs/>
-        </w:rPr>
-        <w:drawing>
-          <wp:inline distT="0" distB="0" distL="0" distR="0" wp14:anchorId="7A7B230A" wp14:editId="60FC1EA2">
-            <wp:extent cx="3591426" cy="847843"/>
-            <wp:effectExtent l="0" t="0" r="9525" b="9525"/>
-            <wp:docPr id="1944101595" name="Picture 1"/>
-            <wp:cNvGraphicFramePr>
-              <a:graphicFrameLocks xmlns:a="http://schemas.openxmlformats.org/drawingml/2006/main" noChangeAspect="1"/>
-            </wp:cNvGraphicFramePr>
-            <a:graphic xmlns:a="http://schemas.openxmlformats.org/drawingml/2006/main">
-              <a:graphicData uri="http://schemas.openxmlformats.org/drawingml/2006/picture">
-                <pic:pic xmlns:pic="http://schemas.openxmlformats.org/drawingml/2006/picture">
-                  <pic:nvPicPr>
-                    <pic:cNvPr id="1944101595" name=""/>
-                    <pic:cNvPicPr/>
-                  </pic:nvPicPr>
-                  <pic:blipFill>
-                    <a:blip r:embed="rId70"/>
-                    <a:stretch>
-                      <a:fillRect/>
-                    </a:stretch>
-                  </pic:blipFill>
-                  <pic:spPr>
-                    <a:xfrm>
-                      <a:off x="0" y="0"/>
-                      <a:ext cx="3591426" cy="847843"/>
-                    </a:xfrm>
-                    <a:prstGeom prst="rect">
-                      <a:avLst/>
-                    </a:prstGeom>
-                  </pic:spPr>
-                </pic:pic>
-              </a:graphicData>
-            </a:graphic>
-          </wp:inline>
-        </w:drawing>
-      </w:r>
-    </w:p>
-    <w:p>
-      <w:pPr>
-        <w:ind w:firstLine="426"/>
-        <w:rPr>
-          <w:b/>
-          <w:bCs/>
-        </w:rPr>
-      </w:pPr>
-      <w:r>
-        <w:rPr>
-          <w:b/>
-          <w:bCs/>
-        </w:rPr>
-        <w:t>Melihat Package yang Terpasang</w:t>
-      </w:r>
-    </w:p>
-    <w:p>
-      <w:pPr>
-        <w:ind w:firstLine="426"/>
-      </w:pPr>
-      <w:r>
-        <w:drawing>
-          <wp:inline distT="0" distB="0" distL="0" distR="0" wp14:anchorId="3D74B764" wp14:editId="41AC5D4E">
-            <wp:extent cx="3591426" cy="838317"/>
-            <wp:effectExtent l="0" t="0" r="9525" b="0"/>
-            <wp:docPr id="313150226" name="Picture 1"/>
-            <wp:cNvGraphicFramePr>
-              <a:graphicFrameLocks xmlns:a="http://schemas.openxmlformats.org/drawingml/2006/main" noChangeAspect="1"/>
-            </wp:cNvGraphicFramePr>
-            <a:graphic xmlns:a="http://schemas.openxmlformats.org/drawingml/2006/main">
-              <a:graphicData uri="http://schemas.openxmlformats.org/drawingml/2006/picture">
-                <pic:pic xmlns:pic="http://schemas.openxmlformats.org/drawingml/2006/picture">
-                  <pic:nvPicPr>
-                    <pic:cNvPr id="313150226" name=""/>
-                    <pic:cNvPicPr/>
-                  </pic:nvPicPr>
-                  <pic:blipFill>
-                    <a:blip r:embed="rId71"/>
-                    <a:stretch>
-                      <a:fillRect/>
-                    </a:stretch>
-                  </pic:blipFill>
-                  <pic:spPr>
-                    <a:xfrm>
-                      <a:off x="0" y="0"/>
-                      <a:ext cx="3591426" cy="838317"/>
-                    </a:xfrm>
-                    <a:prstGeom prst="rect">
-                      <a:avLst/>
-                    </a:prstGeom>
-                  </pic:spPr>
-                </pic:pic>
-              </a:graphicData>
-            </a:graphic>
-          </wp:inline>
-        </w:drawing>
-      </w:r>
-    </w:p>
-    <w:p>
-      <w:pPr>
-        <w:ind w:firstLine="426"/>
-      </w:pPr>
-    </w:p>
-    <w:p>
-      <w:pPr>
-        <w:pStyle w:val="Heading2"/>
-        <w:numPr>
-          <w:ilvl w:val="1"/>
-          <w:numId w:val="15"/>
-        </w:numPr>
-        <w:ind w:left="426"/>
-      </w:pPr>
-      <w:bookmarkStart w:id="24" w:name="_Toc234532617"/>
-      <w:r>
-        <w:t>Ringkasan Bab</w:t>
-      </w:r>
-      <w:bookmarkEnd w:id="24"/>
-    </w:p>
-    <w:p>
-      <w:pPr>
-        <w:ind w:firstLine="426"/>
-      </w:pPr>
-      <w:r>
-        <w:t>Pada bab ini peserta telah berhasil membuat proyek React menggunakan Vite dengan bantuan pnpm sebagai package manager. Peserta juga telah memahami struktur dasar proyek React, fungsi file package.json, serta beberapa perintah dasar pnpm yang sering digunakan dalam pengembangan aplikasi.</w:t>
-      </w:r>
-    </w:p>
-    <w:p>
-      <w:pPr>
-        <w:ind w:firstLine="426"/>
-      </w:pPr>
-      <w:r>
-        <w:lastRenderedPageBreak/>
-        <w:t>Project CareerHub yang telah dibuat akan menjadi studi kasus utama selama pelatihan. Pada bab-bab berikutnya, aplikasi ini akan dikembangkan secara bertahap hingga menjadi sebuah Mini Job Portal yang memiliki berbagai fitur seperti pencarian, pengurutan data, pagination, editing, routing, penggunaan Context API, dan deployment ke Vercel.</w:t>
-      </w:r>
-    </w:p>
-    <w:p/>
-    <w:p>
-      <w:pPr>
-        <w:spacing w:line="278" w:lineRule="auto"/>
-        <w:jc w:val="left"/>
-      </w:pPr>
-      <w:r>
-        <w:br w:type="page"/>
-      </w:r>
-    </w:p>
-    <w:p>
-      <w:pPr>
-        <w:pStyle w:val="Heading1"/>
-      </w:pPr>
-      <w:bookmarkStart w:id="25" w:name="_Toc234532618"/>
-      <w:r>
-        <w:lastRenderedPageBreak/>
-        <w:t xml:space="preserve">BAB 4 </w:t>
-      </w:r>
-      <w:r>
-        <w:br/>
-      </w:r>
-      <w:r>
-        <w:t>Dasar-dasar React dan Komponen</w:t>
-      </w:r>
-      <w:bookmarkEnd w:id="25"/>
-    </w:p>
-    <w:p/>
-    <w:p>
-      <w:pPr>
-        <w:pStyle w:val="Heading2"/>
-        <w:numPr>
-          <w:ilvl w:val="1"/>
-          <w:numId w:val="17"/>
-        </w:numPr>
-        <w:ind w:left="426"/>
-      </w:pPr>
-      <w:bookmarkStart w:id="26" w:name="_Toc234532619"/>
-      <w:r>
-        <w:t>Pendahuluan</w:t>
-      </w:r>
-      <w:bookmarkEnd w:id="26"/>
-    </w:p>
-    <w:p>
-      <w:pPr>
-        <w:ind w:firstLine="426"/>
-      </w:pPr>
-      <w:r>
-        <w:t>Pada bab sebelumnya, peserta telah berhasil membuat project React menggunakan Vite serta menjalankan aplikasi pertama. Namun, tampilan yang muncul masih merupakan halaman bawaan dari Vite dan belum mencerminkan aplikasi yang akan dikembangkan.</w:t>
-      </w:r>
-    </w:p>
-    <w:p>
-      <w:pPr>
-        <w:ind w:firstLine="426"/>
-      </w:pPr>
-      <w:r>
-        <w:t>Pada bab ini peserta akan mulai membangun aplikasi CareerHub menggunakan React. Materi yang dipelajari meliputi pengenalan React, konsep JSX, pembuatan Functional Component, serta cara menggunakan komponen di dalam aplikasi. Dengan memahami materi pada bab ini, peserta akan mampu membangun tampilan aplikasi yang tersusun dari beberapa komponen yang saling terhubung.</w:t>
-      </w:r>
-    </w:p>
-    <w:p/>
-    <w:p>
-      <w:pPr>
-        <w:pStyle w:val="Heading2"/>
-        <w:numPr>
-          <w:ilvl w:val="1"/>
-          <w:numId w:val="17"/>
-        </w:numPr>
-        <w:ind w:left="426"/>
-      </w:pPr>
-      <w:bookmarkStart w:id="27" w:name="_Toc234532620"/>
-      <w:r>
-        <w:t>Apa itu React?</w:t>
-      </w:r>
-      <w:bookmarkEnd w:id="27"/>
-    </w:p>
-    <w:p>
-      <w:pPr>
-        <w:ind w:firstLine="426"/>
-      </w:pPr>
-      <w:r>
-        <w:t>React merupakan library JavaScript yang digunakan untuk membangun User Interface (UI) atau antarmuka pengguna.</w:t>
-      </w:r>
-    </w:p>
-    <w:p>
-      <w:pPr>
-        <w:ind w:firstLine="426"/>
-      </w:pPr>
-      <w:r>
-        <w:t>React dikembangkan oleh Meta (Facebook) dan menggunakan konsep Component-Based Architecture, yaitu sebuah aplikasi dibangun dari kumpulan komponen-komponen kecil yang dapat digunakan kembali (reusable).</w:t>
-      </w:r>
-    </w:p>
-    <w:p>
-      <w:pPr>
-        <w:ind w:firstLine="426"/>
-      </w:pPr>
-      <w:r>
-        <w:t>Sebagai contoh, sebuah website biasanya terdiri dari beberapa bagian seperti:</w:t>
-      </w:r>
-    </w:p>
-    <w:p>
-      <w:pPr>
-        <w:pStyle w:val="ListParagraph"/>
-        <w:numPr>
-          <w:ilvl w:val="0"/>
-          <w:numId w:val="18"/>
-        </w:numPr>
-      </w:pPr>
-      <w:r>
-        <w:t>Header</w:t>
-      </w:r>
-    </w:p>
-    <w:p>
-      <w:pPr>
-        <w:pStyle w:val="ListParagraph"/>
-        <w:numPr>
-          <w:ilvl w:val="0"/>
-          <w:numId w:val="18"/>
-        </w:numPr>
-      </w:pPr>
-      <w:r>
-        <w:t>Navigation Bar</w:t>
-      </w:r>
-    </w:p>
-    <w:p>
-      <w:pPr>
-        <w:pStyle w:val="ListParagraph"/>
-        <w:numPr>
-          <w:ilvl w:val="0"/>
-          <w:numId w:val="18"/>
-        </w:numPr>
-      </w:pPr>
-      <w:r>
-        <w:t>Hero Section</w:t>
-      </w:r>
-    </w:p>
-    <w:p>
-      <w:pPr>
-        <w:pStyle w:val="ListParagraph"/>
-        <w:numPr>
-          <w:ilvl w:val="0"/>
-          <w:numId w:val="18"/>
-        </w:numPr>
-      </w:pPr>
-      <w:r>
-        <w:t>Content</w:t>
-      </w:r>
-    </w:p>
-    <w:p>
-      <w:pPr>
-        <w:pStyle w:val="ListParagraph"/>
-        <w:numPr>
-          <w:ilvl w:val="0"/>
-          <w:numId w:val="18"/>
-        </w:numPr>
-      </w:pPr>
-      <w:r>
-        <w:t>Footer</w:t>
-      </w:r>
-    </w:p>
-    <w:p>
-      <w:pPr>
-        <w:ind w:firstLine="426"/>
-      </w:pPr>
-      <w:r>
-        <w:lastRenderedPageBreak/>
-        <w:t>Pada React, setiap bagian tersebut dapat dibuat menjadi komponen yang berdiri sendiri.</w:t>
-      </w:r>
-    </w:p>
-    <w:p>
-      <w:pPr>
-        <w:ind w:firstLine="426"/>
-      </w:pPr>
-    </w:p>
-    <w:p>
-      <w:pPr>
-        <w:pStyle w:val="Heading2"/>
-        <w:numPr>
-          <w:ilvl w:val="1"/>
-          <w:numId w:val="17"/>
-        </w:numPr>
-        <w:ind w:left="426"/>
-      </w:pPr>
-      <w:bookmarkStart w:id="28" w:name="_Toc234532621"/>
-      <w:r>
-        <w:t>Mengenal JSX</w:t>
-      </w:r>
-      <w:bookmarkEnd w:id="28"/>
-    </w:p>
-    <w:p>
-      <w:pPr>
-        <w:ind w:firstLine="426"/>
-      </w:pPr>
-      <w:r>
-        <w:t>JSX (JavaScript XML) merupakan sintaks yang memungkinkan kita menulis kode HTML di dalam JavaScript.</w:t>
-      </w:r>
-    </w:p>
-    <w:p>
-      <w:pPr>
-        <w:ind w:firstLine="426"/>
-      </w:pPr>
-      <w:r>
-        <w:t>Meskipun terlihat seperti HTML, JSX sebenarnya akan diubah menjadi kode JavaScript oleh React.</w:t>
-      </w:r>
-    </w:p>
-    <w:p>
-      <w:pPr>
-        <w:ind w:firstLine="426"/>
-      </w:pPr>
-      <w:r>
-        <w:t>Contoh JSX:</w:t>
-      </w:r>
-    </w:p>
-    <w:p>
-      <w:pPr>
-        <w:ind w:firstLine="426"/>
-      </w:pPr>
-      <w:r>
-        <w:t xml:space="preserve"> </w:t>
-      </w:r>
-      <w:r>
-        <w:drawing>
-          <wp:inline distT="0" distB="0" distL="0" distR="0" wp14:anchorId="1A65CA27" wp14:editId="4E090685">
-            <wp:extent cx="4077269" cy="1600423"/>
-            <wp:effectExtent l="0" t="0" r="0" b="0"/>
-            <wp:docPr id="387500264" name="Picture 1"/>
-            <wp:cNvGraphicFramePr>
-              <a:graphicFrameLocks xmlns:a="http://schemas.openxmlformats.org/drawingml/2006/main" noChangeAspect="1"/>
-            </wp:cNvGraphicFramePr>
-            <a:graphic xmlns:a="http://schemas.openxmlformats.org/drawingml/2006/main">
-              <a:graphicData uri="http://schemas.openxmlformats.org/drawingml/2006/picture">
-                <pic:pic xmlns:pic="http://schemas.openxmlformats.org/drawingml/2006/picture">
-                  <pic:nvPicPr>
-                    <pic:cNvPr id="387500264" name=""/>
-                    <pic:cNvPicPr/>
-                  </pic:nvPicPr>
-                  <pic:blipFill>
-                    <a:blip r:embed="rId72"/>
-                    <a:stretch>
-                      <a:fillRect/>
-                    </a:stretch>
-                  </pic:blipFill>
-                  <pic:spPr>
-                    <a:xfrm>
-                      <a:off x="0" y="0"/>
-                      <a:ext cx="4077269" cy="1600423"/>
-                    </a:xfrm>
-                    <a:prstGeom prst="rect">
-                      <a:avLst/>
-                    </a:prstGeom>
-                  </pic:spPr>
-                </pic:pic>
-              </a:graphicData>
-            </a:graphic>
-          </wp:inline>
-        </w:drawing>
-      </w:r>
-    </w:p>
-    <w:p>
-      <w:pPr>
-        <w:ind w:firstLine="426"/>
-      </w:pPr>
-      <w:r>
-        <w:t>Mengapa Menggunakan JSX?</w:t>
-      </w:r>
-    </w:p>
-    <w:p>
-      <w:pPr>
-        <w:pStyle w:val="ListParagraph"/>
-        <w:numPr>
-          <w:ilvl w:val="0"/>
-          <w:numId w:val="19"/>
-        </w:numPr>
-      </w:pPr>
-      <w:r>
-        <w:t>JSX memiliki beberapa kelebihan, di antaranya:</w:t>
-      </w:r>
-    </w:p>
-    <w:p>
-      <w:pPr>
-        <w:pStyle w:val="ListParagraph"/>
-        <w:numPr>
-          <w:ilvl w:val="0"/>
-          <w:numId w:val="19"/>
-        </w:numPr>
-      </w:pPr>
-      <w:r>
-        <w:t>Penulisan kode lebih mudah dibaca.</w:t>
-      </w:r>
-    </w:p>
-    <w:p>
-      <w:pPr>
-        <w:pStyle w:val="ListParagraph"/>
-        <w:numPr>
-          <w:ilvl w:val="0"/>
-          <w:numId w:val="19"/>
-        </w:numPr>
-      </w:pPr>
-      <w:r>
-        <w:t>Tampilan dan logika dapat ditulis dalam satu file.</w:t>
-      </w:r>
-    </w:p>
-    <w:p>
-      <w:pPr>
-        <w:pStyle w:val="ListParagraph"/>
-        <w:numPr>
-          <w:ilvl w:val="0"/>
-          <w:numId w:val="19"/>
-        </w:numPr>
-      </w:pPr>
-      <w:r>
-        <w:t>Mempermudah pembuatan komponen.</w:t>
-      </w:r>
-    </w:p>
-    <w:p>
-      <w:pPr>
-        <w:ind w:firstLine="426"/>
-      </w:pPr>
-      <w:r>
-        <w:t>Sebagai contoh:</w:t>
-      </w:r>
-    </w:p>
-    <w:p>
-      <w:pPr>
-        <w:ind w:firstLine="426"/>
-      </w:pPr>
-      <w:r>
-        <w:t>Tanpa JSX:</w:t>
-      </w:r>
-    </w:p>
-    <w:p>
-      <w:pPr>
-        <w:ind w:firstLine="426"/>
-      </w:pPr>
-      <w:r>
-        <w:drawing>
-          <wp:inline distT="0" distB="0" distL="0" distR="0" wp14:anchorId="38A31A03" wp14:editId="6429B796">
-            <wp:extent cx="4439270" cy="828791"/>
-            <wp:effectExtent l="0" t="0" r="0" b="9525"/>
-            <wp:docPr id="1362932059" name="Picture 1"/>
-            <wp:cNvGraphicFramePr>
-              <a:graphicFrameLocks xmlns:a="http://schemas.openxmlformats.org/drawingml/2006/main" noChangeAspect="1"/>
-            </wp:cNvGraphicFramePr>
-            <a:graphic xmlns:a="http://schemas.openxmlformats.org/drawingml/2006/main">
-              <a:graphicData uri="http://schemas.openxmlformats.org/drawingml/2006/picture">
-                <pic:pic xmlns:pic="http://schemas.openxmlformats.org/drawingml/2006/picture">
-                  <pic:nvPicPr>
-                    <pic:cNvPr id="1362932059" name=""/>
-                    <pic:cNvPicPr/>
-                  </pic:nvPicPr>
-                  <pic:blipFill>
-                    <a:blip r:embed="rId73"/>
-                    <a:stretch>
-                      <a:fillRect/>
-                    </a:stretch>
-                  </pic:blipFill>
-                  <pic:spPr>
-                    <a:xfrm>
-                      <a:off x="0" y="0"/>
-                      <a:ext cx="4439270" cy="828791"/>
-                    </a:xfrm>
-                    <a:prstGeom prst="rect">
-                      <a:avLst/>
-                    </a:prstGeom>
-                  </pic:spPr>
-                </pic:pic>
-              </a:graphicData>
-            </a:graphic>
-          </wp:inline>
-        </w:drawing>
-      </w:r>
-    </w:p>
-    <w:p>
-      <w:pPr>
-        <w:ind w:firstLine="426"/>
-      </w:pPr>
-    </w:p>
-    <w:p>
-      <w:pPr>
-        <w:ind w:firstLine="426"/>
-      </w:pPr>
-      <w:r>
-        <w:lastRenderedPageBreak/>
-        <w:t>Dengan JSX:</w:t>
-      </w:r>
-    </w:p>
-    <w:p>
-      <w:pPr>
-        <w:ind w:firstLine="426"/>
-      </w:pPr>
-      <w:r>
-        <w:drawing>
-          <wp:inline distT="0" distB="0" distL="0" distR="0" wp14:anchorId="431A2469" wp14:editId="5CF3B5F8">
-            <wp:extent cx="4448796" cy="828791"/>
-            <wp:effectExtent l="0" t="0" r="0" b="9525"/>
-            <wp:docPr id="2027496789" name="Picture 1"/>
-            <wp:cNvGraphicFramePr>
-              <a:graphicFrameLocks xmlns:a="http://schemas.openxmlformats.org/drawingml/2006/main" noChangeAspect="1"/>
-            </wp:cNvGraphicFramePr>
-            <a:graphic xmlns:a="http://schemas.openxmlformats.org/drawingml/2006/main">
-              <a:graphicData uri="http://schemas.openxmlformats.org/drawingml/2006/picture">
-                <pic:pic xmlns:pic="http://schemas.openxmlformats.org/drawingml/2006/picture">
-                  <pic:nvPicPr>
-                    <pic:cNvPr id="2027496789" name=""/>
-                    <pic:cNvPicPr/>
-                  </pic:nvPicPr>
-                  <pic:blipFill>
-                    <a:blip r:embed="rId74"/>
-                    <a:stretch>
-                      <a:fillRect/>
-                    </a:stretch>
-                  </pic:blipFill>
-                  <pic:spPr>
-                    <a:xfrm>
-                      <a:off x="0" y="0"/>
-                      <a:ext cx="4448796" cy="828791"/>
-                    </a:xfrm>
-                    <a:prstGeom prst="rect">
-                      <a:avLst/>
-                    </a:prstGeom>
-                  </pic:spPr>
-                </pic:pic>
-              </a:graphicData>
-            </a:graphic>
-          </wp:inline>
-        </w:drawing>
-      </w:r>
-    </w:p>
-    <w:p>
-      <w:pPr>
-        <w:ind w:firstLine="426"/>
-      </w:pPr>
-      <w:r>
-        <w:t>Tentunya penulisan menggunakan JSX lebih sederhana dan mudah dipahami.</w:t>
-      </w:r>
-    </w:p>
-    <w:p>
-      <w:pPr>
-        <w:ind w:firstLine="426"/>
-        <w:rPr>
-          <w:b/>
-          <w:bCs/>
-        </w:rPr>
-      </w:pPr>
-      <w:r>
-        <w:rPr>
-          <w:b/>
-          <w:bCs/>
-        </w:rPr>
-        <w:t>Aturan Penulisan JSX</w:t>
-      </w:r>
-    </w:p>
-    <w:p>
-      <w:pPr>
-        <w:ind w:firstLine="426"/>
-      </w:pPr>
-      <w:r>
-        <w:t>Dalam menggunakan JSX terdapat beberapa aturan yang perlu diperhatikan.</w:t>
-      </w:r>
-    </w:p>
-    <w:p>
-      <w:pPr>
-        <w:pStyle w:val="ListParagraph"/>
-        <w:numPr>
-          <w:ilvl w:val="0"/>
-          <w:numId w:val="20"/>
-        </w:numPr>
-      </w:pPr>
-      <w:r>
-        <w:t>Hanya memiliki satu elemen utama</w:t>
-      </w:r>
-    </w:p>
-    <w:p>
-      <w:pPr>
-        <w:pStyle w:val="ListParagraph"/>
-        <w:ind w:left="1146"/>
-      </w:pPr>
-      <w:r>
-        <w:t>Benar:</w:t>
-      </w:r>
-    </w:p>
-    <w:p>
-      <w:pPr>
-        <w:pStyle w:val="ListParagraph"/>
-        <w:ind w:left="1146"/>
-      </w:pPr>
-      <w:r>
-        <w:drawing>
-          <wp:inline distT="0" distB="0" distL="0" distR="0" wp14:anchorId="3A6B49E3" wp14:editId="40FE590A">
-            <wp:extent cx="4410691" cy="1743318"/>
-            <wp:effectExtent l="0" t="0" r="9525" b="9525"/>
-            <wp:docPr id="1725348620" name="Picture 1"/>
-            <wp:cNvGraphicFramePr>
-              <a:graphicFrameLocks xmlns:a="http://schemas.openxmlformats.org/drawingml/2006/main" noChangeAspect="1"/>
-            </wp:cNvGraphicFramePr>
-            <a:graphic xmlns:a="http://schemas.openxmlformats.org/drawingml/2006/main">
-              <a:graphicData uri="http://schemas.openxmlformats.org/drawingml/2006/picture">
-                <pic:pic xmlns:pic="http://schemas.openxmlformats.org/drawingml/2006/picture">
-                  <pic:nvPicPr>
-                    <pic:cNvPr id="1725348620" name=""/>
-                    <pic:cNvPicPr/>
-                  </pic:nvPicPr>
-                  <pic:blipFill>
-                    <a:blip r:embed="rId75"/>
-                    <a:stretch>
-                      <a:fillRect/>
-                    </a:stretch>
-                  </pic:blipFill>
-                  <pic:spPr>
-                    <a:xfrm>
-                      <a:off x="0" y="0"/>
-                      <a:ext cx="4410691" cy="1743318"/>
-                    </a:xfrm>
-                    <a:prstGeom prst="rect">
-                      <a:avLst/>
-                    </a:prstGeom>
-                  </pic:spPr>
-                </pic:pic>
-              </a:graphicData>
-            </a:graphic>
-          </wp:inline>
-        </w:drawing>
-      </w:r>
-    </w:p>
-    <w:p>
-      <w:pPr>
-        <w:pStyle w:val="ListParagraph"/>
-        <w:ind w:left="1146"/>
-      </w:pPr>
-      <w:r>
-        <w:t>Salah:</w:t>
-      </w:r>
-    </w:p>
-    <w:p>
-      <w:pPr>
-        <w:pStyle w:val="ListParagraph"/>
-        <w:ind w:left="1146"/>
-      </w:pPr>
-      <w:r>
-        <w:drawing>
-          <wp:inline distT="0" distB="0" distL="0" distR="0" wp14:anchorId="38728341" wp14:editId="1C2238F2">
-            <wp:extent cx="4420217" cy="1457528"/>
-            <wp:effectExtent l="0" t="0" r="0" b="9525"/>
-            <wp:docPr id="394483818" name="Picture 1"/>
-            <wp:cNvGraphicFramePr>
-              <a:graphicFrameLocks xmlns:a="http://schemas.openxmlformats.org/drawingml/2006/main" noChangeAspect="1"/>
-            </wp:cNvGraphicFramePr>
-            <a:graphic xmlns:a="http://schemas.openxmlformats.org/drawingml/2006/main">
-              <a:graphicData uri="http://schemas.openxmlformats.org/drawingml/2006/picture">
-                <pic:pic xmlns:pic="http://schemas.openxmlformats.org/drawingml/2006/picture">
-                  <pic:nvPicPr>
-                    <pic:cNvPr id="394483818" name=""/>
-                    <pic:cNvPicPr/>
-                  </pic:nvPicPr>
-                  <pic:blipFill>
-                    <a:blip r:embed="rId76"/>
-                    <a:stretch>
-                      <a:fillRect/>
-                    </a:stretch>
-                  </pic:blipFill>
-                  <pic:spPr>
-                    <a:xfrm>
-                      <a:off x="0" y="0"/>
-                      <a:ext cx="4420217" cy="1457528"/>
-                    </a:xfrm>
-                    <a:prstGeom prst="rect">
-                      <a:avLst/>
-                    </a:prstGeom>
-                  </pic:spPr>
-                </pic:pic>
-              </a:graphicData>
-            </a:graphic>
-          </wp:inline>
-        </w:drawing>
-      </w:r>
-    </w:p>
-    <w:p>
-      <w:pPr>
-        <w:pStyle w:val="ListParagraph"/>
-        <w:numPr>
-          <w:ilvl w:val="0"/>
-          <w:numId w:val="20"/>
-        </w:numPr>
-      </w:pPr>
-      <w:r>
-        <w:t>Gunakan className</w:t>
-      </w:r>
-    </w:p>
-    <w:p>
-      <w:pPr>
-        <w:pStyle w:val="ListParagraph"/>
-        <w:ind w:left="1146"/>
-      </w:pPr>
-      <w:r>
-        <w:t>Karena class merupakan keyword JavaScript, maka React menggunakan className.</w:t>
-      </w:r>
-    </w:p>
-    <w:p>
-      <w:pPr>
-        <w:pStyle w:val="ListParagraph"/>
-        <w:ind w:left="1146"/>
-      </w:pPr>
-      <w:r>
-        <w:lastRenderedPageBreak/>
-        <w:drawing>
-          <wp:inline distT="0" distB="0" distL="0" distR="0" wp14:anchorId="13035784" wp14:editId="02411097">
-            <wp:extent cx="4391638" cy="1228896"/>
-            <wp:effectExtent l="0" t="0" r="9525" b="0"/>
-            <wp:docPr id="928470903" name="Picture 1"/>
-            <wp:cNvGraphicFramePr>
-              <a:graphicFrameLocks xmlns:a="http://schemas.openxmlformats.org/drawingml/2006/main" noChangeAspect="1"/>
-            </wp:cNvGraphicFramePr>
-            <a:graphic xmlns:a="http://schemas.openxmlformats.org/drawingml/2006/main">
-              <a:graphicData uri="http://schemas.openxmlformats.org/drawingml/2006/picture">
-                <pic:pic xmlns:pic="http://schemas.openxmlformats.org/drawingml/2006/picture">
-                  <pic:nvPicPr>
-                    <pic:cNvPr id="928470903" name=""/>
-                    <pic:cNvPicPr/>
-                  </pic:nvPicPr>
-                  <pic:blipFill>
-                    <a:blip r:embed="rId77"/>
-                    <a:stretch>
-                      <a:fillRect/>
-                    </a:stretch>
-                  </pic:blipFill>
-                  <pic:spPr>
-                    <a:xfrm>
-                      <a:off x="0" y="0"/>
-                      <a:ext cx="4391638" cy="1228896"/>
-                    </a:xfrm>
-                    <a:prstGeom prst="rect">
-                      <a:avLst/>
-                    </a:prstGeom>
-                  </pic:spPr>
-                </pic:pic>
-              </a:graphicData>
-            </a:graphic>
-          </wp:inline>
-        </w:drawing>
-      </w:r>
-    </w:p>
-    <w:p>
-      <w:pPr>
-        <w:pStyle w:val="ListParagraph"/>
-        <w:ind w:left="1146"/>
-      </w:pPr>
-    </w:p>
-    <w:p>
-      <w:pPr>
-        <w:pStyle w:val="ListParagraph"/>
-        <w:numPr>
-          <w:ilvl w:val="0"/>
-          <w:numId w:val="20"/>
-        </w:numPr>
-      </w:pPr>
-      <w:r>
-        <w:t>Gunakan Kurung Kurawal {}</w:t>
-      </w:r>
-    </w:p>
-    <w:p>
-      <w:pPr>
-        <w:ind w:left="786"/>
-      </w:pPr>
-    </w:p>
-    <w:p>
-      <w:pPr>
-        <w:pStyle w:val="Heading2"/>
-        <w:numPr>
-          <w:ilvl w:val="1"/>
-          <w:numId w:val="17"/>
-        </w:numPr>
-        <w:ind w:left="426"/>
-      </w:pPr>
-      <w:bookmarkStart w:id="29" w:name="_Toc234532622"/>
-      <w:r>
-        <w:t>Mengenal Komponen</w:t>
-      </w:r>
-      <w:bookmarkEnd w:id="29"/>
-    </w:p>
-    <w:p>
-      <w:pPr>
-        <w:pStyle w:val="Heading2"/>
-        <w:numPr>
-          <w:ilvl w:val="1"/>
-          <w:numId w:val="17"/>
-        </w:numPr>
-        <w:ind w:left="426"/>
-      </w:pPr>
-      <w:bookmarkStart w:id="30" w:name="_Toc234532623"/>
-      <w:r>
-        <w:t>Membuat Komponen Pertama</w:t>
-      </w:r>
-      <w:bookmarkEnd w:id="30"/>
-    </w:p>
-    <w:p>
-      <w:pPr>
-        <w:pStyle w:val="Heading2"/>
-        <w:numPr>
-          <w:ilvl w:val="1"/>
-          <w:numId w:val="17"/>
-        </w:numPr>
-        <w:ind w:left="426"/>
-      </w:pPr>
-      <w:bookmarkStart w:id="31" w:name="_Toc234532624"/>
-      <w:r>
-        <w:t>Menggunakan Komponen</w:t>
-      </w:r>
-      <w:bookmarkEnd w:id="31"/>
-    </w:p>
-    <w:p>
-      <w:pPr>
-        <w:pStyle w:val="Heading2"/>
-        <w:numPr>
-          <w:ilvl w:val="1"/>
-          <w:numId w:val="17"/>
-        </w:numPr>
-        <w:ind w:left="426"/>
-      </w:pPr>
-      <w:bookmarkStart w:id="32" w:name="_Toc234532625"/>
-      <w:r>
-        <w:t>Ringkasan Bab</w:t>
-      </w:r>
-      <w:bookmarkEnd w:id="32"/>
+        <w:jc w:val="center"/>
+      </w:pPr>
+      <w:r>
+        <w:rPr>
+          <w:sz w:val="44"/>
+          <w:szCs w:val="44"/>
+        </w:rPr>
+        <w:t xml:space="preserve">COMING SOON </w:t>
+      </w:r>
+      <w:r>
+        <w:rPr>
+          <mc:AlternateContent>
+            <mc:Choice Requires="w16se"/>
+            <mc:Fallback>
+              <w:rFonts w:ascii="Segoe UI Emoji" w:eastAsia="Segoe UI Emoji" w:hAnsi="Segoe UI Emoji" w:cs="Segoe UI Emoji"/>
+            </mc:Fallback>
+          </mc:AlternateContent>
+          <w:sz w:val="44"/>
+          <w:szCs w:val="44"/>
+        </w:rPr>
+        <mc:AlternateContent>
+          <mc:Choice Requires="w16se">
+            <w16se:symEx w16se:font="Segoe UI Emoji" w16se:char="1F60A"/>
+          </mc:Choice>
+          <mc:Fallback>
+            <w:t>😊</w:t>
+          </mc:Fallback>
+        </mc:AlternateContent>
+      </w:r>
+      <w:r>
+        <w:rPr>
+          <mc:AlternateContent>
+            <mc:Choice Requires="w16se"/>
+            <mc:Fallback>
+              <w:rFonts w:ascii="Segoe UI Emoji" w:eastAsia="Segoe UI Emoji" w:hAnsi="Segoe UI Emoji" w:cs="Segoe UI Emoji"/>
+            </mc:Fallback>
+          </mc:AlternateContent>
+          <w:sz w:val="44"/>
+          <w:szCs w:val="44"/>
+        </w:rPr>
+        <mc:AlternateContent>
+          <mc:Choice Requires="w16se">
+            <w16se:symEx w16se:font="Segoe UI Emoji" w16se:char="1F60A"/>
+          </mc:Choice>
+          <mc:Fallback>
+            <w:t>😊</w:t>
+          </mc:Fallback>
+        </mc:AlternateContent>
+      </w:r>
+      <w:r>
+        <w:rPr>
+          <mc:AlternateContent>
+            <mc:Choice Requires="w16se"/>
+            <mc:Fallback>
+              <w:rFonts w:ascii="Segoe UI Emoji" w:eastAsia="Segoe UI Emoji" w:hAnsi="Segoe UI Emoji" w:cs="Segoe UI Emoji"/>
+            </mc:Fallback>
+          </mc:AlternateContent>
+          <w:sz w:val="44"/>
+          <w:szCs w:val="44"/>
+        </w:rPr>
+        <mc:AlternateContent>
+          <mc:Choice Requires="w16se">
+            <w16se:symEx w16se:font="Segoe UI Emoji" w16se:char="1F60A"/>
+          </mc:Choice>
+          <mc:Fallback>
+            <w:t>😊</w:t>
+          </mc:Fallback>
+        </mc:AlternateContent>
+      </w:r>
     </w:p>
     <w:sectPr>
-      <w:headerReference w:type="default" r:id="rId78"/>
-      <w:footerReference w:type="default" r:id="rId79"/>
+      <w:headerReference w:type="default" r:id="rId60"/>
+      <w:footerReference w:type="default" r:id="rId61"/>
       <w:pgSz w:w="11906" w:h="16838"/>
       <w:pgMar w:top="1440" w:right="1440" w:bottom="1440" w:left="1440" w:header="708" w:footer="708" w:gutter="0"/>
       <w:pgNumType w:start="1"/>
@@ -12909,6 +9593,7 @@
   <w:style w:type="character" w:default="1" w:styleId="DefaultParagraphFont">
     <w:name w:val="Default Paragraph Font"/>
     <w:uiPriority w:val="1"/>
+    <w:semiHidden/>
     <w:unhideWhenUsed/>
   </w:style>
   <w:style w:type="table" w:default="1" w:styleId="TableNormal">

</xml_diff>